<commit_message>
Consistency pass: seed sentence in V-C, correction scope in V-C and VI, closed-move forecast budget, package wording, shadow-core initialization stated, Rothermel map and four fuel classes, Byram wording, coating effect consistent with the supplement, Sørensen row in Table V; supplement citation numbers and spread-rate equation number
Co-Authored-By: Claude Fable 5.1 <noreply@anthropic.com>
Claude-Session: https://claude.ai/code/session_01SpJY1eTMuWxnLRbAr2HJ4M
</commit_message>
<xml_diff>
--- a/02_Article/ieee_systems/DisasterAware_Supplementary_Material.docx
+++ b/02_Article/ieee_systems/DisasterAware_Supplementary_Material.docx
@@ -3921,7 +3921,7 @@
         <w:rPr/>
       </w:pPr>
       <w:r>
-        <w:t xml:space="preserve">Regional extraction uses maximum observed intensity, zero without regional fire [57], mean Rothermel spread rate divided by 30 m/min [6] and fire-weather inputs [57]; weather severity clips 0.45 min(wind/20, 1) + 0.35(1 − humidity/100) + 0.20 clip((temperature − 15)/25). Ignition proximity is one inside a burning region, zero without fire, and otherwise clipped 1 − distance/(half-map diagonal); fuel load averages remaining fuel [53]. Asset exposure is maximum priority, weighting buildings, critical facilities, min–max population and inverted min–max route distance by 0.20, 0.40, 0.25 and 0.15 [4], and accessibility is mean terrain access [59]. Road coverage is divided by 0.05, and staged capacity times availability by 0.05 times maximum capacity times regional cell count [55], and urgency clips 0.6 times ignition proximity + 0.4 min(1, 10 times the regional burning fraction). Ratios and mixtures are clipped to [0, 1]; spread and fuel means use positive fuel-type cells. Min–max uses whole-map extrema and gives zero on constant maps. Intensity, proximity, fuel and urgency inherit observed-channel confidence; the other features carry confidence one.</w:t>
+        <w:t xml:space="preserve">Regional extraction uses maximum observed intensity, zero without regional fire [57], mean spread rate divided by 30 m/min [7] and fire-weather inputs [58]; weather severity clips 0.45 min(wind/20, 1) + 0.35(1 − humidity/100) + 0.20 clip((temperature − 15)/25). Ignition proximity is one inside a burning region, zero without fire, and otherwise clipped 1 − distance/(half-map diagonal); fuel load averages remaining fuel [53]. Asset exposure is maximum priority, weighting buildings, critical facilities, min–max population and inverted min–max route distance by 0.20, 0.40, 0.25 and 0.15 [5], and accessibility is mean terrain access [59]. Road coverage is divided by 0.05, and staged capacity times availability by 0.05 times maximum capacity times regional cell count [55], and urgency clips 0.6 times ignition proximity + 0.4 min(1, 10 times the regional burning fraction). Ratios and mixtures are clipped to [0, 1]; spread and fuel means use positive fuel-type cells. Min–max uses whole-map extrema and gives zero on constant maps. Intensity, proximity, fuel and urgency inherit observed-channel confidence; the other features carry confidence one.</w:t>
       </w:r>
     </w:p>
     <w:p>
@@ -3972,7 +3972,16 @@
         <w:rPr/>
       </w:pPr>
       <w:r>
-        <w:t xml:space="preserve">Spread rate (10). The per-cell rate νk = r_base · g_moist · g_wind · g_slope · g_aspect, with g_moist = clip(1 − Fm/εm, 0, 1), g_wind = 1 + a_w tanh(Ws/w0) with w0 = 10 m/s, g_slope = clip(1 + a_s tan(slope), 0, 3) and g_aspect = max(1 + a_asp cos(aspect − Wd), 0). The fuel constants are, for grass, shrub, pine litter and hardwood: r_base 2.00, 0.80, 0.80, 0.30 m/min; εm 0.15, 0.20, 0.25, 0.30; a_w 25, 15, 6, 4; a_s 2.0, 2.0, 2.2, 1.8; a_asp 0.30, 0.25, 0.20, 0.15; b_base 0.85, 0.35, 0.15, 0.08. Non-fuel and water have zero rate. The ignition threshold on the accumulated influence is 0.125, the extinction load 0.03 of the nominal load.</w:t>
+        <w:t xml:space="preserve">Spread rate (8). The per-cell rate ν</w:t>
+      </w:r>
+      <w:r>
+        <w:rPr>
+          <w:vertAlign w:val="subscript"/>
+        </w:rPr>
+        <w:t xml:space="preserve">k</w:t>
+      </w:r>
+      <w:r>
+        <w:t xml:space="preserve"> = r_base · g_moist · g_wind · g_slope · g_aspect, with g_moist = clip(1 − Fm/εm, 0, 1), g_wind = 1 + a_w tanh(Ws/w0) with w0 = 10 m/s, g_slope = clip(1 + a_s tan(slope), 0, 3) and g_aspect = max(1 + a_asp cos(aspect − Wd), 0). The fuel constants are, for grass, shrub, pine litter and hardwood: r_base 2.00, 0.80, 0.80, 0.30 m/min; εm 0.15, 0.20, 0.25, 0.30; a_w 25, 15, 6, 4; a_s 2.0, 2.0, 2.2, 1.8; a_asp 0.30, 0.25, 0.20, 0.15; b_base 0.85, 0.35, 0.15, 0.08. Non-fuel and water have zero rate. The ignition threshold on the accumulated influence is 0.125, the extinction load 0.03 of the nominal load.</w:t>
       </w:r>
     </w:p>
     <w:p>

</xml_diff>

<commit_message>
Article: budget dependence sentence in V-C, code availability as a footnote with the repository address; supplement: cross-reference field for Table S3
Co-Authored-By: Claude Fable 5.1 <noreply@anthropic.com>
Claude-Session: https://claude.ai/code/session_01SpJY1eTMuWxnLRbAr2HJ4M
</commit_message>
<xml_diff>
--- a/02_Article/ieee_systems/DisasterAware_Supplementary_Material.docx
+++ b/02_Article/ieee_systems/DisasterAware_Supplementary_Material.docx
@@ -3464,11 +3464,13 @@
       <w:r>
         <w:t>Table S</w:t>
       </w:r>
+      <w:bookmarkStart w:id="901" w:name="_RefSupTabS3"/>
       <w:fldSimple w:instr=" SEQ VODASupTable \* ARABIC ">
         <w:r>
           <w:t>3</w:t>
         </w:r>
       </w:fldSimple>
+      <w:bookmarkEnd w:id="901"/>
       <w:r>
         <w:t>. Recorded rules and their intervention definitions</w:t>
       </w:r>
@@ -4542,7 +4544,15 @@
         <w:rPr/>
       </w:pPr>
       <w:r>
-        <w:t xml:space="preserve">The reply is one minified JSON object with a list of six candidates. Each candidate carries antecedents over the five concepts, consequents over the six families and, for a composed intervention, a new_intervention with up to three clauses, as in the template. The object below is an admitted candidate as recorded in the campaign log. The model named it populated ready belt; Table S3 lists the recorded tactic of this archetype under the name asset collar.</w:t>
+        <w:t xml:space="preserve">The reply is one minified JSON object with a list of six candidates. Each candidate carries antecedents over the five concepts, consequents over the six families and, for a composed intervention, a new_intervention with up to three clauses, as in the template. The object below is an admitted candidate as recorded in the campaign log. The model named it populated ready belt; Table S</w:t>
+      </w:r>
+      <w:fldSimple w:instr=" REF _RefSupTabS3 \h ">
+        <w:r>
+          <w:t>3</w:t>
+        </w:r>
+      </w:fldSimple>
+      <w:r>
+        <w:t xml:space="preserve"> lists the recorded tactic of this archetype under the name asset collar.</w:t>
       </w:r>
     </w:p>
     <w:p>

</xml_diff>

<commit_message>
Paired sign-flip p values with Holm adjustment for every row of Tables VII and VIII: Table S4 in the supplement, statistics sentence in V-A, script and csv
Co-Authored-By: Claude Fable 5.1 <noreply@anthropic.com>
Claude-Session: https://claude.ai/code/session_01SpJY1eTMuWxnLRbAr2HJ4M
</commit_message>
<xml_diff>
--- a/02_Article/ieee_systems/DisasterAware_Supplementary_Material.docx
+++ b/02_Article/ieee_systems/DisasterAware_Supplementary_Material.docx
@@ -4016,6 +4016,4056 @@
       </w:pPr>
       <w:r>
         <w:t xml:space="preserve">Spotting. A burning cell with intensity above 0.6 throws an ember with probability 0.02 per reference step, compounded over substeps; the ember lands up to six cells downwind and ignites fuel above the extinction load.</w:t>
+      </w:r>
+    </w:p>
+    <w:p>
+      <w:pPr>
+        <w:pStyle w:val="Heading1"/>
+        <w:rPr/>
+      </w:pPr>
+      <w:r>
+        <w:t xml:space="preserve">Paired tests for the rows of Tables VII and VIII</w:t>
+      </w:r>
+    </w:p>
+    <w:p>
+      <w:pPr>
+        <w:rPr/>
+      </w:pPr>
+      <w:r>
+        <w:t xml:space="preserve">Each row of Tables VII and VIII compares a configuration with its reference on the same worlds. The table lists the number of worlds, the mean relative change of burned area, the worlds in which the configuration burns less, the same or more area, the two-sided paired sign-flip p value on the mean difference (one million random sign assignments) and the Holm step-down adjustment over all 36 rows. A p value below 0.0001 means that no random sign assignment reached the observed difference.</w:t>
+      </w:r>
+    </w:p>
+    <w:p>
+      <w:pPr>
+        <w:pStyle w:val="Caption"/>
+      </w:pPr>
+      <w:r>
+        <w:t>Table S</w:t>
+      </w:r>
+      <w:fldSimple w:instr=" SEQ VODASupTable \* ARABIC ">
+        <w:r>
+          <w:t>4</w:t>
+        </w:r>
+      </w:fldSimple>
+      <w:r>
+        <w:t xml:space="preserve">. Paired sign-flip tests and Holm adjustment for Tables VII and VIII</w:t>
+      </w:r>
+    </w:p>
+    <w:tbl>
+      <w:tblPr>
+        <w:tblW w:w="9360" w:type="dxa"/>
+        <w:tblBorders>
+          <w:top w:val="single" w:sz="4" w:space="0" w:color="B7B7B7"/>
+          <w:left w:val="single" w:sz="4" w:space="0" w:color="B7B7B7"/>
+          <w:bottom w:val="single" w:sz="4" w:space="0" w:color="B7B7B7"/>
+          <w:right w:val="single" w:sz="4" w:space="0" w:color="B7B7B7"/>
+          <w:insideH w:val="single" w:sz="4" w:space="0" w:color="B7B7B7"/>
+          <w:insideV w:val="single" w:sz="4" w:space="0" w:color="B7B7B7"/>
+        </w:tblBorders>
+        <w:tblLayout w:type="fixed"/>
+        <w:tblCellMar>
+          <w:top w:w="35" w:type="dxa"/>
+          <w:left w:w="30" w:type="dxa"/>
+          <w:bottom w:w="35" w:type="dxa"/>
+          <w:right w:w="30" w:type="dxa"/>
+        </w:tblCellMar>
+        <w:tblLook w:val="04A0" w:firstRow="1" w:lastRow="0" w:firstColumn="1" w:lastColumn="0" w:noHBand="0" w:noVBand="1"/>
+      </w:tblPr>
+      <w:tblGrid>
+        <w:gridCol w:w="4060"/>
+        <w:gridCol w:w="700"/>
+        <w:gridCol w:w="1500"/>
+        <w:gridCol w:w="1300"/>
+        <w:gridCol w:w="900"/>
+        <w:gridCol w:w="900"/>
+      </w:tblGrid>
+      <w:tr>
+        <w:trPr>
+          <w:cantSplit/>
+        </w:trPr>
+        <w:tc>
+          <w:tcPr>
+            <w:tcW w:w="4060" w:type="dxa"/>
+            <w:shd w:val="clear" w:color="auto" w:fill="E7E6E6"/>
+          </w:tcPr>
+          <w:p>
+            <w:pPr>
+              <w:spacing w:after="0" w:line="220" w:lineRule="auto"/>
+            </w:pPr>
+            <w:r>
+              <w:rPr>
+                <w:b/>
+                <w:sz w:val="18"/>
+              </w:rPr>
+              <w:t xml:space="preserve">Row of Table VII or VIII</w:t>
+            </w:r>
+          </w:p>
+        </w:tc>
+        <w:tc>
+          <w:tcPr>
+            <w:tcW w:w="700" w:type="dxa"/>
+            <w:shd w:val="clear" w:color="auto" w:fill="E7E6E6"/>
+          </w:tcPr>
+          <w:p>
+            <w:pPr>
+              <w:spacing w:after="0" w:line="220" w:lineRule="auto"/>
+              <w:jc w:val="center"/>
+            </w:pPr>
+            <w:r>
+              <w:rPr>
+                <w:b/>
+                <w:sz w:val="18"/>
+              </w:rPr>
+              <w:t xml:space="preserve">n</w:t>
+            </w:r>
+          </w:p>
+        </w:tc>
+        <w:tc>
+          <w:tcPr>
+            <w:tcW w:w="1500" w:type="dxa"/>
+            <w:shd w:val="clear" w:color="auto" w:fill="E7E6E6"/>
+          </w:tcPr>
+          <w:p>
+            <w:pPr>
+              <w:spacing w:after="0" w:line="220" w:lineRule="auto"/>
+              <w:jc w:val="center"/>
+            </w:pPr>
+            <w:r>
+              <w:rPr>
+                <w:b/>
+                <w:sz w:val="18"/>
+              </w:rPr>
+              <w:t xml:space="preserve">Δ burned area (%)</w:t>
+            </w:r>
+          </w:p>
+        </w:tc>
+        <w:tc>
+          <w:tcPr>
+            <w:tcW w:w="1300" w:type="dxa"/>
+            <w:shd w:val="clear" w:color="auto" w:fill="E7E6E6"/>
+          </w:tcPr>
+          <w:p>
+            <w:pPr>
+              <w:spacing w:after="0" w:line="220" w:lineRule="auto"/>
+              <w:jc w:val="center"/>
+            </w:pPr>
+            <w:r>
+              <w:rPr>
+                <w:b/>
+                <w:sz w:val="18"/>
+              </w:rPr>
+              <w:t xml:space="preserve">better / tie / worse</w:t>
+            </w:r>
+          </w:p>
+        </w:tc>
+        <w:tc>
+          <w:tcPr>
+            <w:tcW w:w="900" w:type="dxa"/>
+            <w:shd w:val="clear" w:color="auto" w:fill="E7E6E6"/>
+          </w:tcPr>
+          <w:p>
+            <w:pPr>
+              <w:spacing w:after="0" w:line="220" w:lineRule="auto"/>
+              <w:jc w:val="center"/>
+            </w:pPr>
+            <w:r>
+              <w:rPr>
+                <w:b/>
+                <w:sz w:val="18"/>
+              </w:rPr>
+              <w:t xml:space="preserve">p</w:t>
+            </w:r>
+          </w:p>
+        </w:tc>
+        <w:tc>
+          <w:tcPr>
+            <w:tcW w:w="900" w:type="dxa"/>
+            <w:shd w:val="clear" w:color="auto" w:fill="E7E6E6"/>
+          </w:tcPr>
+          <w:p>
+            <w:pPr>
+              <w:spacing w:after="0" w:line="220" w:lineRule="auto"/>
+              <w:jc w:val="center"/>
+            </w:pPr>
+            <w:r>
+              <w:rPr>
+                <w:b/>
+                <w:sz w:val="18"/>
+              </w:rPr>
+              <w:t xml:space="preserve">p, Holm</w:t>
+            </w:r>
+          </w:p>
+        </w:tc>
+      </w:tr>
+      <w:tr>
+        <w:trPr>
+          <w:cantSplit/>
+        </w:trPr>
+        <w:tc>
+          <w:tcPr>
+            <w:tcW w:w="9360" w:type="dxa"/>
+            <w:gridSpan w:val="6"/>
+          </w:tcPr>
+          <w:p>
+            <w:pPr>
+              <w:spacing w:after="0" w:line="220" w:lineRule="auto"/>
+            </w:pPr>
+            <w:r>
+              <w:rPr>
+                <w:b/>
+                <w:sz w:val="18"/>
+              </w:rPr>
+              <w:t xml:space="preserve">Table VII</w:t>
+            </w:r>
+          </w:p>
+        </w:tc>
+      </w:tr>
+      <w:tr>
+        <w:trPr>
+          <w:cantSplit/>
+        </w:trPr>
+        <w:tc>
+          <w:tcPr>
+            <w:tcW w:w="4060" w:type="dxa"/>
+          </w:tcPr>
+          <w:p>
+            <w:pPr>
+              <w:spacing w:after="0" w:line="220" w:lineRule="auto"/>
+            </w:pPr>
+            <w:r>
+              <w:rPr>
+                <w:sz w:val="18"/>
+              </w:rPr>
+              <w:t xml:space="preserve">Random, one</w:t>
+            </w:r>
+          </w:p>
+        </w:tc>
+        <w:tc>
+          <w:tcPr>
+            <w:tcW w:w="700" w:type="dxa"/>
+          </w:tcPr>
+          <w:p>
+            <w:pPr>
+              <w:spacing w:after="0" w:line="220" w:lineRule="auto"/>
+              <w:jc w:val="center"/>
+            </w:pPr>
+            <w:r>
+              <w:rPr>
+                <w:sz w:val="18"/>
+              </w:rPr>
+              <w:t xml:space="preserve">150</w:t>
+            </w:r>
+          </w:p>
+        </w:tc>
+        <w:tc>
+          <w:tcPr>
+            <w:tcW w:w="1500" w:type="dxa"/>
+          </w:tcPr>
+          <w:p>
+            <w:pPr>
+              <w:spacing w:after="0" w:line="220" w:lineRule="auto"/>
+              <w:jc w:val="center"/>
+            </w:pPr>
+            <w:r>
+              <w:rPr>
+                <w:sz w:val="18"/>
+              </w:rPr>
+              <w:t xml:space="preserve">−9</w:t>
+            </w:r>
+          </w:p>
+        </w:tc>
+        <w:tc>
+          <w:tcPr>
+            <w:tcW w:w="1300" w:type="dxa"/>
+          </w:tcPr>
+          <w:p>
+            <w:pPr>
+              <w:spacing w:after="0" w:line="220" w:lineRule="auto"/>
+              <w:jc w:val="center"/>
+            </w:pPr>
+            <w:r>
+              <w:rPr>
+                <w:sz w:val="18"/>
+              </w:rPr>
+              <w:t xml:space="preserve">93 / 17 / 40</w:t>
+            </w:r>
+          </w:p>
+        </w:tc>
+        <w:tc>
+          <w:tcPr>
+            <w:tcW w:w="900" w:type="dxa"/>
+          </w:tcPr>
+          <w:p>
+            <w:pPr>
+              <w:spacing w:after="0" w:line="220" w:lineRule="auto"/>
+              <w:jc w:val="center"/>
+            </w:pPr>
+            <w:r>
+              <w:rPr>
+                <w:sz w:val="18"/>
+              </w:rPr>
+              <w:t xml:space="preserve">0.04</w:t>
+            </w:r>
+          </w:p>
+        </w:tc>
+        <w:tc>
+          <w:tcPr>
+            <w:tcW w:w="900" w:type="dxa"/>
+          </w:tcPr>
+          <w:p>
+            <w:pPr>
+              <w:spacing w:after="0" w:line="220" w:lineRule="auto"/>
+              <w:jc w:val="center"/>
+            </w:pPr>
+            <w:r>
+              <w:rPr>
+                <w:sz w:val="18"/>
+              </w:rPr>
+              <w:t xml:space="preserve">0.10</w:t>
+            </w:r>
+          </w:p>
+        </w:tc>
+      </w:tr>
+      <w:tr>
+        <w:trPr>
+          <w:cantSplit/>
+        </w:trPr>
+        <w:tc>
+          <w:tcPr>
+            <w:tcW w:w="4060" w:type="dxa"/>
+          </w:tcPr>
+          <w:p>
+            <w:pPr>
+              <w:spacing w:after="0" w:line="220" w:lineRule="auto"/>
+            </w:pPr>
+            <w:r>
+              <w:rPr>
+                <w:sz w:val="18"/>
+              </w:rPr>
+              <w:t xml:space="preserve">Random, one, ungated</w:t>
+            </w:r>
+          </w:p>
+        </w:tc>
+        <w:tc>
+          <w:tcPr>
+            <w:tcW w:w="700" w:type="dxa"/>
+          </w:tcPr>
+          <w:p>
+            <w:pPr>
+              <w:spacing w:after="0" w:line="220" w:lineRule="auto"/>
+              <w:jc w:val="center"/>
+            </w:pPr>
+            <w:r>
+              <w:rPr>
+                <w:sz w:val="18"/>
+              </w:rPr>
+              <w:t xml:space="preserve">150</w:t>
+            </w:r>
+          </w:p>
+        </w:tc>
+        <w:tc>
+          <w:tcPr>
+            <w:tcW w:w="1500" w:type="dxa"/>
+          </w:tcPr>
+          <w:p>
+            <w:pPr>
+              <w:spacing w:after="0" w:line="220" w:lineRule="auto"/>
+              <w:jc w:val="center"/>
+            </w:pPr>
+            <w:r>
+              <w:rPr>
+                <w:sz w:val="18"/>
+              </w:rPr>
+              <w:t xml:space="preserve">−10</w:t>
+            </w:r>
+          </w:p>
+        </w:tc>
+        <w:tc>
+          <w:tcPr>
+            <w:tcW w:w="1300" w:type="dxa"/>
+          </w:tcPr>
+          <w:p>
+            <w:pPr>
+              <w:spacing w:after="0" w:line="220" w:lineRule="auto"/>
+              <w:jc w:val="center"/>
+            </w:pPr>
+            <w:r>
+              <w:rPr>
+                <w:sz w:val="18"/>
+              </w:rPr>
+              <w:t xml:space="preserve">86 / 15 / 49</w:t>
+            </w:r>
+          </w:p>
+        </w:tc>
+        <w:tc>
+          <w:tcPr>
+            <w:tcW w:w="900" w:type="dxa"/>
+          </w:tcPr>
+          <w:p>
+            <w:pPr>
+              <w:spacing w:after="0" w:line="220" w:lineRule="auto"/>
+              <w:jc w:val="center"/>
+            </w:pPr>
+            <w:r>
+              <w:rPr>
+                <w:sz w:val="18"/>
+              </w:rPr>
+              <w:t xml:space="preserve">0.03</w:t>
+            </w:r>
+          </w:p>
+        </w:tc>
+        <w:tc>
+          <w:tcPr>
+            <w:tcW w:w="900" w:type="dxa"/>
+          </w:tcPr>
+          <w:p>
+            <w:pPr>
+              <w:spacing w:after="0" w:line="220" w:lineRule="auto"/>
+              <w:jc w:val="center"/>
+            </w:pPr>
+            <w:r>
+              <w:rPr>
+                <w:sz w:val="18"/>
+              </w:rPr>
+              <w:t xml:space="preserve">0.10</w:t>
+            </w:r>
+          </w:p>
+        </w:tc>
+      </w:tr>
+      <w:tr>
+        <w:trPr>
+          <w:cantSplit/>
+        </w:trPr>
+        <w:tc>
+          <w:tcPr>
+            <w:tcW w:w="4060" w:type="dxa"/>
+          </w:tcPr>
+          <w:p>
+            <w:pPr>
+              <w:spacing w:after="0" w:line="220" w:lineRule="auto"/>
+            </w:pPr>
+            <w:r>
+              <w:rPr>
+                <w:sz w:val="18"/>
+              </w:rPr>
+              <w:t xml:space="preserve">LLM, one</w:t>
+            </w:r>
+          </w:p>
+        </w:tc>
+        <w:tc>
+          <w:tcPr>
+            <w:tcW w:w="700" w:type="dxa"/>
+          </w:tcPr>
+          <w:p>
+            <w:pPr>
+              <w:spacing w:after="0" w:line="220" w:lineRule="auto"/>
+              <w:jc w:val="center"/>
+            </w:pPr>
+            <w:r>
+              <w:rPr>
+                <w:sz w:val="18"/>
+              </w:rPr>
+              <w:t xml:space="preserve">150</w:t>
+            </w:r>
+          </w:p>
+        </w:tc>
+        <w:tc>
+          <w:tcPr>
+            <w:tcW w:w="1500" w:type="dxa"/>
+          </w:tcPr>
+          <w:p>
+            <w:pPr>
+              <w:spacing w:after="0" w:line="220" w:lineRule="auto"/>
+              <w:jc w:val="center"/>
+            </w:pPr>
+            <w:r>
+              <w:rPr>
+                <w:sz w:val="18"/>
+              </w:rPr>
+              <w:t xml:space="preserve">−28</w:t>
+            </w:r>
+          </w:p>
+        </w:tc>
+        <w:tc>
+          <w:tcPr>
+            <w:tcW w:w="1300" w:type="dxa"/>
+          </w:tcPr>
+          <w:p>
+            <w:pPr>
+              <w:spacing w:after="0" w:line="220" w:lineRule="auto"/>
+              <w:jc w:val="center"/>
+            </w:pPr>
+            <w:r>
+              <w:rPr>
+                <w:sz w:val="18"/>
+              </w:rPr>
+              <w:t xml:space="preserve">119 / 15 / 16</w:t>
+            </w:r>
+          </w:p>
+        </w:tc>
+        <w:tc>
+          <w:tcPr>
+            <w:tcW w:w="900" w:type="dxa"/>
+          </w:tcPr>
+          <w:p>
+            <w:pPr>
+              <w:spacing w:after="0" w:line="220" w:lineRule="auto"/>
+              <w:jc w:val="center"/>
+            </w:pPr>
+            <w:r>
+              <w:rPr>
+                <w:sz w:val="18"/>
+              </w:rPr>
+              <w:t xml:space="preserve">&lt; 0.0001</w:t>
+            </w:r>
+          </w:p>
+        </w:tc>
+        <w:tc>
+          <w:tcPr>
+            <w:tcW w:w="900" w:type="dxa"/>
+          </w:tcPr>
+          <w:p>
+            <w:pPr>
+              <w:spacing w:after="0" w:line="220" w:lineRule="auto"/>
+              <w:jc w:val="center"/>
+            </w:pPr>
+            <w:r>
+              <w:rPr>
+                <w:sz w:val="18"/>
+              </w:rPr>
+              <w:t xml:space="preserve">&lt; 0.0001</w:t>
+            </w:r>
+          </w:p>
+        </w:tc>
+      </w:tr>
+      <w:tr>
+        <w:trPr>
+          <w:cantSplit/>
+        </w:trPr>
+        <w:tc>
+          <w:tcPr>
+            <w:tcW w:w="4060" w:type="dxa"/>
+          </w:tcPr>
+          <w:p>
+            <w:pPr>
+              <w:spacing w:after="0" w:line="220" w:lineRule="auto"/>
+            </w:pPr>
+            <w:r>
+              <w:rPr>
+                <w:sz w:val="18"/>
+              </w:rPr>
+              <w:t xml:space="preserve">LLM, one, ungated</w:t>
+            </w:r>
+          </w:p>
+        </w:tc>
+        <w:tc>
+          <w:tcPr>
+            <w:tcW w:w="700" w:type="dxa"/>
+          </w:tcPr>
+          <w:p>
+            <w:pPr>
+              <w:spacing w:after="0" w:line="220" w:lineRule="auto"/>
+              <w:jc w:val="center"/>
+            </w:pPr>
+            <w:r>
+              <w:rPr>
+                <w:sz w:val="18"/>
+              </w:rPr>
+              <w:t xml:space="preserve">150</w:t>
+            </w:r>
+          </w:p>
+        </w:tc>
+        <w:tc>
+          <w:tcPr>
+            <w:tcW w:w="1500" w:type="dxa"/>
+          </w:tcPr>
+          <w:p>
+            <w:pPr>
+              <w:spacing w:after="0" w:line="220" w:lineRule="auto"/>
+              <w:jc w:val="center"/>
+            </w:pPr>
+            <w:r>
+              <w:rPr>
+                <w:sz w:val="18"/>
+              </w:rPr>
+              <w:t xml:space="preserve">−25</w:t>
+            </w:r>
+          </w:p>
+        </w:tc>
+        <w:tc>
+          <w:tcPr>
+            <w:tcW w:w="1300" w:type="dxa"/>
+          </w:tcPr>
+          <w:p>
+            <w:pPr>
+              <w:spacing w:after="0" w:line="220" w:lineRule="auto"/>
+              <w:jc w:val="center"/>
+            </w:pPr>
+            <w:r>
+              <w:rPr>
+                <w:sz w:val="18"/>
+              </w:rPr>
+              <w:t xml:space="preserve">109 / 13 / 28</w:t>
+            </w:r>
+          </w:p>
+        </w:tc>
+        <w:tc>
+          <w:tcPr>
+            <w:tcW w:w="900" w:type="dxa"/>
+          </w:tcPr>
+          <w:p>
+            <w:pPr>
+              <w:spacing w:after="0" w:line="220" w:lineRule="auto"/>
+              <w:jc w:val="center"/>
+            </w:pPr>
+            <w:r>
+              <w:rPr>
+                <w:sz w:val="18"/>
+              </w:rPr>
+              <w:t xml:space="preserve">&lt; 0.0001</w:t>
+            </w:r>
+          </w:p>
+        </w:tc>
+        <w:tc>
+          <w:tcPr>
+            <w:tcW w:w="900" w:type="dxa"/>
+          </w:tcPr>
+          <w:p>
+            <w:pPr>
+              <w:spacing w:after="0" w:line="220" w:lineRule="auto"/>
+              <w:jc w:val="center"/>
+            </w:pPr>
+            <w:r>
+              <w:rPr>
+                <w:sz w:val="18"/>
+              </w:rPr>
+              <w:t xml:space="preserve">&lt; 0.0001</w:t>
+            </w:r>
+          </w:p>
+        </w:tc>
+      </w:tr>
+      <w:tr>
+        <w:trPr>
+          <w:cantSplit/>
+        </w:trPr>
+        <w:tc>
+          <w:tcPr>
+            <w:tcW w:w="4060" w:type="dxa"/>
+          </w:tcPr>
+          <w:p>
+            <w:pPr>
+              <w:spacing w:after="0" w:line="220" w:lineRule="auto"/>
+            </w:pPr>
+            <w:r>
+              <w:rPr>
+                <w:sz w:val="18"/>
+              </w:rPr>
+              <w:t xml:space="preserve">Random, small</w:t>
+            </w:r>
+          </w:p>
+        </w:tc>
+        <w:tc>
+          <w:tcPr>
+            <w:tcW w:w="700" w:type="dxa"/>
+          </w:tcPr>
+          <w:p>
+            <w:pPr>
+              <w:spacing w:after="0" w:line="220" w:lineRule="auto"/>
+              <w:jc w:val="center"/>
+            </w:pPr>
+            <w:r>
+              <w:rPr>
+                <w:sz w:val="18"/>
+              </w:rPr>
+              <w:t xml:space="preserve">150</w:t>
+            </w:r>
+          </w:p>
+        </w:tc>
+        <w:tc>
+          <w:tcPr>
+            <w:tcW w:w="1500" w:type="dxa"/>
+          </w:tcPr>
+          <w:p>
+            <w:pPr>
+              <w:spacing w:after="0" w:line="220" w:lineRule="auto"/>
+              <w:jc w:val="center"/>
+            </w:pPr>
+            <w:r>
+              <w:rPr>
+                <w:sz w:val="18"/>
+              </w:rPr>
+              <w:t xml:space="preserve">−32</w:t>
+            </w:r>
+          </w:p>
+        </w:tc>
+        <w:tc>
+          <w:tcPr>
+            <w:tcW w:w="1300" w:type="dxa"/>
+          </w:tcPr>
+          <w:p>
+            <w:pPr>
+              <w:spacing w:after="0" w:line="220" w:lineRule="auto"/>
+              <w:jc w:val="center"/>
+            </w:pPr>
+            <w:r>
+              <w:rPr>
+                <w:sz w:val="18"/>
+              </w:rPr>
+              <w:t xml:space="preserve">114 / 14 / 22</w:t>
+            </w:r>
+          </w:p>
+        </w:tc>
+        <w:tc>
+          <w:tcPr>
+            <w:tcW w:w="900" w:type="dxa"/>
+          </w:tcPr>
+          <w:p>
+            <w:pPr>
+              <w:spacing w:after="0" w:line="220" w:lineRule="auto"/>
+              <w:jc w:val="center"/>
+            </w:pPr>
+            <w:r>
+              <w:rPr>
+                <w:sz w:val="18"/>
+              </w:rPr>
+              <w:t xml:space="preserve">&lt; 0.0001</w:t>
+            </w:r>
+          </w:p>
+        </w:tc>
+        <w:tc>
+          <w:tcPr>
+            <w:tcW w:w="900" w:type="dxa"/>
+          </w:tcPr>
+          <w:p>
+            <w:pPr>
+              <w:spacing w:after="0" w:line="220" w:lineRule="auto"/>
+              <w:jc w:val="center"/>
+            </w:pPr>
+            <w:r>
+              <w:rPr>
+                <w:sz w:val="18"/>
+              </w:rPr>
+              <w:t xml:space="preserve">&lt; 0.0001</w:t>
+            </w:r>
+          </w:p>
+        </w:tc>
+      </w:tr>
+      <w:tr>
+        <w:trPr>
+          <w:cantSplit/>
+        </w:trPr>
+        <w:tc>
+          <w:tcPr>
+            <w:tcW w:w="4060" w:type="dxa"/>
+          </w:tcPr>
+          <w:p>
+            <w:pPr>
+              <w:spacing w:after="0" w:line="220" w:lineRule="auto"/>
+            </w:pPr>
+            <w:r>
+              <w:rPr>
+                <w:sz w:val="18"/>
+              </w:rPr>
+              <w:t xml:space="preserve">LLM, candidates only</w:t>
+            </w:r>
+          </w:p>
+        </w:tc>
+        <w:tc>
+          <w:tcPr>
+            <w:tcW w:w="700" w:type="dxa"/>
+          </w:tcPr>
+          <w:p>
+            <w:pPr>
+              <w:spacing w:after="0" w:line="220" w:lineRule="auto"/>
+              <w:jc w:val="center"/>
+            </w:pPr>
+            <w:r>
+              <w:rPr>
+                <w:sz w:val="18"/>
+              </w:rPr>
+              <w:t xml:space="preserve">150</w:t>
+            </w:r>
+          </w:p>
+        </w:tc>
+        <w:tc>
+          <w:tcPr>
+            <w:tcW w:w="1500" w:type="dxa"/>
+          </w:tcPr>
+          <w:p>
+            <w:pPr>
+              <w:spacing w:after="0" w:line="220" w:lineRule="auto"/>
+              <w:jc w:val="center"/>
+            </w:pPr>
+            <w:r>
+              <w:rPr>
+                <w:sz w:val="18"/>
+              </w:rPr>
+              <w:t xml:space="preserve">−45</w:t>
+            </w:r>
+          </w:p>
+        </w:tc>
+        <w:tc>
+          <w:tcPr>
+            <w:tcW w:w="1300" w:type="dxa"/>
+          </w:tcPr>
+          <w:p>
+            <w:pPr>
+              <w:spacing w:after="0" w:line="220" w:lineRule="auto"/>
+              <w:jc w:val="center"/>
+            </w:pPr>
+            <w:r>
+              <w:rPr>
+                <w:sz w:val="18"/>
+              </w:rPr>
+              <w:t xml:space="preserve">124 / 10 / 16</w:t>
+            </w:r>
+          </w:p>
+        </w:tc>
+        <w:tc>
+          <w:tcPr>
+            <w:tcW w:w="900" w:type="dxa"/>
+          </w:tcPr>
+          <w:p>
+            <w:pPr>
+              <w:spacing w:after="0" w:line="220" w:lineRule="auto"/>
+              <w:jc w:val="center"/>
+            </w:pPr>
+            <w:r>
+              <w:rPr>
+                <w:sz w:val="18"/>
+              </w:rPr>
+              <w:t xml:space="preserve">&lt; 0.0001</w:t>
+            </w:r>
+          </w:p>
+        </w:tc>
+        <w:tc>
+          <w:tcPr>
+            <w:tcW w:w="900" w:type="dxa"/>
+          </w:tcPr>
+          <w:p>
+            <w:pPr>
+              <w:spacing w:after="0" w:line="220" w:lineRule="auto"/>
+              <w:jc w:val="center"/>
+            </w:pPr>
+            <w:r>
+              <w:rPr>
+                <w:sz w:val="18"/>
+              </w:rPr>
+              <w:t xml:space="preserve">&lt; 0.0001</w:t>
+            </w:r>
+          </w:p>
+        </w:tc>
+      </w:tr>
+      <w:tr>
+        <w:trPr>
+          <w:cantSplit/>
+        </w:trPr>
+        <w:tc>
+          <w:tcPr>
+            <w:tcW w:w="4060" w:type="dxa"/>
+          </w:tcPr>
+          <w:p>
+            <w:pPr>
+              <w:spacing w:after="0" w:line="220" w:lineRule="auto"/>
+            </w:pPr>
+            <w:r>
+              <w:rPr>
+                <w:sz w:val="18"/>
+              </w:rPr>
+              <w:t xml:space="preserve">Random, full</w:t>
+            </w:r>
+          </w:p>
+        </w:tc>
+        <w:tc>
+          <w:tcPr>
+            <w:tcW w:w="700" w:type="dxa"/>
+          </w:tcPr>
+          <w:p>
+            <w:pPr>
+              <w:spacing w:after="0" w:line="220" w:lineRule="auto"/>
+              <w:jc w:val="center"/>
+            </w:pPr>
+            <w:r>
+              <w:rPr>
+                <w:sz w:val="18"/>
+              </w:rPr>
+              <w:t xml:space="preserve">150</w:t>
+            </w:r>
+          </w:p>
+        </w:tc>
+        <w:tc>
+          <w:tcPr>
+            <w:tcW w:w="1500" w:type="dxa"/>
+          </w:tcPr>
+          <w:p>
+            <w:pPr>
+              <w:spacing w:after="0" w:line="220" w:lineRule="auto"/>
+              <w:jc w:val="center"/>
+            </w:pPr>
+            <w:r>
+              <w:rPr>
+                <w:sz w:val="18"/>
+              </w:rPr>
+              <w:t xml:space="preserve">−46</w:t>
+            </w:r>
+          </w:p>
+        </w:tc>
+        <w:tc>
+          <w:tcPr>
+            <w:tcW w:w="1300" w:type="dxa"/>
+          </w:tcPr>
+          <w:p>
+            <w:pPr>
+              <w:spacing w:after="0" w:line="220" w:lineRule="auto"/>
+              <w:jc w:val="center"/>
+            </w:pPr>
+            <w:r>
+              <w:rPr>
+                <w:sz w:val="18"/>
+              </w:rPr>
+              <w:t xml:space="preserve">128 / 13 / 9</w:t>
+            </w:r>
+          </w:p>
+        </w:tc>
+        <w:tc>
+          <w:tcPr>
+            <w:tcW w:w="900" w:type="dxa"/>
+          </w:tcPr>
+          <w:p>
+            <w:pPr>
+              <w:spacing w:after="0" w:line="220" w:lineRule="auto"/>
+              <w:jc w:val="center"/>
+            </w:pPr>
+            <w:r>
+              <w:rPr>
+                <w:sz w:val="18"/>
+              </w:rPr>
+              <w:t xml:space="preserve">&lt; 0.0001</w:t>
+            </w:r>
+          </w:p>
+        </w:tc>
+        <w:tc>
+          <w:tcPr>
+            <w:tcW w:w="900" w:type="dxa"/>
+          </w:tcPr>
+          <w:p>
+            <w:pPr>
+              <w:spacing w:after="0" w:line="220" w:lineRule="auto"/>
+              <w:jc w:val="center"/>
+            </w:pPr>
+            <w:r>
+              <w:rPr>
+                <w:sz w:val="18"/>
+              </w:rPr>
+              <w:t xml:space="preserve">&lt; 0.0001</w:t>
+            </w:r>
+          </w:p>
+        </w:tc>
+      </w:tr>
+      <w:tr>
+        <w:trPr>
+          <w:cantSplit/>
+        </w:trPr>
+        <w:tc>
+          <w:tcPr>
+            <w:tcW w:w="4060" w:type="dxa"/>
+          </w:tcPr>
+          <w:p>
+            <w:pPr>
+              <w:spacing w:after="0" w:line="220" w:lineRule="auto"/>
+            </w:pPr>
+            <w:r>
+              <w:rPr>
+                <w:sz w:val="18"/>
+              </w:rPr>
+              <w:t xml:space="preserve">Random, families only</w:t>
+            </w:r>
+          </w:p>
+        </w:tc>
+        <w:tc>
+          <w:tcPr>
+            <w:tcW w:w="700" w:type="dxa"/>
+          </w:tcPr>
+          <w:p>
+            <w:pPr>
+              <w:spacing w:after="0" w:line="220" w:lineRule="auto"/>
+              <w:jc w:val="center"/>
+            </w:pPr>
+            <w:r>
+              <w:rPr>
+                <w:sz w:val="18"/>
+              </w:rPr>
+              <w:t xml:space="preserve">150</w:t>
+            </w:r>
+          </w:p>
+        </w:tc>
+        <w:tc>
+          <w:tcPr>
+            <w:tcW w:w="1500" w:type="dxa"/>
+          </w:tcPr>
+          <w:p>
+            <w:pPr>
+              <w:spacing w:after="0" w:line="220" w:lineRule="auto"/>
+              <w:jc w:val="center"/>
+            </w:pPr>
+            <w:r>
+              <w:rPr>
+                <w:sz w:val="18"/>
+              </w:rPr>
+              <w:t xml:space="preserve">−41</w:t>
+            </w:r>
+          </w:p>
+        </w:tc>
+        <w:tc>
+          <w:tcPr>
+            <w:tcW w:w="1300" w:type="dxa"/>
+          </w:tcPr>
+          <w:p>
+            <w:pPr>
+              <w:spacing w:after="0" w:line="220" w:lineRule="auto"/>
+              <w:jc w:val="center"/>
+            </w:pPr>
+            <w:r>
+              <w:rPr>
+                <w:sz w:val="18"/>
+              </w:rPr>
+              <w:t xml:space="preserve">131 / 11 / 8</w:t>
+            </w:r>
+          </w:p>
+        </w:tc>
+        <w:tc>
+          <w:tcPr>
+            <w:tcW w:w="900" w:type="dxa"/>
+          </w:tcPr>
+          <w:p>
+            <w:pPr>
+              <w:spacing w:after="0" w:line="220" w:lineRule="auto"/>
+              <w:jc w:val="center"/>
+            </w:pPr>
+            <w:r>
+              <w:rPr>
+                <w:sz w:val="18"/>
+              </w:rPr>
+              <w:t xml:space="preserve">&lt; 0.0001</w:t>
+            </w:r>
+          </w:p>
+        </w:tc>
+        <w:tc>
+          <w:tcPr>
+            <w:tcW w:w="900" w:type="dxa"/>
+          </w:tcPr>
+          <w:p>
+            <w:pPr>
+              <w:spacing w:after="0" w:line="220" w:lineRule="auto"/>
+              <w:jc w:val="center"/>
+            </w:pPr>
+            <w:r>
+              <w:rPr>
+                <w:sz w:val="18"/>
+              </w:rPr>
+              <w:t xml:space="preserve">&lt; 0.0001</w:t>
+            </w:r>
+          </w:p>
+        </w:tc>
+      </w:tr>
+      <w:tr>
+        <w:trPr>
+          <w:cantSplit/>
+        </w:trPr>
+        <w:tc>
+          <w:tcPr>
+            <w:tcW w:w="4060" w:type="dxa"/>
+          </w:tcPr>
+          <w:p>
+            <w:pPr>
+              <w:spacing w:after="0" w:line="220" w:lineRule="auto"/>
+            </w:pPr>
+            <w:r>
+              <w:rPr>
+                <w:sz w:val="18"/>
+              </w:rPr>
+              <w:t xml:space="preserve">Random, with variations</w:t>
+            </w:r>
+          </w:p>
+        </w:tc>
+        <w:tc>
+          <w:tcPr>
+            <w:tcW w:w="700" w:type="dxa"/>
+          </w:tcPr>
+          <w:p>
+            <w:pPr>
+              <w:spacing w:after="0" w:line="220" w:lineRule="auto"/>
+              <w:jc w:val="center"/>
+            </w:pPr>
+            <w:r>
+              <w:rPr>
+                <w:sz w:val="18"/>
+              </w:rPr>
+              <w:t xml:space="preserve">150</w:t>
+            </w:r>
+          </w:p>
+        </w:tc>
+        <w:tc>
+          <w:tcPr>
+            <w:tcW w:w="1500" w:type="dxa"/>
+          </w:tcPr>
+          <w:p>
+            <w:pPr>
+              <w:spacing w:after="0" w:line="220" w:lineRule="auto"/>
+              <w:jc w:val="center"/>
+            </w:pPr>
+            <w:r>
+              <w:rPr>
+                <w:sz w:val="18"/>
+              </w:rPr>
+              <w:t xml:space="preserve">−34</w:t>
+            </w:r>
+          </w:p>
+        </w:tc>
+        <w:tc>
+          <w:tcPr>
+            <w:tcW w:w="1300" w:type="dxa"/>
+          </w:tcPr>
+          <w:p>
+            <w:pPr>
+              <w:spacing w:after="0" w:line="220" w:lineRule="auto"/>
+              <w:jc w:val="center"/>
+            </w:pPr>
+            <w:r>
+              <w:rPr>
+                <w:sz w:val="18"/>
+              </w:rPr>
+              <w:t xml:space="preserve">121 / 14 / 15</w:t>
+            </w:r>
+          </w:p>
+        </w:tc>
+        <w:tc>
+          <w:tcPr>
+            <w:tcW w:w="900" w:type="dxa"/>
+          </w:tcPr>
+          <w:p>
+            <w:pPr>
+              <w:spacing w:after="0" w:line="220" w:lineRule="auto"/>
+              <w:jc w:val="center"/>
+            </w:pPr>
+            <w:r>
+              <w:rPr>
+                <w:sz w:val="18"/>
+              </w:rPr>
+              <w:t xml:space="preserve">&lt; 0.0001</w:t>
+            </w:r>
+          </w:p>
+        </w:tc>
+        <w:tc>
+          <w:tcPr>
+            <w:tcW w:w="900" w:type="dxa"/>
+          </w:tcPr>
+          <w:p>
+            <w:pPr>
+              <w:spacing w:after="0" w:line="220" w:lineRule="auto"/>
+              <w:jc w:val="center"/>
+            </w:pPr>
+            <w:r>
+              <w:rPr>
+                <w:sz w:val="18"/>
+              </w:rPr>
+              <w:t xml:space="preserve">&lt; 0.0001</w:t>
+            </w:r>
+          </w:p>
+        </w:tc>
+      </w:tr>
+      <w:tr>
+        <w:trPr>
+          <w:cantSplit/>
+        </w:trPr>
+        <w:tc>
+          <w:tcPr>
+            <w:tcW w:w="4060" w:type="dxa"/>
+          </w:tcPr>
+          <w:p>
+            <w:pPr>
+              <w:spacing w:after="0" w:line="220" w:lineRule="auto"/>
+            </w:pPr>
+            <w:r>
+              <w:rPr>
+                <w:sz w:val="18"/>
+              </w:rPr>
+              <w:t xml:space="preserve">Hand-written seeds, with variations</w:t>
+            </w:r>
+          </w:p>
+        </w:tc>
+        <w:tc>
+          <w:tcPr>
+            <w:tcW w:w="700" w:type="dxa"/>
+          </w:tcPr>
+          <w:p>
+            <w:pPr>
+              <w:spacing w:after="0" w:line="220" w:lineRule="auto"/>
+              <w:jc w:val="center"/>
+            </w:pPr>
+            <w:r>
+              <w:rPr>
+                <w:sz w:val="18"/>
+              </w:rPr>
+              <w:t xml:space="preserve">150</w:t>
+            </w:r>
+          </w:p>
+        </w:tc>
+        <w:tc>
+          <w:tcPr>
+            <w:tcW w:w="1500" w:type="dxa"/>
+          </w:tcPr>
+          <w:p>
+            <w:pPr>
+              <w:spacing w:after="0" w:line="220" w:lineRule="auto"/>
+              <w:jc w:val="center"/>
+            </w:pPr>
+            <w:r>
+              <w:rPr>
+                <w:sz w:val="18"/>
+              </w:rPr>
+              <w:t xml:space="preserve">−31</w:t>
+            </w:r>
+          </w:p>
+        </w:tc>
+        <w:tc>
+          <w:tcPr>
+            <w:tcW w:w="1300" w:type="dxa"/>
+          </w:tcPr>
+          <w:p>
+            <w:pPr>
+              <w:spacing w:after="0" w:line="220" w:lineRule="auto"/>
+              <w:jc w:val="center"/>
+            </w:pPr>
+            <w:r>
+              <w:rPr>
+                <w:sz w:val="18"/>
+              </w:rPr>
+              <w:t xml:space="preserve">109 / 11 / 30</w:t>
+            </w:r>
+          </w:p>
+        </w:tc>
+        <w:tc>
+          <w:tcPr>
+            <w:tcW w:w="900" w:type="dxa"/>
+          </w:tcPr>
+          <w:p>
+            <w:pPr>
+              <w:spacing w:after="0" w:line="220" w:lineRule="auto"/>
+              <w:jc w:val="center"/>
+            </w:pPr>
+            <w:r>
+              <w:rPr>
+                <w:sz w:val="18"/>
+              </w:rPr>
+              <w:t xml:space="preserve">&lt; 0.0001</w:t>
+            </w:r>
+          </w:p>
+        </w:tc>
+        <w:tc>
+          <w:tcPr>
+            <w:tcW w:w="900" w:type="dxa"/>
+          </w:tcPr>
+          <w:p>
+            <w:pPr>
+              <w:spacing w:after="0" w:line="220" w:lineRule="auto"/>
+              <w:jc w:val="center"/>
+            </w:pPr>
+            <w:r>
+              <w:rPr>
+                <w:sz w:val="18"/>
+              </w:rPr>
+              <w:t xml:space="preserve">&lt; 0.0001</w:t>
+            </w:r>
+          </w:p>
+        </w:tc>
+      </w:tr>
+      <w:tr>
+        <w:trPr>
+          <w:cantSplit/>
+        </w:trPr>
+        <w:tc>
+          <w:tcPr>
+            <w:tcW w:w="4060" w:type="dxa"/>
+          </w:tcPr>
+          <w:p>
+            <w:pPr>
+              <w:spacing w:after="0" w:line="220" w:lineRule="auto"/>
+            </w:pPr>
+            <w:r>
+              <w:rPr>
+                <w:sz w:val="18"/>
+              </w:rPr>
+              <w:t xml:space="preserve">Evolutionary search</w:t>
+            </w:r>
+          </w:p>
+        </w:tc>
+        <w:tc>
+          <w:tcPr>
+            <w:tcW w:w="700" w:type="dxa"/>
+          </w:tcPr>
+          <w:p>
+            <w:pPr>
+              <w:spacing w:after="0" w:line="220" w:lineRule="auto"/>
+              <w:jc w:val="center"/>
+            </w:pPr>
+            <w:r>
+              <w:rPr>
+                <w:sz w:val="18"/>
+              </w:rPr>
+              <w:t xml:space="preserve">150</w:t>
+            </w:r>
+          </w:p>
+        </w:tc>
+        <w:tc>
+          <w:tcPr>
+            <w:tcW w:w="1500" w:type="dxa"/>
+          </w:tcPr>
+          <w:p>
+            <w:pPr>
+              <w:spacing w:after="0" w:line="220" w:lineRule="auto"/>
+              <w:jc w:val="center"/>
+            </w:pPr>
+            <w:r>
+              <w:rPr>
+                <w:sz w:val="18"/>
+              </w:rPr>
+              <w:t xml:space="preserve">−49</w:t>
+            </w:r>
+          </w:p>
+        </w:tc>
+        <w:tc>
+          <w:tcPr>
+            <w:tcW w:w="1300" w:type="dxa"/>
+          </w:tcPr>
+          <w:p>
+            <w:pPr>
+              <w:spacing w:after="0" w:line="220" w:lineRule="auto"/>
+              <w:jc w:val="center"/>
+            </w:pPr>
+            <w:r>
+              <w:rPr>
+                <w:sz w:val="18"/>
+              </w:rPr>
+              <w:t xml:space="preserve">127 / 11 / 12</w:t>
+            </w:r>
+          </w:p>
+        </w:tc>
+        <w:tc>
+          <w:tcPr>
+            <w:tcW w:w="900" w:type="dxa"/>
+          </w:tcPr>
+          <w:p>
+            <w:pPr>
+              <w:spacing w:after="0" w:line="220" w:lineRule="auto"/>
+              <w:jc w:val="center"/>
+            </w:pPr>
+            <w:r>
+              <w:rPr>
+                <w:sz w:val="18"/>
+              </w:rPr>
+              <w:t xml:space="preserve">&lt; 0.0001</w:t>
+            </w:r>
+          </w:p>
+        </w:tc>
+        <w:tc>
+          <w:tcPr>
+            <w:tcW w:w="900" w:type="dxa"/>
+          </w:tcPr>
+          <w:p>
+            <w:pPr>
+              <w:spacing w:after="0" w:line="220" w:lineRule="auto"/>
+              <w:jc w:val="center"/>
+            </w:pPr>
+            <w:r>
+              <w:rPr>
+                <w:sz w:val="18"/>
+              </w:rPr>
+              <w:t xml:space="preserve">&lt; 0.0001</w:t>
+            </w:r>
+          </w:p>
+        </w:tc>
+      </w:tr>
+      <w:tr>
+        <w:trPr>
+          <w:cantSplit/>
+        </w:trPr>
+        <w:tc>
+          <w:tcPr>
+            <w:tcW w:w="4060" w:type="dxa"/>
+          </w:tcPr>
+          <w:p>
+            <w:pPr>
+              <w:spacing w:after="0" w:line="220" w:lineRule="auto"/>
+            </w:pPr>
+            <w:r>
+              <w:rPr>
+                <w:sz w:val="18"/>
+              </w:rPr>
+              <w:t xml:space="preserve">GODA</w:t>
+            </w:r>
+          </w:p>
+        </w:tc>
+        <w:tc>
+          <w:tcPr>
+            <w:tcW w:w="700" w:type="dxa"/>
+          </w:tcPr>
+          <w:p>
+            <w:pPr>
+              <w:spacing w:after="0" w:line="220" w:lineRule="auto"/>
+              <w:jc w:val="center"/>
+            </w:pPr>
+            <w:r>
+              <w:rPr>
+                <w:sz w:val="18"/>
+              </w:rPr>
+              <w:t xml:space="preserve">150</w:t>
+            </w:r>
+          </w:p>
+        </w:tc>
+        <w:tc>
+          <w:tcPr>
+            <w:tcW w:w="1500" w:type="dxa"/>
+          </w:tcPr>
+          <w:p>
+            <w:pPr>
+              <w:spacing w:after="0" w:line="220" w:lineRule="auto"/>
+              <w:jc w:val="center"/>
+            </w:pPr>
+            <w:r>
+              <w:rPr>
+                <w:sz w:val="18"/>
+              </w:rPr>
+              <w:t xml:space="preserve">−61</w:t>
+            </w:r>
+          </w:p>
+        </w:tc>
+        <w:tc>
+          <w:tcPr>
+            <w:tcW w:w="1300" w:type="dxa"/>
+          </w:tcPr>
+          <w:p>
+            <w:pPr>
+              <w:spacing w:after="0" w:line="220" w:lineRule="auto"/>
+              <w:jc w:val="center"/>
+            </w:pPr>
+            <w:r>
+              <w:rPr>
+                <w:sz w:val="18"/>
+              </w:rPr>
+              <w:t xml:space="preserve">131 / 10 / 9</w:t>
+            </w:r>
+          </w:p>
+        </w:tc>
+        <w:tc>
+          <w:tcPr>
+            <w:tcW w:w="900" w:type="dxa"/>
+          </w:tcPr>
+          <w:p>
+            <w:pPr>
+              <w:spacing w:after="0" w:line="220" w:lineRule="auto"/>
+              <w:jc w:val="center"/>
+            </w:pPr>
+            <w:r>
+              <w:rPr>
+                <w:sz w:val="18"/>
+              </w:rPr>
+              <w:t xml:space="preserve">&lt; 0.0001</w:t>
+            </w:r>
+          </w:p>
+        </w:tc>
+        <w:tc>
+          <w:tcPr>
+            <w:tcW w:w="900" w:type="dxa"/>
+          </w:tcPr>
+          <w:p>
+            <w:pPr>
+              <w:spacing w:after="0" w:line="220" w:lineRule="auto"/>
+              <w:jc w:val="center"/>
+            </w:pPr>
+            <w:r>
+              <w:rPr>
+                <w:sz w:val="18"/>
+              </w:rPr>
+              <w:t xml:space="preserve">&lt; 0.0001</w:t>
+            </w:r>
+          </w:p>
+        </w:tc>
+      </w:tr>
+      <w:tr>
+        <w:trPr>
+          <w:cantSplit/>
+        </w:trPr>
+        <w:tc>
+          <w:tcPr>
+            <w:tcW w:w="4060" w:type="dxa"/>
+          </w:tcPr>
+          <w:p>
+            <w:pPr>
+              <w:spacing w:after="0" w:line="220" w:lineRule="auto"/>
+            </w:pPr>
+            <w:r>
+              <w:rPr>
+                <w:sz w:val="18"/>
+              </w:rPr>
+              <w:t xml:space="preserve">GODA repeat</w:t>
+            </w:r>
+          </w:p>
+        </w:tc>
+        <w:tc>
+          <w:tcPr>
+            <w:tcW w:w="700" w:type="dxa"/>
+          </w:tcPr>
+          <w:p>
+            <w:pPr>
+              <w:spacing w:after="0" w:line="220" w:lineRule="auto"/>
+              <w:jc w:val="center"/>
+            </w:pPr>
+            <w:r>
+              <w:rPr>
+                <w:sz w:val="18"/>
+              </w:rPr>
+              <w:t xml:space="preserve">150</w:t>
+            </w:r>
+          </w:p>
+        </w:tc>
+        <w:tc>
+          <w:tcPr>
+            <w:tcW w:w="1500" w:type="dxa"/>
+          </w:tcPr>
+          <w:p>
+            <w:pPr>
+              <w:spacing w:after="0" w:line="220" w:lineRule="auto"/>
+              <w:jc w:val="center"/>
+            </w:pPr>
+            <w:r>
+              <w:rPr>
+                <w:sz w:val="18"/>
+              </w:rPr>
+              <w:t xml:space="preserve">−57</w:t>
+            </w:r>
+          </w:p>
+        </w:tc>
+        <w:tc>
+          <w:tcPr>
+            <w:tcW w:w="1300" w:type="dxa"/>
+          </w:tcPr>
+          <w:p>
+            <w:pPr>
+              <w:spacing w:after="0" w:line="220" w:lineRule="auto"/>
+              <w:jc w:val="center"/>
+            </w:pPr>
+            <w:r>
+              <w:rPr>
+                <w:sz w:val="18"/>
+              </w:rPr>
+              <w:t xml:space="preserve">130 / 9 / 11</w:t>
+            </w:r>
+          </w:p>
+        </w:tc>
+        <w:tc>
+          <w:tcPr>
+            <w:tcW w:w="900" w:type="dxa"/>
+          </w:tcPr>
+          <w:p>
+            <w:pPr>
+              <w:spacing w:after="0" w:line="220" w:lineRule="auto"/>
+              <w:jc w:val="center"/>
+            </w:pPr>
+            <w:r>
+              <w:rPr>
+                <w:sz w:val="18"/>
+              </w:rPr>
+              <w:t xml:space="preserve">&lt; 0.0001</w:t>
+            </w:r>
+          </w:p>
+        </w:tc>
+        <w:tc>
+          <w:tcPr>
+            <w:tcW w:w="900" w:type="dxa"/>
+          </w:tcPr>
+          <w:p>
+            <w:pPr>
+              <w:spacing w:after="0" w:line="220" w:lineRule="auto"/>
+              <w:jc w:val="center"/>
+            </w:pPr>
+            <w:r>
+              <w:rPr>
+                <w:sz w:val="18"/>
+              </w:rPr>
+              <w:t xml:space="preserve">&lt; 0.0001</w:t>
+            </w:r>
+          </w:p>
+        </w:tc>
+      </w:tr>
+      <w:tr>
+        <w:trPr>
+          <w:cantSplit/>
+        </w:trPr>
+        <w:tc>
+          <w:tcPr>
+            <w:tcW w:w="4060" w:type="dxa"/>
+          </w:tcPr>
+          <w:p>
+            <w:pPr>
+              <w:spacing w:after="0" w:line="220" w:lineRule="auto"/>
+            </w:pPr>
+            <w:r>
+              <w:rPr>
+                <w:sz w:val="18"/>
+              </w:rPr>
+              <w:t xml:space="preserve">Independent gates</w:t>
+            </w:r>
+          </w:p>
+        </w:tc>
+        <w:tc>
+          <w:tcPr>
+            <w:tcW w:w="700" w:type="dxa"/>
+          </w:tcPr>
+          <w:p>
+            <w:pPr>
+              <w:spacing w:after="0" w:line="220" w:lineRule="auto"/>
+              <w:jc w:val="center"/>
+            </w:pPr>
+            <w:r>
+              <w:rPr>
+                <w:sz w:val="18"/>
+              </w:rPr>
+              <w:t xml:space="preserve">150</w:t>
+            </w:r>
+          </w:p>
+        </w:tc>
+        <w:tc>
+          <w:tcPr>
+            <w:tcW w:w="1500" w:type="dxa"/>
+          </w:tcPr>
+          <w:p>
+            <w:pPr>
+              <w:spacing w:after="0" w:line="220" w:lineRule="auto"/>
+              <w:jc w:val="center"/>
+            </w:pPr>
+            <w:r>
+              <w:rPr>
+                <w:sz w:val="18"/>
+              </w:rPr>
+              <w:t xml:space="preserve">−54</w:t>
+            </w:r>
+          </w:p>
+        </w:tc>
+        <w:tc>
+          <w:tcPr>
+            <w:tcW w:w="1300" w:type="dxa"/>
+          </w:tcPr>
+          <w:p>
+            <w:pPr>
+              <w:spacing w:after="0" w:line="220" w:lineRule="auto"/>
+              <w:jc w:val="center"/>
+            </w:pPr>
+            <w:r>
+              <w:rPr>
+                <w:sz w:val="18"/>
+              </w:rPr>
+              <w:t xml:space="preserve">127 / 10 / 13</w:t>
+            </w:r>
+          </w:p>
+        </w:tc>
+        <w:tc>
+          <w:tcPr>
+            <w:tcW w:w="900" w:type="dxa"/>
+          </w:tcPr>
+          <w:p>
+            <w:pPr>
+              <w:spacing w:after="0" w:line="220" w:lineRule="auto"/>
+              <w:jc w:val="center"/>
+            </w:pPr>
+            <w:r>
+              <w:rPr>
+                <w:sz w:val="18"/>
+              </w:rPr>
+              <w:t xml:space="preserve">&lt; 0.0001</w:t>
+            </w:r>
+          </w:p>
+        </w:tc>
+        <w:tc>
+          <w:tcPr>
+            <w:tcW w:w="900" w:type="dxa"/>
+          </w:tcPr>
+          <w:p>
+            <w:pPr>
+              <w:spacing w:after="0" w:line="220" w:lineRule="auto"/>
+              <w:jc w:val="center"/>
+            </w:pPr>
+            <w:r>
+              <w:rPr>
+                <w:sz w:val="18"/>
+              </w:rPr>
+              <w:t xml:space="preserve">&lt; 0.0001</w:t>
+            </w:r>
+          </w:p>
+        </w:tc>
+      </w:tr>
+      <w:tr>
+        <w:trPr>
+          <w:cantSplit/>
+        </w:trPr>
+        <w:tc>
+          <w:tcPr>
+            <w:tcW w:w="4060" w:type="dxa"/>
+          </w:tcPr>
+          <w:p>
+            <w:pPr>
+              <w:spacing w:after="0" w:line="220" w:lineRule="auto"/>
+            </w:pPr>
+            <w:r>
+              <w:rPr>
+                <w:sz w:val="18"/>
+              </w:rPr>
+              <w:t xml:space="preserve">Suppression intensity error (replay)</w:t>
+            </w:r>
+          </w:p>
+        </w:tc>
+        <w:tc>
+          <w:tcPr>
+            <w:tcW w:w="700" w:type="dxa"/>
+          </w:tcPr>
+          <w:p>
+            <w:pPr>
+              <w:spacing w:after="0" w:line="220" w:lineRule="auto"/>
+              <w:jc w:val="center"/>
+            </w:pPr>
+            <w:r>
+              <w:rPr>
+                <w:sz w:val="18"/>
+              </w:rPr>
+              <w:t xml:space="preserve">150</w:t>
+            </w:r>
+          </w:p>
+        </w:tc>
+        <w:tc>
+          <w:tcPr>
+            <w:tcW w:w="1500" w:type="dxa"/>
+          </w:tcPr>
+          <w:p>
+            <w:pPr>
+              <w:spacing w:after="0" w:line="220" w:lineRule="auto"/>
+              <w:jc w:val="center"/>
+            </w:pPr>
+            <w:r>
+              <w:rPr>
+                <w:sz w:val="18"/>
+              </w:rPr>
+              <w:t xml:space="preserve">−56</w:t>
+            </w:r>
+          </w:p>
+        </w:tc>
+        <w:tc>
+          <w:tcPr>
+            <w:tcW w:w="1300" w:type="dxa"/>
+          </w:tcPr>
+          <w:p>
+            <w:pPr>
+              <w:spacing w:after="0" w:line="220" w:lineRule="auto"/>
+              <w:jc w:val="center"/>
+            </w:pPr>
+            <w:r>
+              <w:rPr>
+                <w:sz w:val="18"/>
+              </w:rPr>
+              <w:t xml:space="preserve">127 / 15 / 8</w:t>
+            </w:r>
+          </w:p>
+        </w:tc>
+        <w:tc>
+          <w:tcPr>
+            <w:tcW w:w="900" w:type="dxa"/>
+          </w:tcPr>
+          <w:p>
+            <w:pPr>
+              <w:spacing w:after="0" w:line="220" w:lineRule="auto"/>
+              <w:jc w:val="center"/>
+            </w:pPr>
+            <w:r>
+              <w:rPr>
+                <w:sz w:val="18"/>
+              </w:rPr>
+              <w:t xml:space="preserve">&lt; 0.0001</w:t>
+            </w:r>
+          </w:p>
+        </w:tc>
+        <w:tc>
+          <w:tcPr>
+            <w:tcW w:w="900" w:type="dxa"/>
+          </w:tcPr>
+          <w:p>
+            <w:pPr>
+              <w:spacing w:after="0" w:line="220" w:lineRule="auto"/>
+              <w:jc w:val="center"/>
+            </w:pPr>
+            <w:r>
+              <w:rPr>
+                <w:sz w:val="18"/>
+              </w:rPr>
+              <w:t xml:space="preserve">&lt; 0.0001</w:t>
+            </w:r>
+          </w:p>
+        </w:tc>
+      </w:tr>
+      <w:tr>
+        <w:trPr>
+          <w:cantSplit/>
+        </w:trPr>
+        <w:tc>
+          <w:tcPr>
+            <w:tcW w:w="4060" w:type="dxa"/>
+          </w:tcPr>
+          <w:p>
+            <w:pPr>
+              <w:spacing w:after="0" w:line="220" w:lineRule="auto"/>
+            </w:pPr>
+            <w:r>
+              <w:rPr>
+                <w:sz w:val="18"/>
+              </w:rPr>
+              <w:t xml:space="preserve">Travel-effect decay error (replay)</w:t>
+            </w:r>
+          </w:p>
+        </w:tc>
+        <w:tc>
+          <w:tcPr>
+            <w:tcW w:w="700" w:type="dxa"/>
+          </w:tcPr>
+          <w:p>
+            <w:pPr>
+              <w:spacing w:after="0" w:line="220" w:lineRule="auto"/>
+              <w:jc w:val="center"/>
+            </w:pPr>
+            <w:r>
+              <w:rPr>
+                <w:sz w:val="18"/>
+              </w:rPr>
+              <w:t xml:space="preserve">150</w:t>
+            </w:r>
+          </w:p>
+        </w:tc>
+        <w:tc>
+          <w:tcPr>
+            <w:tcW w:w="1500" w:type="dxa"/>
+          </w:tcPr>
+          <w:p>
+            <w:pPr>
+              <w:spacing w:after="0" w:line="220" w:lineRule="auto"/>
+              <w:jc w:val="center"/>
+            </w:pPr>
+            <w:r>
+              <w:rPr>
+                <w:sz w:val="18"/>
+              </w:rPr>
+              <w:t xml:space="preserve">−54</w:t>
+            </w:r>
+          </w:p>
+        </w:tc>
+        <w:tc>
+          <w:tcPr>
+            <w:tcW w:w="1300" w:type="dxa"/>
+          </w:tcPr>
+          <w:p>
+            <w:pPr>
+              <w:spacing w:after="0" w:line="220" w:lineRule="auto"/>
+              <w:jc w:val="center"/>
+            </w:pPr>
+            <w:r>
+              <w:rPr>
+                <w:sz w:val="18"/>
+              </w:rPr>
+              <w:t xml:space="preserve">127 / 15 / 8</w:t>
+            </w:r>
+          </w:p>
+        </w:tc>
+        <w:tc>
+          <w:tcPr>
+            <w:tcW w:w="900" w:type="dxa"/>
+          </w:tcPr>
+          <w:p>
+            <w:pPr>
+              <w:spacing w:after="0" w:line="220" w:lineRule="auto"/>
+              <w:jc w:val="center"/>
+            </w:pPr>
+            <w:r>
+              <w:rPr>
+                <w:sz w:val="18"/>
+              </w:rPr>
+              <w:t xml:space="preserve">&lt; 0.0001</w:t>
+            </w:r>
+          </w:p>
+        </w:tc>
+        <w:tc>
+          <w:tcPr>
+            <w:tcW w:w="900" w:type="dxa"/>
+          </w:tcPr>
+          <w:p>
+            <w:pPr>
+              <w:spacing w:after="0" w:line="220" w:lineRule="auto"/>
+              <w:jc w:val="center"/>
+            </w:pPr>
+            <w:r>
+              <w:rPr>
+                <w:sz w:val="18"/>
+              </w:rPr>
+              <w:t xml:space="preserve">&lt; 0.0001</w:t>
+            </w:r>
+          </w:p>
+        </w:tc>
+      </w:tr>
+      <w:tr>
+        <w:trPr>
+          <w:cantSplit/>
+        </w:trPr>
+        <w:tc>
+          <w:tcPr>
+            <w:tcW w:w="4060" w:type="dxa"/>
+          </w:tcPr>
+          <w:p>
+            <w:pPr>
+              <w:spacing w:after="0" w:line="220" w:lineRule="auto"/>
+            </w:pPr>
+            <w:r>
+              <w:rPr>
+                <w:sz w:val="18"/>
+              </w:rPr>
+              <w:t xml:space="preserve">Knockdown threshold error (replay)</w:t>
+            </w:r>
+          </w:p>
+        </w:tc>
+        <w:tc>
+          <w:tcPr>
+            <w:tcW w:w="700" w:type="dxa"/>
+          </w:tcPr>
+          <w:p>
+            <w:pPr>
+              <w:spacing w:after="0" w:line="220" w:lineRule="auto"/>
+              <w:jc w:val="center"/>
+            </w:pPr>
+            <w:r>
+              <w:rPr>
+                <w:sz w:val="18"/>
+              </w:rPr>
+              <w:t xml:space="preserve">150</w:t>
+            </w:r>
+          </w:p>
+        </w:tc>
+        <w:tc>
+          <w:tcPr>
+            <w:tcW w:w="1500" w:type="dxa"/>
+          </w:tcPr>
+          <w:p>
+            <w:pPr>
+              <w:spacing w:after="0" w:line="220" w:lineRule="auto"/>
+              <w:jc w:val="center"/>
+            </w:pPr>
+            <w:r>
+              <w:rPr>
+                <w:sz w:val="18"/>
+              </w:rPr>
+              <w:t xml:space="preserve">−57</w:t>
+            </w:r>
+          </w:p>
+        </w:tc>
+        <w:tc>
+          <w:tcPr>
+            <w:tcW w:w="1300" w:type="dxa"/>
+          </w:tcPr>
+          <w:p>
+            <w:pPr>
+              <w:spacing w:after="0" w:line="220" w:lineRule="auto"/>
+              <w:jc w:val="center"/>
+            </w:pPr>
+            <w:r>
+              <w:rPr>
+                <w:sz w:val="18"/>
+              </w:rPr>
+              <w:t xml:space="preserve">133 / 13 / 4</w:t>
+            </w:r>
+          </w:p>
+        </w:tc>
+        <w:tc>
+          <w:tcPr>
+            <w:tcW w:w="900" w:type="dxa"/>
+          </w:tcPr>
+          <w:p>
+            <w:pPr>
+              <w:spacing w:after="0" w:line="220" w:lineRule="auto"/>
+              <w:jc w:val="center"/>
+            </w:pPr>
+            <w:r>
+              <w:rPr>
+                <w:sz w:val="18"/>
+              </w:rPr>
+              <w:t xml:space="preserve">&lt; 0.0001</w:t>
+            </w:r>
+          </w:p>
+        </w:tc>
+        <w:tc>
+          <w:tcPr>
+            <w:tcW w:w="900" w:type="dxa"/>
+          </w:tcPr>
+          <w:p>
+            <w:pPr>
+              <w:spacing w:after="0" w:line="220" w:lineRule="auto"/>
+              <w:jc w:val="center"/>
+            </w:pPr>
+            <w:r>
+              <w:rPr>
+                <w:sz w:val="18"/>
+              </w:rPr>
+              <w:t xml:space="preserve">&lt; 0.0001</w:t>
+            </w:r>
+          </w:p>
+        </w:tc>
+      </w:tr>
+      <w:tr>
+        <w:trPr>
+          <w:cantSplit/>
+        </w:trPr>
+        <w:tc>
+          <w:tcPr>
+            <w:tcW w:w="4060" w:type="dxa"/>
+          </w:tcPr>
+          <w:p>
+            <w:pPr>
+              <w:spacing w:after="0" w:line="220" w:lineRule="auto"/>
+            </w:pPr>
+            <w:r>
+              <w:rPr>
+                <w:sz w:val="18"/>
+              </w:rPr>
+              <w:t xml:space="preserve">Weakened coating</w:t>
+            </w:r>
+          </w:p>
+        </w:tc>
+        <w:tc>
+          <w:tcPr>
+            <w:tcW w:w="700" w:type="dxa"/>
+          </w:tcPr>
+          <w:p>
+            <w:pPr>
+              <w:spacing w:after="0" w:line="220" w:lineRule="auto"/>
+              <w:jc w:val="center"/>
+            </w:pPr>
+            <w:r>
+              <w:rPr>
+                <w:sz w:val="18"/>
+              </w:rPr>
+              <w:t xml:space="preserve">150</w:t>
+            </w:r>
+          </w:p>
+        </w:tc>
+        <w:tc>
+          <w:tcPr>
+            <w:tcW w:w="1500" w:type="dxa"/>
+          </w:tcPr>
+          <w:p>
+            <w:pPr>
+              <w:spacing w:after="0" w:line="220" w:lineRule="auto"/>
+              <w:jc w:val="center"/>
+            </w:pPr>
+            <w:r>
+              <w:rPr>
+                <w:sz w:val="18"/>
+              </w:rPr>
+              <w:t xml:space="preserve">−54</w:t>
+            </w:r>
+          </w:p>
+        </w:tc>
+        <w:tc>
+          <w:tcPr>
+            <w:tcW w:w="1300" w:type="dxa"/>
+          </w:tcPr>
+          <w:p>
+            <w:pPr>
+              <w:spacing w:after="0" w:line="220" w:lineRule="auto"/>
+              <w:jc w:val="center"/>
+            </w:pPr>
+            <w:r>
+              <w:rPr>
+                <w:sz w:val="18"/>
+              </w:rPr>
+              <w:t xml:space="preserve">127 / 10 / 13</w:t>
+            </w:r>
+          </w:p>
+        </w:tc>
+        <w:tc>
+          <w:tcPr>
+            <w:tcW w:w="900" w:type="dxa"/>
+          </w:tcPr>
+          <w:p>
+            <w:pPr>
+              <w:spacing w:after="0" w:line="220" w:lineRule="auto"/>
+              <w:jc w:val="center"/>
+            </w:pPr>
+            <w:r>
+              <w:rPr>
+                <w:sz w:val="18"/>
+              </w:rPr>
+              <w:t xml:space="preserve">&lt; 0.0001</w:t>
+            </w:r>
+          </w:p>
+        </w:tc>
+        <w:tc>
+          <w:tcPr>
+            <w:tcW w:w="900" w:type="dxa"/>
+          </w:tcPr>
+          <w:p>
+            <w:pPr>
+              <w:spacing w:after="0" w:line="220" w:lineRule="auto"/>
+              <w:jc w:val="center"/>
+            </w:pPr>
+            <w:r>
+              <w:rPr>
+                <w:sz w:val="18"/>
+              </w:rPr>
+              <w:t xml:space="preserve">&lt; 0.0001</w:t>
+            </w:r>
+          </w:p>
+        </w:tc>
+      </w:tr>
+      <w:tr>
+        <w:trPr>
+          <w:cantSplit/>
+        </w:trPr>
+        <w:tc>
+          <w:tcPr>
+            <w:tcW w:w="4060" w:type="dxa"/>
+          </w:tcPr>
+          <w:p>
+            <w:pPr>
+              <w:spacing w:after="0" w:line="220" w:lineRule="auto"/>
+            </w:pPr>
+            <w:r>
+              <w:rPr>
+                <w:sz w:val="18"/>
+              </w:rPr>
+              <w:t xml:space="preserve">Ineffective coating</w:t>
+            </w:r>
+          </w:p>
+        </w:tc>
+        <w:tc>
+          <w:tcPr>
+            <w:tcW w:w="700" w:type="dxa"/>
+          </w:tcPr>
+          <w:p>
+            <w:pPr>
+              <w:spacing w:after="0" w:line="220" w:lineRule="auto"/>
+              <w:jc w:val="center"/>
+            </w:pPr>
+            <w:r>
+              <w:rPr>
+                <w:sz w:val="18"/>
+              </w:rPr>
+              <w:t xml:space="preserve">150</w:t>
+            </w:r>
+          </w:p>
+        </w:tc>
+        <w:tc>
+          <w:tcPr>
+            <w:tcW w:w="1500" w:type="dxa"/>
+          </w:tcPr>
+          <w:p>
+            <w:pPr>
+              <w:spacing w:after="0" w:line="220" w:lineRule="auto"/>
+              <w:jc w:val="center"/>
+            </w:pPr>
+            <w:r>
+              <w:rPr>
+                <w:sz w:val="18"/>
+              </w:rPr>
+              <w:t xml:space="preserve">−33</w:t>
+            </w:r>
+          </w:p>
+        </w:tc>
+        <w:tc>
+          <w:tcPr>
+            <w:tcW w:w="1300" w:type="dxa"/>
+          </w:tcPr>
+          <w:p>
+            <w:pPr>
+              <w:spacing w:after="0" w:line="220" w:lineRule="auto"/>
+              <w:jc w:val="center"/>
+            </w:pPr>
+            <w:r>
+              <w:rPr>
+                <w:sz w:val="18"/>
+              </w:rPr>
+              <w:t xml:space="preserve">114 / 12 / 24</w:t>
+            </w:r>
+          </w:p>
+        </w:tc>
+        <w:tc>
+          <w:tcPr>
+            <w:tcW w:w="900" w:type="dxa"/>
+          </w:tcPr>
+          <w:p>
+            <w:pPr>
+              <w:spacing w:after="0" w:line="220" w:lineRule="auto"/>
+              <w:jc w:val="center"/>
+            </w:pPr>
+            <w:r>
+              <w:rPr>
+                <w:sz w:val="18"/>
+              </w:rPr>
+              <w:t xml:space="preserve">&lt; 0.0001</w:t>
+            </w:r>
+          </w:p>
+        </w:tc>
+        <w:tc>
+          <w:tcPr>
+            <w:tcW w:w="900" w:type="dxa"/>
+          </w:tcPr>
+          <w:p>
+            <w:pPr>
+              <w:spacing w:after="0" w:line="220" w:lineRule="auto"/>
+              <w:jc w:val="center"/>
+            </w:pPr>
+            <w:r>
+              <w:rPr>
+                <w:sz w:val="18"/>
+              </w:rPr>
+              <w:t xml:space="preserve">&lt; 0.0001</w:t>
+            </w:r>
+          </w:p>
+        </w:tc>
+      </w:tr>
+      <w:tr>
+        <w:trPr>
+          <w:cantSplit/>
+        </w:trPr>
+        <w:tc>
+          <w:tcPr>
+            <w:tcW w:w="4060" w:type="dxa"/>
+          </w:tcPr>
+          <w:p>
+            <w:pPr>
+              <w:spacing w:after="0" w:line="220" w:lineRule="auto"/>
+            </w:pPr>
+            <w:r>
+              <w:rPr>
+                <w:sz w:val="18"/>
+              </w:rPr>
+              <w:t xml:space="preserve">Coating price ×2</w:t>
+            </w:r>
+          </w:p>
+        </w:tc>
+        <w:tc>
+          <w:tcPr>
+            <w:tcW w:w="700" w:type="dxa"/>
+          </w:tcPr>
+          <w:p>
+            <w:pPr>
+              <w:spacing w:after="0" w:line="220" w:lineRule="auto"/>
+              <w:jc w:val="center"/>
+            </w:pPr>
+            <w:r>
+              <w:rPr>
+                <w:sz w:val="18"/>
+              </w:rPr>
+              <w:t xml:space="preserve">150</w:t>
+            </w:r>
+          </w:p>
+        </w:tc>
+        <w:tc>
+          <w:tcPr>
+            <w:tcW w:w="1500" w:type="dxa"/>
+          </w:tcPr>
+          <w:p>
+            <w:pPr>
+              <w:spacing w:after="0" w:line="220" w:lineRule="auto"/>
+              <w:jc w:val="center"/>
+            </w:pPr>
+            <w:r>
+              <w:rPr>
+                <w:sz w:val="18"/>
+              </w:rPr>
+              <w:t xml:space="preserve">−60</w:t>
+            </w:r>
+          </w:p>
+        </w:tc>
+        <w:tc>
+          <w:tcPr>
+            <w:tcW w:w="1300" w:type="dxa"/>
+          </w:tcPr>
+          <w:p>
+            <w:pPr>
+              <w:spacing w:after="0" w:line="220" w:lineRule="auto"/>
+              <w:jc w:val="center"/>
+            </w:pPr>
+            <w:r>
+              <w:rPr>
+                <w:sz w:val="18"/>
+              </w:rPr>
+              <w:t xml:space="preserve">132 / 12 / 6</w:t>
+            </w:r>
+          </w:p>
+        </w:tc>
+        <w:tc>
+          <w:tcPr>
+            <w:tcW w:w="900" w:type="dxa"/>
+          </w:tcPr>
+          <w:p>
+            <w:pPr>
+              <w:spacing w:after="0" w:line="220" w:lineRule="auto"/>
+              <w:jc w:val="center"/>
+            </w:pPr>
+            <w:r>
+              <w:rPr>
+                <w:sz w:val="18"/>
+              </w:rPr>
+              <w:t xml:space="preserve">&lt; 0.0001</w:t>
+            </w:r>
+          </w:p>
+        </w:tc>
+        <w:tc>
+          <w:tcPr>
+            <w:tcW w:w="900" w:type="dxa"/>
+          </w:tcPr>
+          <w:p>
+            <w:pPr>
+              <w:spacing w:after="0" w:line="220" w:lineRule="auto"/>
+              <w:jc w:val="center"/>
+            </w:pPr>
+            <w:r>
+              <w:rPr>
+                <w:sz w:val="18"/>
+              </w:rPr>
+              <w:t xml:space="preserve">&lt; 0.0001</w:t>
+            </w:r>
+          </w:p>
+        </w:tc>
+      </w:tr>
+      <w:tr>
+        <w:trPr>
+          <w:cantSplit/>
+        </w:trPr>
+        <w:tc>
+          <w:tcPr>
+            <w:tcW w:w="4060" w:type="dxa"/>
+          </w:tcPr>
+          <w:p>
+            <w:pPr>
+              <w:spacing w:after="0" w:line="220" w:lineRule="auto"/>
+            </w:pPr>
+            <w:r>
+              <w:rPr>
+                <w:sz w:val="18"/>
+              </w:rPr>
+              <w:t xml:space="preserve">Coating stock 20 ha</w:t>
+            </w:r>
+          </w:p>
+        </w:tc>
+        <w:tc>
+          <w:tcPr>
+            <w:tcW w:w="700" w:type="dxa"/>
+          </w:tcPr>
+          <w:p>
+            <w:pPr>
+              <w:spacing w:after="0" w:line="220" w:lineRule="auto"/>
+              <w:jc w:val="center"/>
+            </w:pPr>
+            <w:r>
+              <w:rPr>
+                <w:sz w:val="18"/>
+              </w:rPr>
+              <w:t xml:space="preserve">150</w:t>
+            </w:r>
+          </w:p>
+        </w:tc>
+        <w:tc>
+          <w:tcPr>
+            <w:tcW w:w="1500" w:type="dxa"/>
+          </w:tcPr>
+          <w:p>
+            <w:pPr>
+              <w:spacing w:after="0" w:line="220" w:lineRule="auto"/>
+              <w:jc w:val="center"/>
+            </w:pPr>
+            <w:r>
+              <w:rPr>
+                <w:sz w:val="18"/>
+              </w:rPr>
+              <w:t xml:space="preserve">−53</w:t>
+            </w:r>
+          </w:p>
+        </w:tc>
+        <w:tc>
+          <w:tcPr>
+            <w:tcW w:w="1300" w:type="dxa"/>
+          </w:tcPr>
+          <w:p>
+            <w:pPr>
+              <w:spacing w:after="0" w:line="220" w:lineRule="auto"/>
+              <w:jc w:val="center"/>
+            </w:pPr>
+            <w:r>
+              <w:rPr>
+                <w:sz w:val="18"/>
+              </w:rPr>
+              <w:t xml:space="preserve">131 / 9 / 10</w:t>
+            </w:r>
+          </w:p>
+        </w:tc>
+        <w:tc>
+          <w:tcPr>
+            <w:tcW w:w="900" w:type="dxa"/>
+          </w:tcPr>
+          <w:p>
+            <w:pPr>
+              <w:spacing w:after="0" w:line="220" w:lineRule="auto"/>
+              <w:jc w:val="center"/>
+            </w:pPr>
+            <w:r>
+              <w:rPr>
+                <w:sz w:val="18"/>
+              </w:rPr>
+              <w:t xml:space="preserve">&lt; 0.0001</w:t>
+            </w:r>
+          </w:p>
+        </w:tc>
+        <w:tc>
+          <w:tcPr>
+            <w:tcW w:w="900" w:type="dxa"/>
+          </w:tcPr>
+          <w:p>
+            <w:pPr>
+              <w:spacing w:after="0" w:line="220" w:lineRule="auto"/>
+              <w:jc w:val="center"/>
+            </w:pPr>
+            <w:r>
+              <w:rPr>
+                <w:sz w:val="18"/>
+              </w:rPr>
+              <w:t xml:space="preserve">&lt; 0.0001</w:t>
+            </w:r>
+          </w:p>
+        </w:tc>
+      </w:tr>
+      <w:tr>
+        <w:trPr>
+          <w:cantSplit/>
+        </w:trPr>
+        <w:tc>
+          <w:tcPr>
+            <w:tcW w:w="4060" w:type="dxa"/>
+          </w:tcPr>
+          <w:p>
+            <w:pPr>
+              <w:spacing w:after="0" w:line="220" w:lineRule="auto"/>
+            </w:pPr>
+            <w:r>
+              <w:rPr>
+                <w:sz w:val="18"/>
+              </w:rPr>
+              <w:t xml:space="preserve">Coating delay 12 min</w:t>
+            </w:r>
+          </w:p>
+        </w:tc>
+        <w:tc>
+          <w:tcPr>
+            <w:tcW w:w="700" w:type="dxa"/>
+          </w:tcPr>
+          <w:p>
+            <w:pPr>
+              <w:spacing w:after="0" w:line="220" w:lineRule="auto"/>
+              <w:jc w:val="center"/>
+            </w:pPr>
+            <w:r>
+              <w:rPr>
+                <w:sz w:val="18"/>
+              </w:rPr>
+              <w:t xml:space="preserve">150</w:t>
+            </w:r>
+          </w:p>
+        </w:tc>
+        <w:tc>
+          <w:tcPr>
+            <w:tcW w:w="1500" w:type="dxa"/>
+          </w:tcPr>
+          <w:p>
+            <w:pPr>
+              <w:spacing w:after="0" w:line="220" w:lineRule="auto"/>
+              <w:jc w:val="center"/>
+            </w:pPr>
+            <w:r>
+              <w:rPr>
+                <w:sz w:val="18"/>
+              </w:rPr>
+              <w:t xml:space="preserve">−50</w:t>
+            </w:r>
+          </w:p>
+        </w:tc>
+        <w:tc>
+          <w:tcPr>
+            <w:tcW w:w="1300" w:type="dxa"/>
+          </w:tcPr>
+          <w:p>
+            <w:pPr>
+              <w:spacing w:after="0" w:line="220" w:lineRule="auto"/>
+              <w:jc w:val="center"/>
+            </w:pPr>
+            <w:r>
+              <w:rPr>
+                <w:sz w:val="18"/>
+              </w:rPr>
+              <w:t xml:space="preserve">130 / 11 / 9</w:t>
+            </w:r>
+          </w:p>
+        </w:tc>
+        <w:tc>
+          <w:tcPr>
+            <w:tcW w:w="900" w:type="dxa"/>
+          </w:tcPr>
+          <w:p>
+            <w:pPr>
+              <w:spacing w:after="0" w:line="220" w:lineRule="auto"/>
+              <w:jc w:val="center"/>
+            </w:pPr>
+            <w:r>
+              <w:rPr>
+                <w:sz w:val="18"/>
+              </w:rPr>
+              <w:t xml:space="preserve">&lt; 0.0001</w:t>
+            </w:r>
+          </w:p>
+        </w:tc>
+        <w:tc>
+          <w:tcPr>
+            <w:tcW w:w="900" w:type="dxa"/>
+          </w:tcPr>
+          <w:p>
+            <w:pPr>
+              <w:spacing w:after="0" w:line="220" w:lineRule="auto"/>
+              <w:jc w:val="center"/>
+            </w:pPr>
+            <w:r>
+              <w:rPr>
+                <w:sz w:val="18"/>
+              </w:rPr>
+              <w:t xml:space="preserve">&lt; 0.0001</w:t>
+            </w:r>
+          </w:p>
+        </w:tc>
+      </w:tr>
+      <w:tr>
+        <w:trPr>
+          <w:cantSplit/>
+        </w:trPr>
+        <w:tc>
+          <w:tcPr>
+            <w:tcW w:w="4060" w:type="dxa"/>
+          </w:tcPr>
+          <w:p>
+            <w:pPr>
+              <w:spacing w:after="0" w:line="220" w:lineRule="auto"/>
+            </w:pPr>
+            <w:r>
+              <w:rPr>
+                <w:sz w:val="18"/>
+              </w:rPr>
+              <w:t xml:space="preserve">Wind speed ×1.5</w:t>
+            </w:r>
+          </w:p>
+        </w:tc>
+        <w:tc>
+          <w:tcPr>
+            <w:tcW w:w="700" w:type="dxa"/>
+          </w:tcPr>
+          <w:p>
+            <w:pPr>
+              <w:spacing w:after="0" w:line="220" w:lineRule="auto"/>
+              <w:jc w:val="center"/>
+            </w:pPr>
+            <w:r>
+              <w:rPr>
+                <w:sz w:val="18"/>
+              </w:rPr>
+              <w:t xml:space="preserve">150</w:t>
+            </w:r>
+          </w:p>
+        </w:tc>
+        <w:tc>
+          <w:tcPr>
+            <w:tcW w:w="1500" w:type="dxa"/>
+          </w:tcPr>
+          <w:p>
+            <w:pPr>
+              <w:spacing w:after="0" w:line="220" w:lineRule="auto"/>
+              <w:jc w:val="center"/>
+            </w:pPr>
+            <w:r>
+              <w:rPr>
+                <w:sz w:val="18"/>
+              </w:rPr>
+              <w:t xml:space="preserve">−44</w:t>
+            </w:r>
+          </w:p>
+        </w:tc>
+        <w:tc>
+          <w:tcPr>
+            <w:tcW w:w="1300" w:type="dxa"/>
+          </w:tcPr>
+          <w:p>
+            <w:pPr>
+              <w:spacing w:after="0" w:line="220" w:lineRule="auto"/>
+              <w:jc w:val="center"/>
+            </w:pPr>
+            <w:r>
+              <w:rPr>
+                <w:sz w:val="18"/>
+              </w:rPr>
+              <w:t xml:space="preserve">120 / 15 / 15</w:t>
+            </w:r>
+          </w:p>
+        </w:tc>
+        <w:tc>
+          <w:tcPr>
+            <w:tcW w:w="900" w:type="dxa"/>
+          </w:tcPr>
+          <w:p>
+            <w:pPr>
+              <w:spacing w:after="0" w:line="220" w:lineRule="auto"/>
+              <w:jc w:val="center"/>
+            </w:pPr>
+            <w:r>
+              <w:rPr>
+                <w:sz w:val="18"/>
+              </w:rPr>
+              <w:t xml:space="preserve">&lt; 0.0001</w:t>
+            </w:r>
+          </w:p>
+        </w:tc>
+        <w:tc>
+          <w:tcPr>
+            <w:tcW w:w="900" w:type="dxa"/>
+          </w:tcPr>
+          <w:p>
+            <w:pPr>
+              <w:spacing w:after="0" w:line="220" w:lineRule="auto"/>
+              <w:jc w:val="center"/>
+            </w:pPr>
+            <w:r>
+              <w:rPr>
+                <w:sz w:val="18"/>
+              </w:rPr>
+              <w:t xml:space="preserve">&lt; 0.0001</w:t>
+            </w:r>
+          </w:p>
+        </w:tc>
+      </w:tr>
+      <w:tr>
+        <w:trPr>
+          <w:cantSplit/>
+        </w:trPr>
+        <w:tc>
+          <w:tcPr>
+            <w:tcW w:w="4060" w:type="dxa"/>
+          </w:tcPr>
+          <w:p>
+            <w:pPr>
+              <w:spacing w:after="0" w:line="220" w:lineRule="auto"/>
+            </w:pPr>
+            <w:r>
+              <w:rPr>
+                <w:sz w:val="18"/>
+              </w:rPr>
+              <w:t xml:space="preserve">Wind direction +30°</w:t>
+            </w:r>
+          </w:p>
+        </w:tc>
+        <w:tc>
+          <w:tcPr>
+            <w:tcW w:w="700" w:type="dxa"/>
+          </w:tcPr>
+          <w:p>
+            <w:pPr>
+              <w:spacing w:after="0" w:line="220" w:lineRule="auto"/>
+              <w:jc w:val="center"/>
+            </w:pPr>
+            <w:r>
+              <w:rPr>
+                <w:sz w:val="18"/>
+              </w:rPr>
+              <w:t xml:space="preserve">150</w:t>
+            </w:r>
+          </w:p>
+        </w:tc>
+        <w:tc>
+          <w:tcPr>
+            <w:tcW w:w="1500" w:type="dxa"/>
+          </w:tcPr>
+          <w:p>
+            <w:pPr>
+              <w:spacing w:after="0" w:line="220" w:lineRule="auto"/>
+              <w:jc w:val="center"/>
+            </w:pPr>
+            <w:r>
+              <w:rPr>
+                <w:sz w:val="18"/>
+              </w:rPr>
+              <w:t xml:space="preserve">−58</w:t>
+            </w:r>
+          </w:p>
+        </w:tc>
+        <w:tc>
+          <w:tcPr>
+            <w:tcW w:w="1300" w:type="dxa"/>
+          </w:tcPr>
+          <w:p>
+            <w:pPr>
+              <w:spacing w:after="0" w:line="220" w:lineRule="auto"/>
+              <w:jc w:val="center"/>
+            </w:pPr>
+            <w:r>
+              <w:rPr>
+                <w:sz w:val="18"/>
+              </w:rPr>
+              <w:t xml:space="preserve">130 / 12 / 8</w:t>
+            </w:r>
+          </w:p>
+        </w:tc>
+        <w:tc>
+          <w:tcPr>
+            <w:tcW w:w="900" w:type="dxa"/>
+          </w:tcPr>
+          <w:p>
+            <w:pPr>
+              <w:spacing w:after="0" w:line="220" w:lineRule="auto"/>
+              <w:jc w:val="center"/>
+            </w:pPr>
+            <w:r>
+              <w:rPr>
+                <w:sz w:val="18"/>
+              </w:rPr>
+              <w:t xml:space="preserve">&lt; 0.0001</w:t>
+            </w:r>
+          </w:p>
+        </w:tc>
+        <w:tc>
+          <w:tcPr>
+            <w:tcW w:w="900" w:type="dxa"/>
+          </w:tcPr>
+          <w:p>
+            <w:pPr>
+              <w:spacing w:after="0" w:line="220" w:lineRule="auto"/>
+              <w:jc w:val="center"/>
+            </w:pPr>
+            <w:r>
+              <w:rPr>
+                <w:sz w:val="18"/>
+              </w:rPr>
+              <w:t xml:space="preserve">&lt; 0.0001</w:t>
+            </w:r>
+          </w:p>
+        </w:tc>
+      </w:tr>
+      <w:tr>
+        <w:trPr>
+          <w:cantSplit/>
+        </w:trPr>
+        <w:tc>
+          <w:tcPr>
+            <w:tcW w:w="4060" w:type="dxa"/>
+          </w:tcPr>
+          <w:p>
+            <w:pPr>
+              <w:spacing w:after="0" w:line="220" w:lineRule="auto"/>
+            </w:pPr>
+            <w:r>
+              <w:rPr>
+                <w:sz w:val="18"/>
+              </w:rPr>
+              <w:t xml:space="preserve">Wind direction −30°</w:t>
+            </w:r>
+          </w:p>
+        </w:tc>
+        <w:tc>
+          <w:tcPr>
+            <w:tcW w:w="700" w:type="dxa"/>
+          </w:tcPr>
+          <w:p>
+            <w:pPr>
+              <w:spacing w:after="0" w:line="220" w:lineRule="auto"/>
+              <w:jc w:val="center"/>
+            </w:pPr>
+            <w:r>
+              <w:rPr>
+                <w:sz w:val="18"/>
+              </w:rPr>
+              <w:t xml:space="preserve">150</w:t>
+            </w:r>
+          </w:p>
+        </w:tc>
+        <w:tc>
+          <w:tcPr>
+            <w:tcW w:w="1500" w:type="dxa"/>
+          </w:tcPr>
+          <w:p>
+            <w:pPr>
+              <w:spacing w:after="0" w:line="220" w:lineRule="auto"/>
+              <w:jc w:val="center"/>
+            </w:pPr>
+            <w:r>
+              <w:rPr>
+                <w:sz w:val="18"/>
+              </w:rPr>
+              <w:t xml:space="preserve">−63</w:t>
+            </w:r>
+          </w:p>
+        </w:tc>
+        <w:tc>
+          <w:tcPr>
+            <w:tcW w:w="1300" w:type="dxa"/>
+          </w:tcPr>
+          <w:p>
+            <w:pPr>
+              <w:spacing w:after="0" w:line="220" w:lineRule="auto"/>
+              <w:jc w:val="center"/>
+            </w:pPr>
+            <w:r>
+              <w:rPr>
+                <w:sz w:val="18"/>
+              </w:rPr>
+              <w:t xml:space="preserve">126 / 11 / 13</w:t>
+            </w:r>
+          </w:p>
+        </w:tc>
+        <w:tc>
+          <w:tcPr>
+            <w:tcW w:w="900" w:type="dxa"/>
+          </w:tcPr>
+          <w:p>
+            <w:pPr>
+              <w:spacing w:after="0" w:line="220" w:lineRule="auto"/>
+              <w:jc w:val="center"/>
+            </w:pPr>
+            <w:r>
+              <w:rPr>
+                <w:sz w:val="18"/>
+              </w:rPr>
+              <w:t xml:space="preserve">&lt; 0.0001</w:t>
+            </w:r>
+          </w:p>
+        </w:tc>
+        <w:tc>
+          <w:tcPr>
+            <w:tcW w:w="900" w:type="dxa"/>
+          </w:tcPr>
+          <w:p>
+            <w:pPr>
+              <w:spacing w:after="0" w:line="220" w:lineRule="auto"/>
+              <w:jc w:val="center"/>
+            </w:pPr>
+            <w:r>
+              <w:rPr>
+                <w:sz w:val="18"/>
+              </w:rPr>
+              <w:t xml:space="preserve">&lt; 0.0001</w:t>
+            </w:r>
+          </w:p>
+        </w:tc>
+      </w:tr>
+      <w:tr>
+        <w:trPr>
+          <w:cantSplit/>
+        </w:trPr>
+        <w:tc>
+          <w:tcPr>
+            <w:tcW w:w="4060" w:type="dxa"/>
+          </w:tcPr>
+          <w:p>
+            <w:pPr>
+              <w:spacing w:after="0" w:line="220" w:lineRule="auto"/>
+            </w:pPr>
+            <w:r>
+              <w:rPr>
+                <w:sz w:val="18"/>
+              </w:rPr>
+              <w:t xml:space="preserve">Spread kernel and ember model</w:t>
+            </w:r>
+          </w:p>
+        </w:tc>
+        <w:tc>
+          <w:tcPr>
+            <w:tcW w:w="700" w:type="dxa"/>
+          </w:tcPr>
+          <w:p>
+            <w:pPr>
+              <w:spacing w:after="0" w:line="220" w:lineRule="auto"/>
+              <w:jc w:val="center"/>
+            </w:pPr>
+            <w:r>
+              <w:rPr>
+                <w:sz w:val="18"/>
+              </w:rPr>
+              <w:t xml:space="preserve">150</w:t>
+            </w:r>
+          </w:p>
+        </w:tc>
+        <w:tc>
+          <w:tcPr>
+            <w:tcW w:w="1500" w:type="dxa"/>
+          </w:tcPr>
+          <w:p>
+            <w:pPr>
+              <w:spacing w:after="0" w:line="220" w:lineRule="auto"/>
+              <w:jc w:val="center"/>
+            </w:pPr>
+            <w:r>
+              <w:rPr>
+                <w:sz w:val="18"/>
+              </w:rPr>
+              <w:t xml:space="preserve">−56</w:t>
+            </w:r>
+          </w:p>
+        </w:tc>
+        <w:tc>
+          <w:tcPr>
+            <w:tcW w:w="1300" w:type="dxa"/>
+          </w:tcPr>
+          <w:p>
+            <w:pPr>
+              <w:spacing w:after="0" w:line="220" w:lineRule="auto"/>
+              <w:jc w:val="center"/>
+            </w:pPr>
+            <w:r>
+              <w:rPr>
+                <w:sz w:val="18"/>
+              </w:rPr>
+              <w:t xml:space="preserve">130 / 13 / 7</w:t>
+            </w:r>
+          </w:p>
+        </w:tc>
+        <w:tc>
+          <w:tcPr>
+            <w:tcW w:w="900" w:type="dxa"/>
+          </w:tcPr>
+          <w:p>
+            <w:pPr>
+              <w:spacing w:after="0" w:line="220" w:lineRule="auto"/>
+              <w:jc w:val="center"/>
+            </w:pPr>
+            <w:r>
+              <w:rPr>
+                <w:sz w:val="18"/>
+              </w:rPr>
+              <w:t xml:space="preserve">&lt; 0.0001</w:t>
+            </w:r>
+          </w:p>
+        </w:tc>
+        <w:tc>
+          <w:tcPr>
+            <w:tcW w:w="900" w:type="dxa"/>
+          </w:tcPr>
+          <w:p>
+            <w:pPr>
+              <w:spacing w:after="0" w:line="220" w:lineRule="auto"/>
+              <w:jc w:val="center"/>
+            </w:pPr>
+            <w:r>
+              <w:rPr>
+                <w:sz w:val="18"/>
+              </w:rPr>
+              <w:t xml:space="preserve">&lt; 0.0001</w:t>
+            </w:r>
+          </w:p>
+        </w:tc>
+      </w:tr>
+      <w:tr>
+        <w:trPr>
+          <w:cantSplit/>
+        </w:trPr>
+        <w:tc>
+          <w:tcPr>
+            <w:tcW w:w="9360" w:type="dxa"/>
+            <w:gridSpan w:val="6"/>
+          </w:tcPr>
+          <w:p>
+            <w:pPr>
+              <w:spacing w:after="0" w:line="220" w:lineRule="auto"/>
+            </w:pPr>
+            <w:r>
+              <w:rPr>
+                <w:b/>
+                <w:sz w:val="18"/>
+              </w:rPr>
+              <w:t xml:space="preserve">Table VIII</w:t>
+            </w:r>
+          </w:p>
+        </w:tc>
+      </w:tr>
+      <w:tr>
+        <w:trPr>
+          <w:cantSplit/>
+        </w:trPr>
+        <w:tc>
+          <w:tcPr>
+            <w:tcW w:w="4060" w:type="dxa"/>
+          </w:tcPr>
+          <w:p>
+            <w:pPr>
+              <w:spacing w:after="0" w:line="220" w:lineRule="auto"/>
+            </w:pPr>
+            <w:r>
+              <w:rPr>
+                <w:sz w:val="18"/>
+              </w:rPr>
+              <w:t xml:space="preserve">40 rules + Closed / Seeds + Closed</w:t>
+            </w:r>
+          </w:p>
+        </w:tc>
+        <w:tc>
+          <w:tcPr>
+            <w:tcW w:w="700" w:type="dxa"/>
+          </w:tcPr>
+          <w:p>
+            <w:pPr>
+              <w:spacing w:after="0" w:line="220" w:lineRule="auto"/>
+              <w:jc w:val="center"/>
+            </w:pPr>
+            <w:r>
+              <w:rPr>
+                <w:sz w:val="18"/>
+              </w:rPr>
+              <w:t xml:space="preserve">150</w:t>
+            </w:r>
+          </w:p>
+        </w:tc>
+        <w:tc>
+          <w:tcPr>
+            <w:tcW w:w="1500" w:type="dxa"/>
+          </w:tcPr>
+          <w:p>
+            <w:pPr>
+              <w:spacing w:after="0" w:line="220" w:lineRule="auto"/>
+              <w:jc w:val="center"/>
+            </w:pPr>
+            <w:r>
+              <w:rPr>
+                <w:sz w:val="18"/>
+              </w:rPr>
+              <w:t xml:space="preserve">−11</w:t>
+            </w:r>
+          </w:p>
+        </w:tc>
+        <w:tc>
+          <w:tcPr>
+            <w:tcW w:w="1300" w:type="dxa"/>
+          </w:tcPr>
+          <w:p>
+            <w:pPr>
+              <w:spacing w:after="0" w:line="220" w:lineRule="auto"/>
+              <w:jc w:val="center"/>
+            </w:pPr>
+            <w:r>
+              <w:rPr>
+                <w:sz w:val="18"/>
+              </w:rPr>
+              <w:t xml:space="preserve">92 / 15 / 43</w:t>
+            </w:r>
+          </w:p>
+        </w:tc>
+        <w:tc>
+          <w:tcPr>
+            <w:tcW w:w="900" w:type="dxa"/>
+          </w:tcPr>
+          <w:p>
+            <w:pPr>
+              <w:spacing w:after="0" w:line="220" w:lineRule="auto"/>
+              <w:jc w:val="center"/>
+            </w:pPr>
+            <w:r>
+              <w:rPr>
+                <w:sz w:val="18"/>
+              </w:rPr>
+              <w:t xml:space="preserve">0.006</w:t>
+            </w:r>
+          </w:p>
+        </w:tc>
+        <w:tc>
+          <w:tcPr>
+            <w:tcW w:w="900" w:type="dxa"/>
+          </w:tcPr>
+          <w:p>
+            <w:pPr>
+              <w:spacing w:after="0" w:line="220" w:lineRule="auto"/>
+              <w:jc w:val="center"/>
+            </w:pPr>
+            <w:r>
+              <w:rPr>
+                <w:sz w:val="18"/>
+              </w:rPr>
+              <w:t xml:space="preserve">0.02</w:t>
+            </w:r>
+          </w:p>
+        </w:tc>
+      </w:tr>
+      <w:tr>
+        <w:trPr>
+          <w:cantSplit/>
+        </w:trPr>
+        <w:tc>
+          <w:tcPr>
+            <w:tcW w:w="4060" w:type="dxa"/>
+          </w:tcPr>
+          <w:p>
+            <w:pPr>
+              <w:spacing w:after="0" w:line="220" w:lineRule="auto"/>
+            </w:pPr>
+            <w:r>
+              <w:rPr>
+                <w:sz w:val="18"/>
+              </w:rPr>
+              <w:t xml:space="preserve">Seeds + six hand-written tactics + Closed / Seeds + Closed</w:t>
+            </w:r>
+          </w:p>
+        </w:tc>
+        <w:tc>
+          <w:tcPr>
+            <w:tcW w:w="700" w:type="dxa"/>
+          </w:tcPr>
+          <w:p>
+            <w:pPr>
+              <w:spacing w:after="0" w:line="220" w:lineRule="auto"/>
+              <w:jc w:val="center"/>
+            </w:pPr>
+            <w:r>
+              <w:rPr>
+                <w:sz w:val="18"/>
+              </w:rPr>
+              <w:t xml:space="preserve">150</w:t>
+            </w:r>
+          </w:p>
+        </w:tc>
+        <w:tc>
+          <w:tcPr>
+            <w:tcW w:w="1500" w:type="dxa"/>
+          </w:tcPr>
+          <w:p>
+            <w:pPr>
+              <w:spacing w:after="0" w:line="220" w:lineRule="auto"/>
+              <w:jc w:val="center"/>
+            </w:pPr>
+            <w:r>
+              <w:rPr>
+                <w:sz w:val="18"/>
+              </w:rPr>
+              <w:t xml:space="preserve">−9</w:t>
+            </w:r>
+          </w:p>
+        </w:tc>
+        <w:tc>
+          <w:tcPr>
+            <w:tcW w:w="1300" w:type="dxa"/>
+          </w:tcPr>
+          <w:p>
+            <w:pPr>
+              <w:spacing w:after="0" w:line="220" w:lineRule="auto"/>
+              <w:jc w:val="center"/>
+            </w:pPr>
+            <w:r>
+              <w:rPr>
+                <w:sz w:val="18"/>
+              </w:rPr>
+              <w:t xml:space="preserve">71 / 40 / 39</w:t>
+            </w:r>
+          </w:p>
+        </w:tc>
+        <w:tc>
+          <w:tcPr>
+            <w:tcW w:w="900" w:type="dxa"/>
+          </w:tcPr>
+          <w:p>
+            <w:pPr>
+              <w:spacing w:after="0" w:line="220" w:lineRule="auto"/>
+              <w:jc w:val="center"/>
+            </w:pPr>
+            <w:r>
+              <w:rPr>
+                <w:sz w:val="18"/>
+              </w:rPr>
+              <w:t xml:space="preserve">0.001</w:t>
+            </w:r>
+          </w:p>
+        </w:tc>
+        <w:tc>
+          <w:tcPr>
+            <w:tcW w:w="900" w:type="dxa"/>
+          </w:tcPr>
+          <w:p>
+            <w:pPr>
+              <w:spacing w:after="0" w:line="220" w:lineRule="auto"/>
+              <w:jc w:val="center"/>
+            </w:pPr>
+            <w:r>
+              <w:rPr>
+                <w:sz w:val="18"/>
+              </w:rPr>
+              <w:t xml:space="preserve">0.005</w:t>
+            </w:r>
+          </w:p>
+        </w:tc>
+      </w:tr>
+      <w:tr>
+        <w:trPr>
+          <w:cantSplit/>
+        </w:trPr>
+        <w:tc>
+          <w:tcPr>
+            <w:tcW w:w="4060" w:type="dxa"/>
+          </w:tcPr>
+          <w:p>
+            <w:pPr>
+              <w:spacing w:after="0" w:line="220" w:lineRule="auto"/>
+            </w:pPr>
+            <w:r>
+              <w:rPr>
+                <w:sz w:val="18"/>
+              </w:rPr>
+              <w:t xml:space="preserve">Recorded + Closed / Seeds + Closed (75)</w:t>
+            </w:r>
+          </w:p>
+        </w:tc>
+        <w:tc>
+          <w:tcPr>
+            <w:tcW w:w="700" w:type="dxa"/>
+          </w:tcPr>
+          <w:p>
+            <w:pPr>
+              <w:spacing w:after="0" w:line="220" w:lineRule="auto"/>
+              <w:jc w:val="center"/>
+            </w:pPr>
+            <w:r>
+              <w:rPr>
+                <w:sz w:val="18"/>
+              </w:rPr>
+              <w:t xml:space="preserve">75</w:t>
+            </w:r>
+          </w:p>
+        </w:tc>
+        <w:tc>
+          <w:tcPr>
+            <w:tcW w:w="1500" w:type="dxa"/>
+          </w:tcPr>
+          <w:p>
+            <w:pPr>
+              <w:spacing w:after="0" w:line="220" w:lineRule="auto"/>
+              <w:jc w:val="center"/>
+            </w:pPr>
+            <w:r>
+              <w:rPr>
+                <w:sz w:val="18"/>
+              </w:rPr>
+              <w:t xml:space="preserve">−50</w:t>
+            </w:r>
+          </w:p>
+        </w:tc>
+        <w:tc>
+          <w:tcPr>
+            <w:tcW w:w="1300" w:type="dxa"/>
+          </w:tcPr>
+          <w:p>
+            <w:pPr>
+              <w:spacing w:after="0" w:line="220" w:lineRule="auto"/>
+              <w:jc w:val="center"/>
+            </w:pPr>
+            <w:r>
+              <w:rPr>
+                <w:sz w:val="18"/>
+              </w:rPr>
+              <w:t xml:space="preserve">68 / 6 / 1</w:t>
+            </w:r>
+          </w:p>
+        </w:tc>
+        <w:tc>
+          <w:tcPr>
+            <w:tcW w:w="900" w:type="dxa"/>
+          </w:tcPr>
+          <w:p>
+            <w:pPr>
+              <w:spacing w:after="0" w:line="220" w:lineRule="auto"/>
+              <w:jc w:val="center"/>
+            </w:pPr>
+            <w:r>
+              <w:rPr>
+                <w:sz w:val="18"/>
+              </w:rPr>
+              <w:t xml:space="preserve">&lt; 0.0001</w:t>
+            </w:r>
+          </w:p>
+        </w:tc>
+        <w:tc>
+          <w:tcPr>
+            <w:tcW w:w="900" w:type="dxa"/>
+          </w:tcPr>
+          <w:p>
+            <w:pPr>
+              <w:spacing w:after="0" w:line="220" w:lineRule="auto"/>
+              <w:jc w:val="center"/>
+            </w:pPr>
+            <w:r>
+              <w:rPr>
+                <w:sz w:val="18"/>
+              </w:rPr>
+              <w:t xml:space="preserve">&lt; 0.0001</w:t>
+            </w:r>
+          </w:p>
+        </w:tc>
+      </w:tr>
+      <w:tr>
+        <w:trPr>
+          <w:cantSplit/>
+        </w:trPr>
+        <w:tc>
+          <w:tcPr>
+            <w:tcW w:w="4060" w:type="dxa"/>
+          </w:tcPr>
+          <w:p>
+            <w:pPr>
+              <w:spacing w:after="0" w:line="220" w:lineRule="auto"/>
+            </w:pPr>
+            <w:r>
+              <w:rPr>
+                <w:sz w:val="18"/>
+              </w:rPr>
+              <w:t xml:space="preserve">Seeds (no deployment) + Closed / Seeds + Closed</w:t>
+            </w:r>
+          </w:p>
+        </w:tc>
+        <w:tc>
+          <w:tcPr>
+            <w:tcW w:w="700" w:type="dxa"/>
+          </w:tcPr>
+          <w:p>
+            <w:pPr>
+              <w:spacing w:after="0" w:line="220" w:lineRule="auto"/>
+              <w:jc w:val="center"/>
+            </w:pPr>
+            <w:r>
+              <w:rPr>
+                <w:sz w:val="18"/>
+              </w:rPr>
+              <w:t xml:space="preserve">150</w:t>
+            </w:r>
+          </w:p>
+        </w:tc>
+        <w:tc>
+          <w:tcPr>
+            <w:tcW w:w="1500" w:type="dxa"/>
+          </w:tcPr>
+          <w:p>
+            <w:pPr>
+              <w:spacing w:after="0" w:line="220" w:lineRule="auto"/>
+              <w:jc w:val="center"/>
+            </w:pPr>
+            <w:r>
+              <w:rPr>
+                <w:sz w:val="18"/>
+              </w:rPr>
+              <w:t xml:space="preserve">+40</w:t>
+            </w:r>
+          </w:p>
+        </w:tc>
+        <w:tc>
+          <w:tcPr>
+            <w:tcW w:w="1300" w:type="dxa"/>
+          </w:tcPr>
+          <w:p>
+            <w:pPr>
+              <w:spacing w:after="0" w:line="220" w:lineRule="auto"/>
+              <w:jc w:val="center"/>
+            </w:pPr>
+            <w:r>
+              <w:rPr>
+                <w:sz w:val="18"/>
+              </w:rPr>
+              <w:t xml:space="preserve">34 / 1 / 115</w:t>
+            </w:r>
+          </w:p>
+        </w:tc>
+        <w:tc>
+          <w:tcPr>
+            <w:tcW w:w="900" w:type="dxa"/>
+          </w:tcPr>
+          <w:p>
+            <w:pPr>
+              <w:spacing w:after="0" w:line="220" w:lineRule="auto"/>
+              <w:jc w:val="center"/>
+            </w:pPr>
+            <w:r>
+              <w:rPr>
+                <w:sz w:val="18"/>
+              </w:rPr>
+              <w:t xml:space="preserve">&lt; 0.0001</w:t>
+            </w:r>
+          </w:p>
+        </w:tc>
+        <w:tc>
+          <w:tcPr>
+            <w:tcW w:w="900" w:type="dxa"/>
+          </w:tcPr>
+          <w:p>
+            <w:pPr>
+              <w:spacing w:after="0" w:line="220" w:lineRule="auto"/>
+              <w:jc w:val="center"/>
+            </w:pPr>
+            <w:r>
+              <w:rPr>
+                <w:sz w:val="18"/>
+              </w:rPr>
+              <w:t xml:space="preserve">&lt; 0.0001</w:t>
+            </w:r>
+          </w:p>
+        </w:tc>
+      </w:tr>
+      <w:tr>
+        <w:trPr>
+          <w:cantSplit/>
+        </w:trPr>
+        <w:tc>
+          <w:tcPr>
+            <w:tcW w:w="4060" w:type="dxa"/>
+          </w:tcPr>
+          <w:p>
+            <w:pPr>
+              <w:spacing w:after="0" w:line="220" w:lineRule="auto"/>
+            </w:pPr>
+            <w:r>
+              <w:rPr>
+                <w:sz w:val="18"/>
+              </w:rPr>
+              <w:t xml:space="preserve">Seeds (no deployment) + Open / Seeds + Closed</w:t>
+            </w:r>
+          </w:p>
+        </w:tc>
+        <w:tc>
+          <w:tcPr>
+            <w:tcW w:w="700" w:type="dxa"/>
+          </w:tcPr>
+          <w:p>
+            <w:pPr>
+              <w:spacing w:after="0" w:line="220" w:lineRule="auto"/>
+              <w:jc w:val="center"/>
+            </w:pPr>
+            <w:r>
+              <w:rPr>
+                <w:sz w:val="18"/>
+              </w:rPr>
+              <w:t xml:space="preserve">150</w:t>
+            </w:r>
+          </w:p>
+        </w:tc>
+        <w:tc>
+          <w:tcPr>
+            <w:tcW w:w="1500" w:type="dxa"/>
+          </w:tcPr>
+          <w:p>
+            <w:pPr>
+              <w:spacing w:after="0" w:line="220" w:lineRule="auto"/>
+              <w:jc w:val="center"/>
+            </w:pPr>
+            <w:r>
+              <w:rPr>
+                <w:sz w:val="18"/>
+              </w:rPr>
+              <w:t xml:space="preserve">−42</w:t>
+            </w:r>
+          </w:p>
+        </w:tc>
+        <w:tc>
+          <w:tcPr>
+            <w:tcW w:w="1300" w:type="dxa"/>
+          </w:tcPr>
+          <w:p>
+            <w:pPr>
+              <w:spacing w:after="0" w:line="220" w:lineRule="auto"/>
+              <w:jc w:val="center"/>
+            </w:pPr>
+            <w:r>
+              <w:rPr>
+                <w:sz w:val="18"/>
+              </w:rPr>
+              <w:t xml:space="preserve">109 / 3 / 38</w:t>
+            </w:r>
+          </w:p>
+        </w:tc>
+        <w:tc>
+          <w:tcPr>
+            <w:tcW w:w="900" w:type="dxa"/>
+          </w:tcPr>
+          <w:p>
+            <w:pPr>
+              <w:spacing w:after="0" w:line="220" w:lineRule="auto"/>
+              <w:jc w:val="center"/>
+            </w:pPr>
+            <w:r>
+              <w:rPr>
+                <w:sz w:val="18"/>
+              </w:rPr>
+              <w:t xml:space="preserve">&lt; 0.0001</w:t>
+            </w:r>
+          </w:p>
+        </w:tc>
+        <w:tc>
+          <w:tcPr>
+            <w:tcW w:w="900" w:type="dxa"/>
+          </w:tcPr>
+          <w:p>
+            <w:pPr>
+              <w:spacing w:after="0" w:line="220" w:lineRule="auto"/>
+              <w:jc w:val="center"/>
+            </w:pPr>
+            <w:r>
+              <w:rPr>
+                <w:sz w:val="18"/>
+              </w:rPr>
+              <w:t xml:space="preserve">&lt; 0.0001</w:t>
+            </w:r>
+          </w:p>
+        </w:tc>
+      </w:tr>
+      <w:tr>
+        <w:trPr>
+          <w:cantSplit/>
+        </w:trPr>
+        <w:tc>
+          <w:tcPr>
+            <w:tcW w:w="4060" w:type="dxa"/>
+          </w:tcPr>
+          <w:p>
+            <w:pPr>
+              <w:spacing w:after="0" w:line="220" w:lineRule="auto"/>
+            </w:pPr>
+            <w:r>
+              <w:rPr>
+                <w:sz w:val="18"/>
+              </w:rPr>
+              <w:t xml:space="preserve">S6–S8 Recorded + Closed / Seeds + Closed</w:t>
+            </w:r>
+          </w:p>
+        </w:tc>
+        <w:tc>
+          <w:tcPr>
+            <w:tcW w:w="700" w:type="dxa"/>
+          </w:tcPr>
+          <w:p>
+            <w:pPr>
+              <w:spacing w:after="0" w:line="220" w:lineRule="auto"/>
+              <w:jc w:val="center"/>
+            </w:pPr>
+            <w:r>
+              <w:rPr>
+                <w:sz w:val="18"/>
+              </w:rPr>
+              <w:t xml:space="preserve">90</w:t>
+            </w:r>
+          </w:p>
+        </w:tc>
+        <w:tc>
+          <w:tcPr>
+            <w:tcW w:w="1500" w:type="dxa"/>
+          </w:tcPr>
+          <w:p>
+            <w:pPr>
+              <w:spacing w:after="0" w:line="220" w:lineRule="auto"/>
+              <w:jc w:val="center"/>
+            </w:pPr>
+            <w:r>
+              <w:rPr>
+                <w:sz w:val="18"/>
+              </w:rPr>
+              <w:t xml:space="preserve">−43</w:t>
+            </w:r>
+          </w:p>
+        </w:tc>
+        <w:tc>
+          <w:tcPr>
+            <w:tcW w:w="1300" w:type="dxa"/>
+          </w:tcPr>
+          <w:p>
+            <w:pPr>
+              <w:spacing w:after="0" w:line="220" w:lineRule="auto"/>
+              <w:jc w:val="center"/>
+            </w:pPr>
+            <w:r>
+              <w:rPr>
+                <w:sz w:val="18"/>
+              </w:rPr>
+              <w:t xml:space="preserve">86 / 2 / 2</w:t>
+            </w:r>
+          </w:p>
+        </w:tc>
+        <w:tc>
+          <w:tcPr>
+            <w:tcW w:w="900" w:type="dxa"/>
+          </w:tcPr>
+          <w:p>
+            <w:pPr>
+              <w:spacing w:after="0" w:line="220" w:lineRule="auto"/>
+              <w:jc w:val="center"/>
+            </w:pPr>
+            <w:r>
+              <w:rPr>
+                <w:sz w:val="18"/>
+              </w:rPr>
+              <w:t xml:space="preserve">&lt; 0.0001</w:t>
+            </w:r>
+          </w:p>
+        </w:tc>
+        <w:tc>
+          <w:tcPr>
+            <w:tcW w:w="900" w:type="dxa"/>
+          </w:tcPr>
+          <w:p>
+            <w:pPr>
+              <w:spacing w:after="0" w:line="220" w:lineRule="auto"/>
+              <w:jc w:val="center"/>
+            </w:pPr>
+            <w:r>
+              <w:rPr>
+                <w:sz w:val="18"/>
+              </w:rPr>
+              <w:t xml:space="preserve">&lt; 0.0001</w:t>
+            </w:r>
+          </w:p>
+        </w:tc>
+      </w:tr>
+      <w:tr>
+        <w:trPr>
+          <w:cantSplit/>
+        </w:trPr>
+        <w:tc>
+          <w:tcPr>
+            <w:tcW w:w="4060" w:type="dxa"/>
+          </w:tcPr>
+          <w:p>
+            <w:pPr>
+              <w:spacing w:after="0" w:line="220" w:lineRule="auto"/>
+            </w:pPr>
+            <w:r>
+              <w:rPr>
+                <w:sz w:val="18"/>
+              </w:rPr>
+              <w:t xml:space="preserve">S6–S8 Seeds + Open / Recorded + Closed</w:t>
+            </w:r>
+          </w:p>
+        </w:tc>
+        <w:tc>
+          <w:tcPr>
+            <w:tcW w:w="700" w:type="dxa"/>
+          </w:tcPr>
+          <w:p>
+            <w:pPr>
+              <w:spacing w:after="0" w:line="220" w:lineRule="auto"/>
+              <w:jc w:val="center"/>
+            </w:pPr>
+            <w:r>
+              <w:rPr>
+                <w:sz w:val="18"/>
+              </w:rPr>
+              <w:t xml:space="preserve">90</w:t>
+            </w:r>
+          </w:p>
+        </w:tc>
+        <w:tc>
+          <w:tcPr>
+            <w:tcW w:w="1500" w:type="dxa"/>
+          </w:tcPr>
+          <w:p>
+            <w:pPr>
+              <w:spacing w:after="0" w:line="220" w:lineRule="auto"/>
+              <w:jc w:val="center"/>
+            </w:pPr>
+            <w:r>
+              <w:rPr>
+                <w:sz w:val="18"/>
+              </w:rPr>
+              <w:t xml:space="preserve">−1</w:t>
+            </w:r>
+          </w:p>
+        </w:tc>
+        <w:tc>
+          <w:tcPr>
+            <w:tcW w:w="1300" w:type="dxa"/>
+          </w:tcPr>
+          <w:p>
+            <w:pPr>
+              <w:spacing w:after="0" w:line="220" w:lineRule="auto"/>
+              <w:jc w:val="center"/>
+            </w:pPr>
+            <w:r>
+              <w:rPr>
+                <w:sz w:val="18"/>
+              </w:rPr>
+              <w:t xml:space="preserve">49 / 1 / 40</w:t>
+            </w:r>
+          </w:p>
+        </w:tc>
+        <w:tc>
+          <w:tcPr>
+            <w:tcW w:w="900" w:type="dxa"/>
+          </w:tcPr>
+          <w:p>
+            <w:pPr>
+              <w:spacing w:after="0" w:line="220" w:lineRule="auto"/>
+              <w:jc w:val="center"/>
+            </w:pPr>
+            <w:r>
+              <w:rPr>
+                <w:sz w:val="18"/>
+              </w:rPr>
+              <w:t xml:space="preserve">0.89</w:t>
+            </w:r>
+          </w:p>
+        </w:tc>
+        <w:tc>
+          <w:tcPr>
+            <w:tcW w:w="900" w:type="dxa"/>
+          </w:tcPr>
+          <w:p>
+            <w:pPr>
+              <w:spacing w:after="0" w:line="220" w:lineRule="auto"/>
+              <w:jc w:val="center"/>
+            </w:pPr>
+            <w:r>
+              <w:rPr>
+                <w:sz w:val="18"/>
+              </w:rPr>
+              <w:t xml:space="preserve">0.89</w:t>
+            </w:r>
+          </w:p>
+        </w:tc>
+      </w:tr>
+      <w:tr>
+        <w:trPr>
+          <w:cantSplit/>
+        </w:trPr>
+        <w:tc>
+          <w:tcPr>
+            <w:tcW w:w="4060" w:type="dxa"/>
+          </w:tcPr>
+          <w:p>
+            <w:pPr>
+              <w:spacing w:after="0" w:line="220" w:lineRule="auto"/>
+            </w:pPr>
+            <w:r>
+              <w:rPr>
+                <w:sz w:val="18"/>
+              </w:rPr>
+              <w:t xml:space="preserve">S6–S8 Recorded + Open / Recorded + Closed</w:t>
+            </w:r>
+          </w:p>
+        </w:tc>
+        <w:tc>
+          <w:tcPr>
+            <w:tcW w:w="700" w:type="dxa"/>
+          </w:tcPr>
+          <w:p>
+            <w:pPr>
+              <w:spacing w:after="0" w:line="220" w:lineRule="auto"/>
+              <w:jc w:val="center"/>
+            </w:pPr>
+            <w:r>
+              <w:rPr>
+                <w:sz w:val="18"/>
+              </w:rPr>
+              <w:t xml:space="preserve">90</w:t>
+            </w:r>
+          </w:p>
+        </w:tc>
+        <w:tc>
+          <w:tcPr>
+            <w:tcW w:w="1500" w:type="dxa"/>
+          </w:tcPr>
+          <w:p>
+            <w:pPr>
+              <w:spacing w:after="0" w:line="220" w:lineRule="auto"/>
+              <w:jc w:val="center"/>
+            </w:pPr>
+            <w:r>
+              <w:rPr>
+                <w:sz w:val="18"/>
+              </w:rPr>
+              <w:t xml:space="preserve">−28</w:t>
+            </w:r>
+          </w:p>
+        </w:tc>
+        <w:tc>
+          <w:tcPr>
+            <w:tcW w:w="1300" w:type="dxa"/>
+          </w:tcPr>
+          <w:p>
+            <w:pPr>
+              <w:spacing w:after="0" w:line="220" w:lineRule="auto"/>
+              <w:jc w:val="center"/>
+            </w:pPr>
+            <w:r>
+              <w:rPr>
+                <w:sz w:val="18"/>
+              </w:rPr>
+              <w:t xml:space="preserve">75 / 2 / 13</w:t>
+            </w:r>
+          </w:p>
+        </w:tc>
+        <w:tc>
+          <w:tcPr>
+            <w:tcW w:w="900" w:type="dxa"/>
+          </w:tcPr>
+          <w:p>
+            <w:pPr>
+              <w:spacing w:after="0" w:line="220" w:lineRule="auto"/>
+              <w:jc w:val="center"/>
+            </w:pPr>
+            <w:r>
+              <w:rPr>
+                <w:sz w:val="18"/>
+              </w:rPr>
+              <w:t xml:space="preserve">&lt; 0.0001</w:t>
+            </w:r>
+          </w:p>
+        </w:tc>
+        <w:tc>
+          <w:tcPr>
+            <w:tcW w:w="900" w:type="dxa"/>
+          </w:tcPr>
+          <w:p>
+            <w:pPr>
+              <w:spacing w:after="0" w:line="220" w:lineRule="auto"/>
+              <w:jc w:val="center"/>
+            </w:pPr>
+            <w:r>
+              <w:rPr>
+                <w:sz w:val="18"/>
+              </w:rPr>
+              <w:t xml:space="preserve">&lt; 0.0001</w:t>
+            </w:r>
+          </w:p>
+        </w:tc>
+      </w:tr>
+      <w:tr>
+        <w:trPr>
+          <w:cantSplit/>
+        </w:trPr>
+        <w:tc>
+          <w:tcPr>
+            <w:tcW w:w="4060" w:type="dxa"/>
+          </w:tcPr>
+          <w:p>
+            <w:pPr>
+              <w:spacing w:after="0" w:line="220" w:lineRule="auto"/>
+            </w:pPr>
+            <w:r>
+              <w:rPr>
+                <w:sz w:val="18"/>
+              </w:rPr>
+              <w:t xml:space="preserve">S1–S5 control Recorded + Open / Recorded + Closed</w:t>
+            </w:r>
+          </w:p>
+        </w:tc>
+        <w:tc>
+          <w:tcPr>
+            <w:tcW w:w="700" w:type="dxa"/>
+          </w:tcPr>
+          <w:p>
+            <w:pPr>
+              <w:spacing w:after="0" w:line="220" w:lineRule="auto"/>
+              <w:jc w:val="center"/>
+            </w:pPr>
+            <w:r>
+              <w:rPr>
+                <w:sz w:val="18"/>
+              </w:rPr>
+              <w:t xml:space="preserve">75</w:t>
+            </w:r>
+          </w:p>
+        </w:tc>
+        <w:tc>
+          <w:tcPr>
+            <w:tcW w:w="1500" w:type="dxa"/>
+          </w:tcPr>
+          <w:p>
+            <w:pPr>
+              <w:spacing w:after="0" w:line="220" w:lineRule="auto"/>
+              <w:jc w:val="center"/>
+            </w:pPr>
+            <w:r>
+              <w:rPr>
+                <w:sz w:val="18"/>
+              </w:rPr>
+              <w:t xml:space="preserve">−35</w:t>
+            </w:r>
+          </w:p>
+        </w:tc>
+        <w:tc>
+          <w:tcPr>
+            <w:tcW w:w="1300" w:type="dxa"/>
+          </w:tcPr>
+          <w:p>
+            <w:pPr>
+              <w:spacing w:after="0" w:line="220" w:lineRule="auto"/>
+              <w:jc w:val="center"/>
+            </w:pPr>
+            <w:r>
+              <w:rPr>
+                <w:sz w:val="18"/>
+              </w:rPr>
+              <w:t xml:space="preserve">62 / 6 / 7</w:t>
+            </w:r>
+          </w:p>
+        </w:tc>
+        <w:tc>
+          <w:tcPr>
+            <w:tcW w:w="900" w:type="dxa"/>
+          </w:tcPr>
+          <w:p>
+            <w:pPr>
+              <w:spacing w:after="0" w:line="220" w:lineRule="auto"/>
+              <w:jc w:val="center"/>
+            </w:pPr>
+            <w:r>
+              <w:rPr>
+                <w:sz w:val="18"/>
+              </w:rPr>
+              <w:t xml:space="preserve">0.0001</w:t>
+            </w:r>
+          </w:p>
+        </w:tc>
+        <w:tc>
+          <w:tcPr>
+            <w:tcW w:w="900" w:type="dxa"/>
+          </w:tcPr>
+          <w:p>
+            <w:pPr>
+              <w:spacing w:after="0" w:line="220" w:lineRule="auto"/>
+              <w:jc w:val="center"/>
+            </w:pPr>
+            <w:r>
+              <w:rPr>
+                <w:sz w:val="18"/>
+              </w:rPr>
+              <w:t xml:space="preserve">0.0007</w:t>
+            </w:r>
+          </w:p>
+        </w:tc>
+      </w:tr>
+      <w:tr>
+        <w:trPr>
+          <w:cantSplit/>
+        </w:trPr>
+        <w:tc>
+          <w:tcPr>
+            <w:tcW w:w="4060" w:type="dxa"/>
+          </w:tcPr>
+          <w:p>
+            <w:pPr>
+              <w:spacing w:after="0" w:line="220" w:lineRule="auto"/>
+            </w:pPr>
+            <w:r>
+              <w:rPr>
+                <w:sz w:val="18"/>
+              </w:rPr>
+              <w:t xml:space="preserve">S6–S8 Recorded + Open / Seeds + Open</w:t>
+            </w:r>
+          </w:p>
+        </w:tc>
+        <w:tc>
+          <w:tcPr>
+            <w:tcW w:w="700" w:type="dxa"/>
+          </w:tcPr>
+          <w:p>
+            <w:pPr>
+              <w:spacing w:after="0" w:line="220" w:lineRule="auto"/>
+              <w:jc w:val="center"/>
+            </w:pPr>
+            <w:r>
+              <w:rPr>
+                <w:sz w:val="18"/>
+              </w:rPr>
+              <w:t xml:space="preserve">90</w:t>
+            </w:r>
+          </w:p>
+        </w:tc>
+        <w:tc>
+          <w:tcPr>
+            <w:tcW w:w="1500" w:type="dxa"/>
+          </w:tcPr>
+          <w:p>
+            <w:pPr>
+              <w:spacing w:after="0" w:line="220" w:lineRule="auto"/>
+              <w:jc w:val="center"/>
+            </w:pPr>
+            <w:r>
+              <w:rPr>
+                <w:sz w:val="18"/>
+              </w:rPr>
+              <w:t xml:space="preserve">−27</w:t>
+            </w:r>
+          </w:p>
+        </w:tc>
+        <w:tc>
+          <w:tcPr>
+            <w:tcW w:w="1300" w:type="dxa"/>
+          </w:tcPr>
+          <w:p>
+            <w:pPr>
+              <w:spacing w:after="0" w:line="220" w:lineRule="auto"/>
+              <w:jc w:val="center"/>
+            </w:pPr>
+            <w:r>
+              <w:rPr>
+                <w:sz w:val="18"/>
+              </w:rPr>
+              <w:t xml:space="preserve">57 / 1 / 32</w:t>
+            </w:r>
+          </w:p>
+        </w:tc>
+        <w:tc>
+          <w:tcPr>
+            <w:tcW w:w="900" w:type="dxa"/>
+          </w:tcPr>
+          <w:p>
+            <w:pPr>
+              <w:spacing w:after="0" w:line="220" w:lineRule="auto"/>
+              <w:jc w:val="center"/>
+            </w:pPr>
+            <w:r>
+              <w:rPr>
+                <w:sz w:val="18"/>
+              </w:rPr>
+              <w:t xml:space="preserve">0.0005</w:t>
+            </w:r>
+          </w:p>
+        </w:tc>
+        <w:tc>
+          <w:tcPr>
+            <w:tcW w:w="900" w:type="dxa"/>
+          </w:tcPr>
+          <w:p>
+            <w:pPr>
+              <w:spacing w:after="0" w:line="220" w:lineRule="auto"/>
+              <w:jc w:val="center"/>
+            </w:pPr>
+            <w:r>
+              <w:rPr>
+                <w:sz w:val="18"/>
+              </w:rPr>
+              <w:t xml:space="preserve">0.003</w:t>
+            </w:r>
+          </w:p>
+        </w:tc>
+      </w:tr>
+    </w:tbl>
+    <w:p>
+      <w:pPr>
+        <w:rPr/>
+      </w:pPr>
+      <w:r>
+        <w:t xml:space="preserve"/>
       </w:r>
     </w:p>
     <w:p>

</xml_diff>

<commit_message>
Holm p values as a column of Tables VII and VIII (Table S4 removed from the supplement), V-A statistics sentence, repository footnote (GODA), future work sentence with expert review
Co-Authored-By: Claude Fable 5.1 <noreply@anthropic.com>
Claude-Session: https://claude.ai/code/session_01SpJY1eTMuWxnLRbAr2HJ4M
</commit_message>
<xml_diff>
--- a/02_Article/ieee_systems/DisasterAware_Supplementary_Material.docx
+++ b/02_Article/ieee_systems/DisasterAware_Supplementary_Material.docx
@@ -4024,4056 +4024,6 @@
         <w:rPr/>
       </w:pPr>
       <w:r>
-        <w:t xml:space="preserve">Paired tests for the rows of Tables VII and VIII</w:t>
-      </w:r>
-    </w:p>
-    <w:p>
-      <w:pPr>
-        <w:rPr/>
-      </w:pPr>
-      <w:r>
-        <w:t xml:space="preserve">Each row of Tables VII and VIII compares a configuration with its reference on the same worlds. The table lists the number of worlds, the mean relative change of burned area, the worlds in which the configuration burns less, the same or more area, the two-sided paired sign-flip p value on the mean difference (one million random sign assignments) and the Holm step-down adjustment over all 36 rows. A p value below 0.0001 means that no random sign assignment reached the observed difference.</w:t>
-      </w:r>
-    </w:p>
-    <w:p>
-      <w:pPr>
-        <w:pStyle w:val="Caption"/>
-      </w:pPr>
-      <w:r>
-        <w:t>Table S</w:t>
-      </w:r>
-      <w:fldSimple w:instr=" SEQ VODASupTable \* ARABIC ">
-        <w:r>
-          <w:t>4</w:t>
-        </w:r>
-      </w:fldSimple>
-      <w:r>
-        <w:t xml:space="preserve">. Paired sign-flip tests and Holm adjustment for Tables VII and VIII</w:t>
-      </w:r>
-    </w:p>
-    <w:tbl>
-      <w:tblPr>
-        <w:tblW w:w="9360" w:type="dxa"/>
-        <w:tblBorders>
-          <w:top w:val="single" w:sz="4" w:space="0" w:color="B7B7B7"/>
-          <w:left w:val="single" w:sz="4" w:space="0" w:color="B7B7B7"/>
-          <w:bottom w:val="single" w:sz="4" w:space="0" w:color="B7B7B7"/>
-          <w:right w:val="single" w:sz="4" w:space="0" w:color="B7B7B7"/>
-          <w:insideH w:val="single" w:sz="4" w:space="0" w:color="B7B7B7"/>
-          <w:insideV w:val="single" w:sz="4" w:space="0" w:color="B7B7B7"/>
-        </w:tblBorders>
-        <w:tblLayout w:type="fixed"/>
-        <w:tblCellMar>
-          <w:top w:w="35" w:type="dxa"/>
-          <w:left w:w="30" w:type="dxa"/>
-          <w:bottom w:w="35" w:type="dxa"/>
-          <w:right w:w="30" w:type="dxa"/>
-        </w:tblCellMar>
-        <w:tblLook w:val="04A0" w:firstRow="1" w:lastRow="0" w:firstColumn="1" w:lastColumn="0" w:noHBand="0" w:noVBand="1"/>
-      </w:tblPr>
-      <w:tblGrid>
-        <w:gridCol w:w="4060"/>
-        <w:gridCol w:w="700"/>
-        <w:gridCol w:w="1500"/>
-        <w:gridCol w:w="1300"/>
-        <w:gridCol w:w="900"/>
-        <w:gridCol w:w="900"/>
-      </w:tblGrid>
-      <w:tr>
-        <w:trPr>
-          <w:cantSplit/>
-        </w:trPr>
-        <w:tc>
-          <w:tcPr>
-            <w:tcW w:w="4060" w:type="dxa"/>
-            <w:shd w:val="clear" w:color="auto" w:fill="E7E6E6"/>
-          </w:tcPr>
-          <w:p>
-            <w:pPr>
-              <w:spacing w:after="0" w:line="220" w:lineRule="auto"/>
-            </w:pPr>
-            <w:r>
-              <w:rPr>
-                <w:b/>
-                <w:sz w:val="18"/>
-              </w:rPr>
-              <w:t xml:space="preserve">Row of Table VII or VIII</w:t>
-            </w:r>
-          </w:p>
-        </w:tc>
-        <w:tc>
-          <w:tcPr>
-            <w:tcW w:w="700" w:type="dxa"/>
-            <w:shd w:val="clear" w:color="auto" w:fill="E7E6E6"/>
-          </w:tcPr>
-          <w:p>
-            <w:pPr>
-              <w:spacing w:after="0" w:line="220" w:lineRule="auto"/>
-              <w:jc w:val="center"/>
-            </w:pPr>
-            <w:r>
-              <w:rPr>
-                <w:b/>
-                <w:sz w:val="18"/>
-              </w:rPr>
-              <w:t xml:space="preserve">n</w:t>
-            </w:r>
-          </w:p>
-        </w:tc>
-        <w:tc>
-          <w:tcPr>
-            <w:tcW w:w="1500" w:type="dxa"/>
-            <w:shd w:val="clear" w:color="auto" w:fill="E7E6E6"/>
-          </w:tcPr>
-          <w:p>
-            <w:pPr>
-              <w:spacing w:after="0" w:line="220" w:lineRule="auto"/>
-              <w:jc w:val="center"/>
-            </w:pPr>
-            <w:r>
-              <w:rPr>
-                <w:b/>
-                <w:sz w:val="18"/>
-              </w:rPr>
-              <w:t xml:space="preserve">Δ burned area (%)</w:t>
-            </w:r>
-          </w:p>
-        </w:tc>
-        <w:tc>
-          <w:tcPr>
-            <w:tcW w:w="1300" w:type="dxa"/>
-            <w:shd w:val="clear" w:color="auto" w:fill="E7E6E6"/>
-          </w:tcPr>
-          <w:p>
-            <w:pPr>
-              <w:spacing w:after="0" w:line="220" w:lineRule="auto"/>
-              <w:jc w:val="center"/>
-            </w:pPr>
-            <w:r>
-              <w:rPr>
-                <w:b/>
-                <w:sz w:val="18"/>
-              </w:rPr>
-              <w:t xml:space="preserve">better / tie / worse</w:t>
-            </w:r>
-          </w:p>
-        </w:tc>
-        <w:tc>
-          <w:tcPr>
-            <w:tcW w:w="900" w:type="dxa"/>
-            <w:shd w:val="clear" w:color="auto" w:fill="E7E6E6"/>
-          </w:tcPr>
-          <w:p>
-            <w:pPr>
-              <w:spacing w:after="0" w:line="220" w:lineRule="auto"/>
-              <w:jc w:val="center"/>
-            </w:pPr>
-            <w:r>
-              <w:rPr>
-                <w:b/>
-                <w:sz w:val="18"/>
-              </w:rPr>
-              <w:t xml:space="preserve">p</w:t>
-            </w:r>
-          </w:p>
-        </w:tc>
-        <w:tc>
-          <w:tcPr>
-            <w:tcW w:w="900" w:type="dxa"/>
-            <w:shd w:val="clear" w:color="auto" w:fill="E7E6E6"/>
-          </w:tcPr>
-          <w:p>
-            <w:pPr>
-              <w:spacing w:after="0" w:line="220" w:lineRule="auto"/>
-              <w:jc w:val="center"/>
-            </w:pPr>
-            <w:r>
-              <w:rPr>
-                <w:b/>
-                <w:sz w:val="18"/>
-              </w:rPr>
-              <w:t xml:space="preserve">p, Holm</w:t>
-            </w:r>
-          </w:p>
-        </w:tc>
-      </w:tr>
-      <w:tr>
-        <w:trPr>
-          <w:cantSplit/>
-        </w:trPr>
-        <w:tc>
-          <w:tcPr>
-            <w:tcW w:w="9360" w:type="dxa"/>
-            <w:gridSpan w:val="6"/>
-          </w:tcPr>
-          <w:p>
-            <w:pPr>
-              <w:spacing w:after="0" w:line="220" w:lineRule="auto"/>
-            </w:pPr>
-            <w:r>
-              <w:rPr>
-                <w:b/>
-                <w:sz w:val="18"/>
-              </w:rPr>
-              <w:t xml:space="preserve">Table VII</w:t>
-            </w:r>
-          </w:p>
-        </w:tc>
-      </w:tr>
-      <w:tr>
-        <w:trPr>
-          <w:cantSplit/>
-        </w:trPr>
-        <w:tc>
-          <w:tcPr>
-            <w:tcW w:w="4060" w:type="dxa"/>
-          </w:tcPr>
-          <w:p>
-            <w:pPr>
-              <w:spacing w:after="0" w:line="220" w:lineRule="auto"/>
-            </w:pPr>
-            <w:r>
-              <w:rPr>
-                <w:sz w:val="18"/>
-              </w:rPr>
-              <w:t xml:space="preserve">Random, one</w:t>
-            </w:r>
-          </w:p>
-        </w:tc>
-        <w:tc>
-          <w:tcPr>
-            <w:tcW w:w="700" w:type="dxa"/>
-          </w:tcPr>
-          <w:p>
-            <w:pPr>
-              <w:spacing w:after="0" w:line="220" w:lineRule="auto"/>
-              <w:jc w:val="center"/>
-            </w:pPr>
-            <w:r>
-              <w:rPr>
-                <w:sz w:val="18"/>
-              </w:rPr>
-              <w:t xml:space="preserve">150</w:t>
-            </w:r>
-          </w:p>
-        </w:tc>
-        <w:tc>
-          <w:tcPr>
-            <w:tcW w:w="1500" w:type="dxa"/>
-          </w:tcPr>
-          <w:p>
-            <w:pPr>
-              <w:spacing w:after="0" w:line="220" w:lineRule="auto"/>
-              <w:jc w:val="center"/>
-            </w:pPr>
-            <w:r>
-              <w:rPr>
-                <w:sz w:val="18"/>
-              </w:rPr>
-              <w:t xml:space="preserve">−9</w:t>
-            </w:r>
-          </w:p>
-        </w:tc>
-        <w:tc>
-          <w:tcPr>
-            <w:tcW w:w="1300" w:type="dxa"/>
-          </w:tcPr>
-          <w:p>
-            <w:pPr>
-              <w:spacing w:after="0" w:line="220" w:lineRule="auto"/>
-              <w:jc w:val="center"/>
-            </w:pPr>
-            <w:r>
-              <w:rPr>
-                <w:sz w:val="18"/>
-              </w:rPr>
-              <w:t xml:space="preserve">93 / 17 / 40</w:t>
-            </w:r>
-          </w:p>
-        </w:tc>
-        <w:tc>
-          <w:tcPr>
-            <w:tcW w:w="900" w:type="dxa"/>
-          </w:tcPr>
-          <w:p>
-            <w:pPr>
-              <w:spacing w:after="0" w:line="220" w:lineRule="auto"/>
-              <w:jc w:val="center"/>
-            </w:pPr>
-            <w:r>
-              <w:rPr>
-                <w:sz w:val="18"/>
-              </w:rPr>
-              <w:t xml:space="preserve">0.04</w:t>
-            </w:r>
-          </w:p>
-        </w:tc>
-        <w:tc>
-          <w:tcPr>
-            <w:tcW w:w="900" w:type="dxa"/>
-          </w:tcPr>
-          <w:p>
-            <w:pPr>
-              <w:spacing w:after="0" w:line="220" w:lineRule="auto"/>
-              <w:jc w:val="center"/>
-            </w:pPr>
-            <w:r>
-              <w:rPr>
-                <w:sz w:val="18"/>
-              </w:rPr>
-              <w:t xml:space="preserve">0.10</w:t>
-            </w:r>
-          </w:p>
-        </w:tc>
-      </w:tr>
-      <w:tr>
-        <w:trPr>
-          <w:cantSplit/>
-        </w:trPr>
-        <w:tc>
-          <w:tcPr>
-            <w:tcW w:w="4060" w:type="dxa"/>
-          </w:tcPr>
-          <w:p>
-            <w:pPr>
-              <w:spacing w:after="0" w:line="220" w:lineRule="auto"/>
-            </w:pPr>
-            <w:r>
-              <w:rPr>
-                <w:sz w:val="18"/>
-              </w:rPr>
-              <w:t xml:space="preserve">Random, one, ungated</w:t>
-            </w:r>
-          </w:p>
-        </w:tc>
-        <w:tc>
-          <w:tcPr>
-            <w:tcW w:w="700" w:type="dxa"/>
-          </w:tcPr>
-          <w:p>
-            <w:pPr>
-              <w:spacing w:after="0" w:line="220" w:lineRule="auto"/>
-              <w:jc w:val="center"/>
-            </w:pPr>
-            <w:r>
-              <w:rPr>
-                <w:sz w:val="18"/>
-              </w:rPr>
-              <w:t xml:space="preserve">150</w:t>
-            </w:r>
-          </w:p>
-        </w:tc>
-        <w:tc>
-          <w:tcPr>
-            <w:tcW w:w="1500" w:type="dxa"/>
-          </w:tcPr>
-          <w:p>
-            <w:pPr>
-              <w:spacing w:after="0" w:line="220" w:lineRule="auto"/>
-              <w:jc w:val="center"/>
-            </w:pPr>
-            <w:r>
-              <w:rPr>
-                <w:sz w:val="18"/>
-              </w:rPr>
-              <w:t xml:space="preserve">−10</w:t>
-            </w:r>
-          </w:p>
-        </w:tc>
-        <w:tc>
-          <w:tcPr>
-            <w:tcW w:w="1300" w:type="dxa"/>
-          </w:tcPr>
-          <w:p>
-            <w:pPr>
-              <w:spacing w:after="0" w:line="220" w:lineRule="auto"/>
-              <w:jc w:val="center"/>
-            </w:pPr>
-            <w:r>
-              <w:rPr>
-                <w:sz w:val="18"/>
-              </w:rPr>
-              <w:t xml:space="preserve">86 / 15 / 49</w:t>
-            </w:r>
-          </w:p>
-        </w:tc>
-        <w:tc>
-          <w:tcPr>
-            <w:tcW w:w="900" w:type="dxa"/>
-          </w:tcPr>
-          <w:p>
-            <w:pPr>
-              <w:spacing w:after="0" w:line="220" w:lineRule="auto"/>
-              <w:jc w:val="center"/>
-            </w:pPr>
-            <w:r>
-              <w:rPr>
-                <w:sz w:val="18"/>
-              </w:rPr>
-              <w:t xml:space="preserve">0.03</w:t>
-            </w:r>
-          </w:p>
-        </w:tc>
-        <w:tc>
-          <w:tcPr>
-            <w:tcW w:w="900" w:type="dxa"/>
-          </w:tcPr>
-          <w:p>
-            <w:pPr>
-              <w:spacing w:after="0" w:line="220" w:lineRule="auto"/>
-              <w:jc w:val="center"/>
-            </w:pPr>
-            <w:r>
-              <w:rPr>
-                <w:sz w:val="18"/>
-              </w:rPr>
-              <w:t xml:space="preserve">0.10</w:t>
-            </w:r>
-          </w:p>
-        </w:tc>
-      </w:tr>
-      <w:tr>
-        <w:trPr>
-          <w:cantSplit/>
-        </w:trPr>
-        <w:tc>
-          <w:tcPr>
-            <w:tcW w:w="4060" w:type="dxa"/>
-          </w:tcPr>
-          <w:p>
-            <w:pPr>
-              <w:spacing w:after="0" w:line="220" w:lineRule="auto"/>
-            </w:pPr>
-            <w:r>
-              <w:rPr>
-                <w:sz w:val="18"/>
-              </w:rPr>
-              <w:t xml:space="preserve">LLM, one</w:t>
-            </w:r>
-          </w:p>
-        </w:tc>
-        <w:tc>
-          <w:tcPr>
-            <w:tcW w:w="700" w:type="dxa"/>
-          </w:tcPr>
-          <w:p>
-            <w:pPr>
-              <w:spacing w:after="0" w:line="220" w:lineRule="auto"/>
-              <w:jc w:val="center"/>
-            </w:pPr>
-            <w:r>
-              <w:rPr>
-                <w:sz w:val="18"/>
-              </w:rPr>
-              <w:t xml:space="preserve">150</w:t>
-            </w:r>
-          </w:p>
-        </w:tc>
-        <w:tc>
-          <w:tcPr>
-            <w:tcW w:w="1500" w:type="dxa"/>
-          </w:tcPr>
-          <w:p>
-            <w:pPr>
-              <w:spacing w:after="0" w:line="220" w:lineRule="auto"/>
-              <w:jc w:val="center"/>
-            </w:pPr>
-            <w:r>
-              <w:rPr>
-                <w:sz w:val="18"/>
-              </w:rPr>
-              <w:t xml:space="preserve">−28</w:t>
-            </w:r>
-          </w:p>
-        </w:tc>
-        <w:tc>
-          <w:tcPr>
-            <w:tcW w:w="1300" w:type="dxa"/>
-          </w:tcPr>
-          <w:p>
-            <w:pPr>
-              <w:spacing w:after="0" w:line="220" w:lineRule="auto"/>
-              <w:jc w:val="center"/>
-            </w:pPr>
-            <w:r>
-              <w:rPr>
-                <w:sz w:val="18"/>
-              </w:rPr>
-              <w:t xml:space="preserve">119 / 15 / 16</w:t>
-            </w:r>
-          </w:p>
-        </w:tc>
-        <w:tc>
-          <w:tcPr>
-            <w:tcW w:w="900" w:type="dxa"/>
-          </w:tcPr>
-          <w:p>
-            <w:pPr>
-              <w:spacing w:after="0" w:line="220" w:lineRule="auto"/>
-              <w:jc w:val="center"/>
-            </w:pPr>
-            <w:r>
-              <w:rPr>
-                <w:sz w:val="18"/>
-              </w:rPr>
-              <w:t xml:space="preserve">&lt; 0.0001</w:t>
-            </w:r>
-          </w:p>
-        </w:tc>
-        <w:tc>
-          <w:tcPr>
-            <w:tcW w:w="900" w:type="dxa"/>
-          </w:tcPr>
-          <w:p>
-            <w:pPr>
-              <w:spacing w:after="0" w:line="220" w:lineRule="auto"/>
-              <w:jc w:val="center"/>
-            </w:pPr>
-            <w:r>
-              <w:rPr>
-                <w:sz w:val="18"/>
-              </w:rPr>
-              <w:t xml:space="preserve">&lt; 0.0001</w:t>
-            </w:r>
-          </w:p>
-        </w:tc>
-      </w:tr>
-      <w:tr>
-        <w:trPr>
-          <w:cantSplit/>
-        </w:trPr>
-        <w:tc>
-          <w:tcPr>
-            <w:tcW w:w="4060" w:type="dxa"/>
-          </w:tcPr>
-          <w:p>
-            <w:pPr>
-              <w:spacing w:after="0" w:line="220" w:lineRule="auto"/>
-            </w:pPr>
-            <w:r>
-              <w:rPr>
-                <w:sz w:val="18"/>
-              </w:rPr>
-              <w:t xml:space="preserve">LLM, one, ungated</w:t>
-            </w:r>
-          </w:p>
-        </w:tc>
-        <w:tc>
-          <w:tcPr>
-            <w:tcW w:w="700" w:type="dxa"/>
-          </w:tcPr>
-          <w:p>
-            <w:pPr>
-              <w:spacing w:after="0" w:line="220" w:lineRule="auto"/>
-              <w:jc w:val="center"/>
-            </w:pPr>
-            <w:r>
-              <w:rPr>
-                <w:sz w:val="18"/>
-              </w:rPr>
-              <w:t xml:space="preserve">150</w:t>
-            </w:r>
-          </w:p>
-        </w:tc>
-        <w:tc>
-          <w:tcPr>
-            <w:tcW w:w="1500" w:type="dxa"/>
-          </w:tcPr>
-          <w:p>
-            <w:pPr>
-              <w:spacing w:after="0" w:line="220" w:lineRule="auto"/>
-              <w:jc w:val="center"/>
-            </w:pPr>
-            <w:r>
-              <w:rPr>
-                <w:sz w:val="18"/>
-              </w:rPr>
-              <w:t xml:space="preserve">−25</w:t>
-            </w:r>
-          </w:p>
-        </w:tc>
-        <w:tc>
-          <w:tcPr>
-            <w:tcW w:w="1300" w:type="dxa"/>
-          </w:tcPr>
-          <w:p>
-            <w:pPr>
-              <w:spacing w:after="0" w:line="220" w:lineRule="auto"/>
-              <w:jc w:val="center"/>
-            </w:pPr>
-            <w:r>
-              <w:rPr>
-                <w:sz w:val="18"/>
-              </w:rPr>
-              <w:t xml:space="preserve">109 / 13 / 28</w:t>
-            </w:r>
-          </w:p>
-        </w:tc>
-        <w:tc>
-          <w:tcPr>
-            <w:tcW w:w="900" w:type="dxa"/>
-          </w:tcPr>
-          <w:p>
-            <w:pPr>
-              <w:spacing w:after="0" w:line="220" w:lineRule="auto"/>
-              <w:jc w:val="center"/>
-            </w:pPr>
-            <w:r>
-              <w:rPr>
-                <w:sz w:val="18"/>
-              </w:rPr>
-              <w:t xml:space="preserve">&lt; 0.0001</w:t>
-            </w:r>
-          </w:p>
-        </w:tc>
-        <w:tc>
-          <w:tcPr>
-            <w:tcW w:w="900" w:type="dxa"/>
-          </w:tcPr>
-          <w:p>
-            <w:pPr>
-              <w:spacing w:after="0" w:line="220" w:lineRule="auto"/>
-              <w:jc w:val="center"/>
-            </w:pPr>
-            <w:r>
-              <w:rPr>
-                <w:sz w:val="18"/>
-              </w:rPr>
-              <w:t xml:space="preserve">&lt; 0.0001</w:t>
-            </w:r>
-          </w:p>
-        </w:tc>
-      </w:tr>
-      <w:tr>
-        <w:trPr>
-          <w:cantSplit/>
-        </w:trPr>
-        <w:tc>
-          <w:tcPr>
-            <w:tcW w:w="4060" w:type="dxa"/>
-          </w:tcPr>
-          <w:p>
-            <w:pPr>
-              <w:spacing w:after="0" w:line="220" w:lineRule="auto"/>
-            </w:pPr>
-            <w:r>
-              <w:rPr>
-                <w:sz w:val="18"/>
-              </w:rPr>
-              <w:t xml:space="preserve">Random, small</w:t>
-            </w:r>
-          </w:p>
-        </w:tc>
-        <w:tc>
-          <w:tcPr>
-            <w:tcW w:w="700" w:type="dxa"/>
-          </w:tcPr>
-          <w:p>
-            <w:pPr>
-              <w:spacing w:after="0" w:line="220" w:lineRule="auto"/>
-              <w:jc w:val="center"/>
-            </w:pPr>
-            <w:r>
-              <w:rPr>
-                <w:sz w:val="18"/>
-              </w:rPr>
-              <w:t xml:space="preserve">150</w:t>
-            </w:r>
-          </w:p>
-        </w:tc>
-        <w:tc>
-          <w:tcPr>
-            <w:tcW w:w="1500" w:type="dxa"/>
-          </w:tcPr>
-          <w:p>
-            <w:pPr>
-              <w:spacing w:after="0" w:line="220" w:lineRule="auto"/>
-              <w:jc w:val="center"/>
-            </w:pPr>
-            <w:r>
-              <w:rPr>
-                <w:sz w:val="18"/>
-              </w:rPr>
-              <w:t xml:space="preserve">−32</w:t>
-            </w:r>
-          </w:p>
-        </w:tc>
-        <w:tc>
-          <w:tcPr>
-            <w:tcW w:w="1300" w:type="dxa"/>
-          </w:tcPr>
-          <w:p>
-            <w:pPr>
-              <w:spacing w:after="0" w:line="220" w:lineRule="auto"/>
-              <w:jc w:val="center"/>
-            </w:pPr>
-            <w:r>
-              <w:rPr>
-                <w:sz w:val="18"/>
-              </w:rPr>
-              <w:t xml:space="preserve">114 / 14 / 22</w:t>
-            </w:r>
-          </w:p>
-        </w:tc>
-        <w:tc>
-          <w:tcPr>
-            <w:tcW w:w="900" w:type="dxa"/>
-          </w:tcPr>
-          <w:p>
-            <w:pPr>
-              <w:spacing w:after="0" w:line="220" w:lineRule="auto"/>
-              <w:jc w:val="center"/>
-            </w:pPr>
-            <w:r>
-              <w:rPr>
-                <w:sz w:val="18"/>
-              </w:rPr>
-              <w:t xml:space="preserve">&lt; 0.0001</w:t>
-            </w:r>
-          </w:p>
-        </w:tc>
-        <w:tc>
-          <w:tcPr>
-            <w:tcW w:w="900" w:type="dxa"/>
-          </w:tcPr>
-          <w:p>
-            <w:pPr>
-              <w:spacing w:after="0" w:line="220" w:lineRule="auto"/>
-              <w:jc w:val="center"/>
-            </w:pPr>
-            <w:r>
-              <w:rPr>
-                <w:sz w:val="18"/>
-              </w:rPr>
-              <w:t xml:space="preserve">&lt; 0.0001</w:t>
-            </w:r>
-          </w:p>
-        </w:tc>
-      </w:tr>
-      <w:tr>
-        <w:trPr>
-          <w:cantSplit/>
-        </w:trPr>
-        <w:tc>
-          <w:tcPr>
-            <w:tcW w:w="4060" w:type="dxa"/>
-          </w:tcPr>
-          <w:p>
-            <w:pPr>
-              <w:spacing w:after="0" w:line="220" w:lineRule="auto"/>
-            </w:pPr>
-            <w:r>
-              <w:rPr>
-                <w:sz w:val="18"/>
-              </w:rPr>
-              <w:t xml:space="preserve">LLM, candidates only</w:t>
-            </w:r>
-          </w:p>
-        </w:tc>
-        <w:tc>
-          <w:tcPr>
-            <w:tcW w:w="700" w:type="dxa"/>
-          </w:tcPr>
-          <w:p>
-            <w:pPr>
-              <w:spacing w:after="0" w:line="220" w:lineRule="auto"/>
-              <w:jc w:val="center"/>
-            </w:pPr>
-            <w:r>
-              <w:rPr>
-                <w:sz w:val="18"/>
-              </w:rPr>
-              <w:t xml:space="preserve">150</w:t>
-            </w:r>
-          </w:p>
-        </w:tc>
-        <w:tc>
-          <w:tcPr>
-            <w:tcW w:w="1500" w:type="dxa"/>
-          </w:tcPr>
-          <w:p>
-            <w:pPr>
-              <w:spacing w:after="0" w:line="220" w:lineRule="auto"/>
-              <w:jc w:val="center"/>
-            </w:pPr>
-            <w:r>
-              <w:rPr>
-                <w:sz w:val="18"/>
-              </w:rPr>
-              <w:t xml:space="preserve">−45</w:t>
-            </w:r>
-          </w:p>
-        </w:tc>
-        <w:tc>
-          <w:tcPr>
-            <w:tcW w:w="1300" w:type="dxa"/>
-          </w:tcPr>
-          <w:p>
-            <w:pPr>
-              <w:spacing w:after="0" w:line="220" w:lineRule="auto"/>
-              <w:jc w:val="center"/>
-            </w:pPr>
-            <w:r>
-              <w:rPr>
-                <w:sz w:val="18"/>
-              </w:rPr>
-              <w:t xml:space="preserve">124 / 10 / 16</w:t>
-            </w:r>
-          </w:p>
-        </w:tc>
-        <w:tc>
-          <w:tcPr>
-            <w:tcW w:w="900" w:type="dxa"/>
-          </w:tcPr>
-          <w:p>
-            <w:pPr>
-              <w:spacing w:after="0" w:line="220" w:lineRule="auto"/>
-              <w:jc w:val="center"/>
-            </w:pPr>
-            <w:r>
-              <w:rPr>
-                <w:sz w:val="18"/>
-              </w:rPr>
-              <w:t xml:space="preserve">&lt; 0.0001</w:t>
-            </w:r>
-          </w:p>
-        </w:tc>
-        <w:tc>
-          <w:tcPr>
-            <w:tcW w:w="900" w:type="dxa"/>
-          </w:tcPr>
-          <w:p>
-            <w:pPr>
-              <w:spacing w:after="0" w:line="220" w:lineRule="auto"/>
-              <w:jc w:val="center"/>
-            </w:pPr>
-            <w:r>
-              <w:rPr>
-                <w:sz w:val="18"/>
-              </w:rPr>
-              <w:t xml:space="preserve">&lt; 0.0001</w:t>
-            </w:r>
-          </w:p>
-        </w:tc>
-      </w:tr>
-      <w:tr>
-        <w:trPr>
-          <w:cantSplit/>
-        </w:trPr>
-        <w:tc>
-          <w:tcPr>
-            <w:tcW w:w="4060" w:type="dxa"/>
-          </w:tcPr>
-          <w:p>
-            <w:pPr>
-              <w:spacing w:after="0" w:line="220" w:lineRule="auto"/>
-            </w:pPr>
-            <w:r>
-              <w:rPr>
-                <w:sz w:val="18"/>
-              </w:rPr>
-              <w:t xml:space="preserve">Random, full</w:t>
-            </w:r>
-          </w:p>
-        </w:tc>
-        <w:tc>
-          <w:tcPr>
-            <w:tcW w:w="700" w:type="dxa"/>
-          </w:tcPr>
-          <w:p>
-            <w:pPr>
-              <w:spacing w:after="0" w:line="220" w:lineRule="auto"/>
-              <w:jc w:val="center"/>
-            </w:pPr>
-            <w:r>
-              <w:rPr>
-                <w:sz w:val="18"/>
-              </w:rPr>
-              <w:t xml:space="preserve">150</w:t>
-            </w:r>
-          </w:p>
-        </w:tc>
-        <w:tc>
-          <w:tcPr>
-            <w:tcW w:w="1500" w:type="dxa"/>
-          </w:tcPr>
-          <w:p>
-            <w:pPr>
-              <w:spacing w:after="0" w:line="220" w:lineRule="auto"/>
-              <w:jc w:val="center"/>
-            </w:pPr>
-            <w:r>
-              <w:rPr>
-                <w:sz w:val="18"/>
-              </w:rPr>
-              <w:t xml:space="preserve">−46</w:t>
-            </w:r>
-          </w:p>
-        </w:tc>
-        <w:tc>
-          <w:tcPr>
-            <w:tcW w:w="1300" w:type="dxa"/>
-          </w:tcPr>
-          <w:p>
-            <w:pPr>
-              <w:spacing w:after="0" w:line="220" w:lineRule="auto"/>
-              <w:jc w:val="center"/>
-            </w:pPr>
-            <w:r>
-              <w:rPr>
-                <w:sz w:val="18"/>
-              </w:rPr>
-              <w:t xml:space="preserve">128 / 13 / 9</w:t>
-            </w:r>
-          </w:p>
-        </w:tc>
-        <w:tc>
-          <w:tcPr>
-            <w:tcW w:w="900" w:type="dxa"/>
-          </w:tcPr>
-          <w:p>
-            <w:pPr>
-              <w:spacing w:after="0" w:line="220" w:lineRule="auto"/>
-              <w:jc w:val="center"/>
-            </w:pPr>
-            <w:r>
-              <w:rPr>
-                <w:sz w:val="18"/>
-              </w:rPr>
-              <w:t xml:space="preserve">&lt; 0.0001</w:t>
-            </w:r>
-          </w:p>
-        </w:tc>
-        <w:tc>
-          <w:tcPr>
-            <w:tcW w:w="900" w:type="dxa"/>
-          </w:tcPr>
-          <w:p>
-            <w:pPr>
-              <w:spacing w:after="0" w:line="220" w:lineRule="auto"/>
-              <w:jc w:val="center"/>
-            </w:pPr>
-            <w:r>
-              <w:rPr>
-                <w:sz w:val="18"/>
-              </w:rPr>
-              <w:t xml:space="preserve">&lt; 0.0001</w:t>
-            </w:r>
-          </w:p>
-        </w:tc>
-      </w:tr>
-      <w:tr>
-        <w:trPr>
-          <w:cantSplit/>
-        </w:trPr>
-        <w:tc>
-          <w:tcPr>
-            <w:tcW w:w="4060" w:type="dxa"/>
-          </w:tcPr>
-          <w:p>
-            <w:pPr>
-              <w:spacing w:after="0" w:line="220" w:lineRule="auto"/>
-            </w:pPr>
-            <w:r>
-              <w:rPr>
-                <w:sz w:val="18"/>
-              </w:rPr>
-              <w:t xml:space="preserve">Random, families only</w:t>
-            </w:r>
-          </w:p>
-        </w:tc>
-        <w:tc>
-          <w:tcPr>
-            <w:tcW w:w="700" w:type="dxa"/>
-          </w:tcPr>
-          <w:p>
-            <w:pPr>
-              <w:spacing w:after="0" w:line="220" w:lineRule="auto"/>
-              <w:jc w:val="center"/>
-            </w:pPr>
-            <w:r>
-              <w:rPr>
-                <w:sz w:val="18"/>
-              </w:rPr>
-              <w:t xml:space="preserve">150</w:t>
-            </w:r>
-          </w:p>
-        </w:tc>
-        <w:tc>
-          <w:tcPr>
-            <w:tcW w:w="1500" w:type="dxa"/>
-          </w:tcPr>
-          <w:p>
-            <w:pPr>
-              <w:spacing w:after="0" w:line="220" w:lineRule="auto"/>
-              <w:jc w:val="center"/>
-            </w:pPr>
-            <w:r>
-              <w:rPr>
-                <w:sz w:val="18"/>
-              </w:rPr>
-              <w:t xml:space="preserve">−41</w:t>
-            </w:r>
-          </w:p>
-        </w:tc>
-        <w:tc>
-          <w:tcPr>
-            <w:tcW w:w="1300" w:type="dxa"/>
-          </w:tcPr>
-          <w:p>
-            <w:pPr>
-              <w:spacing w:after="0" w:line="220" w:lineRule="auto"/>
-              <w:jc w:val="center"/>
-            </w:pPr>
-            <w:r>
-              <w:rPr>
-                <w:sz w:val="18"/>
-              </w:rPr>
-              <w:t xml:space="preserve">131 / 11 / 8</w:t>
-            </w:r>
-          </w:p>
-        </w:tc>
-        <w:tc>
-          <w:tcPr>
-            <w:tcW w:w="900" w:type="dxa"/>
-          </w:tcPr>
-          <w:p>
-            <w:pPr>
-              <w:spacing w:after="0" w:line="220" w:lineRule="auto"/>
-              <w:jc w:val="center"/>
-            </w:pPr>
-            <w:r>
-              <w:rPr>
-                <w:sz w:val="18"/>
-              </w:rPr>
-              <w:t xml:space="preserve">&lt; 0.0001</w:t>
-            </w:r>
-          </w:p>
-        </w:tc>
-        <w:tc>
-          <w:tcPr>
-            <w:tcW w:w="900" w:type="dxa"/>
-          </w:tcPr>
-          <w:p>
-            <w:pPr>
-              <w:spacing w:after="0" w:line="220" w:lineRule="auto"/>
-              <w:jc w:val="center"/>
-            </w:pPr>
-            <w:r>
-              <w:rPr>
-                <w:sz w:val="18"/>
-              </w:rPr>
-              <w:t xml:space="preserve">&lt; 0.0001</w:t>
-            </w:r>
-          </w:p>
-        </w:tc>
-      </w:tr>
-      <w:tr>
-        <w:trPr>
-          <w:cantSplit/>
-        </w:trPr>
-        <w:tc>
-          <w:tcPr>
-            <w:tcW w:w="4060" w:type="dxa"/>
-          </w:tcPr>
-          <w:p>
-            <w:pPr>
-              <w:spacing w:after="0" w:line="220" w:lineRule="auto"/>
-            </w:pPr>
-            <w:r>
-              <w:rPr>
-                <w:sz w:val="18"/>
-              </w:rPr>
-              <w:t xml:space="preserve">Random, with variations</w:t>
-            </w:r>
-          </w:p>
-        </w:tc>
-        <w:tc>
-          <w:tcPr>
-            <w:tcW w:w="700" w:type="dxa"/>
-          </w:tcPr>
-          <w:p>
-            <w:pPr>
-              <w:spacing w:after="0" w:line="220" w:lineRule="auto"/>
-              <w:jc w:val="center"/>
-            </w:pPr>
-            <w:r>
-              <w:rPr>
-                <w:sz w:val="18"/>
-              </w:rPr>
-              <w:t xml:space="preserve">150</w:t>
-            </w:r>
-          </w:p>
-        </w:tc>
-        <w:tc>
-          <w:tcPr>
-            <w:tcW w:w="1500" w:type="dxa"/>
-          </w:tcPr>
-          <w:p>
-            <w:pPr>
-              <w:spacing w:after="0" w:line="220" w:lineRule="auto"/>
-              <w:jc w:val="center"/>
-            </w:pPr>
-            <w:r>
-              <w:rPr>
-                <w:sz w:val="18"/>
-              </w:rPr>
-              <w:t xml:space="preserve">−34</w:t>
-            </w:r>
-          </w:p>
-        </w:tc>
-        <w:tc>
-          <w:tcPr>
-            <w:tcW w:w="1300" w:type="dxa"/>
-          </w:tcPr>
-          <w:p>
-            <w:pPr>
-              <w:spacing w:after="0" w:line="220" w:lineRule="auto"/>
-              <w:jc w:val="center"/>
-            </w:pPr>
-            <w:r>
-              <w:rPr>
-                <w:sz w:val="18"/>
-              </w:rPr>
-              <w:t xml:space="preserve">121 / 14 / 15</w:t>
-            </w:r>
-          </w:p>
-        </w:tc>
-        <w:tc>
-          <w:tcPr>
-            <w:tcW w:w="900" w:type="dxa"/>
-          </w:tcPr>
-          <w:p>
-            <w:pPr>
-              <w:spacing w:after="0" w:line="220" w:lineRule="auto"/>
-              <w:jc w:val="center"/>
-            </w:pPr>
-            <w:r>
-              <w:rPr>
-                <w:sz w:val="18"/>
-              </w:rPr>
-              <w:t xml:space="preserve">&lt; 0.0001</w:t>
-            </w:r>
-          </w:p>
-        </w:tc>
-        <w:tc>
-          <w:tcPr>
-            <w:tcW w:w="900" w:type="dxa"/>
-          </w:tcPr>
-          <w:p>
-            <w:pPr>
-              <w:spacing w:after="0" w:line="220" w:lineRule="auto"/>
-              <w:jc w:val="center"/>
-            </w:pPr>
-            <w:r>
-              <w:rPr>
-                <w:sz w:val="18"/>
-              </w:rPr>
-              <w:t xml:space="preserve">&lt; 0.0001</w:t>
-            </w:r>
-          </w:p>
-        </w:tc>
-      </w:tr>
-      <w:tr>
-        <w:trPr>
-          <w:cantSplit/>
-        </w:trPr>
-        <w:tc>
-          <w:tcPr>
-            <w:tcW w:w="4060" w:type="dxa"/>
-          </w:tcPr>
-          <w:p>
-            <w:pPr>
-              <w:spacing w:after="0" w:line="220" w:lineRule="auto"/>
-            </w:pPr>
-            <w:r>
-              <w:rPr>
-                <w:sz w:val="18"/>
-              </w:rPr>
-              <w:t xml:space="preserve">Hand-written seeds, with variations</w:t>
-            </w:r>
-          </w:p>
-        </w:tc>
-        <w:tc>
-          <w:tcPr>
-            <w:tcW w:w="700" w:type="dxa"/>
-          </w:tcPr>
-          <w:p>
-            <w:pPr>
-              <w:spacing w:after="0" w:line="220" w:lineRule="auto"/>
-              <w:jc w:val="center"/>
-            </w:pPr>
-            <w:r>
-              <w:rPr>
-                <w:sz w:val="18"/>
-              </w:rPr>
-              <w:t xml:space="preserve">150</w:t>
-            </w:r>
-          </w:p>
-        </w:tc>
-        <w:tc>
-          <w:tcPr>
-            <w:tcW w:w="1500" w:type="dxa"/>
-          </w:tcPr>
-          <w:p>
-            <w:pPr>
-              <w:spacing w:after="0" w:line="220" w:lineRule="auto"/>
-              <w:jc w:val="center"/>
-            </w:pPr>
-            <w:r>
-              <w:rPr>
-                <w:sz w:val="18"/>
-              </w:rPr>
-              <w:t xml:space="preserve">−31</w:t>
-            </w:r>
-          </w:p>
-        </w:tc>
-        <w:tc>
-          <w:tcPr>
-            <w:tcW w:w="1300" w:type="dxa"/>
-          </w:tcPr>
-          <w:p>
-            <w:pPr>
-              <w:spacing w:after="0" w:line="220" w:lineRule="auto"/>
-              <w:jc w:val="center"/>
-            </w:pPr>
-            <w:r>
-              <w:rPr>
-                <w:sz w:val="18"/>
-              </w:rPr>
-              <w:t xml:space="preserve">109 / 11 / 30</w:t>
-            </w:r>
-          </w:p>
-        </w:tc>
-        <w:tc>
-          <w:tcPr>
-            <w:tcW w:w="900" w:type="dxa"/>
-          </w:tcPr>
-          <w:p>
-            <w:pPr>
-              <w:spacing w:after="0" w:line="220" w:lineRule="auto"/>
-              <w:jc w:val="center"/>
-            </w:pPr>
-            <w:r>
-              <w:rPr>
-                <w:sz w:val="18"/>
-              </w:rPr>
-              <w:t xml:space="preserve">&lt; 0.0001</w:t>
-            </w:r>
-          </w:p>
-        </w:tc>
-        <w:tc>
-          <w:tcPr>
-            <w:tcW w:w="900" w:type="dxa"/>
-          </w:tcPr>
-          <w:p>
-            <w:pPr>
-              <w:spacing w:after="0" w:line="220" w:lineRule="auto"/>
-              <w:jc w:val="center"/>
-            </w:pPr>
-            <w:r>
-              <w:rPr>
-                <w:sz w:val="18"/>
-              </w:rPr>
-              <w:t xml:space="preserve">&lt; 0.0001</w:t>
-            </w:r>
-          </w:p>
-        </w:tc>
-      </w:tr>
-      <w:tr>
-        <w:trPr>
-          <w:cantSplit/>
-        </w:trPr>
-        <w:tc>
-          <w:tcPr>
-            <w:tcW w:w="4060" w:type="dxa"/>
-          </w:tcPr>
-          <w:p>
-            <w:pPr>
-              <w:spacing w:after="0" w:line="220" w:lineRule="auto"/>
-            </w:pPr>
-            <w:r>
-              <w:rPr>
-                <w:sz w:val="18"/>
-              </w:rPr>
-              <w:t xml:space="preserve">Evolutionary search</w:t>
-            </w:r>
-          </w:p>
-        </w:tc>
-        <w:tc>
-          <w:tcPr>
-            <w:tcW w:w="700" w:type="dxa"/>
-          </w:tcPr>
-          <w:p>
-            <w:pPr>
-              <w:spacing w:after="0" w:line="220" w:lineRule="auto"/>
-              <w:jc w:val="center"/>
-            </w:pPr>
-            <w:r>
-              <w:rPr>
-                <w:sz w:val="18"/>
-              </w:rPr>
-              <w:t xml:space="preserve">150</w:t>
-            </w:r>
-          </w:p>
-        </w:tc>
-        <w:tc>
-          <w:tcPr>
-            <w:tcW w:w="1500" w:type="dxa"/>
-          </w:tcPr>
-          <w:p>
-            <w:pPr>
-              <w:spacing w:after="0" w:line="220" w:lineRule="auto"/>
-              <w:jc w:val="center"/>
-            </w:pPr>
-            <w:r>
-              <w:rPr>
-                <w:sz w:val="18"/>
-              </w:rPr>
-              <w:t xml:space="preserve">−49</w:t>
-            </w:r>
-          </w:p>
-        </w:tc>
-        <w:tc>
-          <w:tcPr>
-            <w:tcW w:w="1300" w:type="dxa"/>
-          </w:tcPr>
-          <w:p>
-            <w:pPr>
-              <w:spacing w:after="0" w:line="220" w:lineRule="auto"/>
-              <w:jc w:val="center"/>
-            </w:pPr>
-            <w:r>
-              <w:rPr>
-                <w:sz w:val="18"/>
-              </w:rPr>
-              <w:t xml:space="preserve">127 / 11 / 12</w:t>
-            </w:r>
-          </w:p>
-        </w:tc>
-        <w:tc>
-          <w:tcPr>
-            <w:tcW w:w="900" w:type="dxa"/>
-          </w:tcPr>
-          <w:p>
-            <w:pPr>
-              <w:spacing w:after="0" w:line="220" w:lineRule="auto"/>
-              <w:jc w:val="center"/>
-            </w:pPr>
-            <w:r>
-              <w:rPr>
-                <w:sz w:val="18"/>
-              </w:rPr>
-              <w:t xml:space="preserve">&lt; 0.0001</w:t>
-            </w:r>
-          </w:p>
-        </w:tc>
-        <w:tc>
-          <w:tcPr>
-            <w:tcW w:w="900" w:type="dxa"/>
-          </w:tcPr>
-          <w:p>
-            <w:pPr>
-              <w:spacing w:after="0" w:line="220" w:lineRule="auto"/>
-              <w:jc w:val="center"/>
-            </w:pPr>
-            <w:r>
-              <w:rPr>
-                <w:sz w:val="18"/>
-              </w:rPr>
-              <w:t xml:space="preserve">&lt; 0.0001</w:t>
-            </w:r>
-          </w:p>
-        </w:tc>
-      </w:tr>
-      <w:tr>
-        <w:trPr>
-          <w:cantSplit/>
-        </w:trPr>
-        <w:tc>
-          <w:tcPr>
-            <w:tcW w:w="4060" w:type="dxa"/>
-          </w:tcPr>
-          <w:p>
-            <w:pPr>
-              <w:spacing w:after="0" w:line="220" w:lineRule="auto"/>
-            </w:pPr>
-            <w:r>
-              <w:rPr>
-                <w:sz w:val="18"/>
-              </w:rPr>
-              <w:t xml:space="preserve">GODA</w:t>
-            </w:r>
-          </w:p>
-        </w:tc>
-        <w:tc>
-          <w:tcPr>
-            <w:tcW w:w="700" w:type="dxa"/>
-          </w:tcPr>
-          <w:p>
-            <w:pPr>
-              <w:spacing w:after="0" w:line="220" w:lineRule="auto"/>
-              <w:jc w:val="center"/>
-            </w:pPr>
-            <w:r>
-              <w:rPr>
-                <w:sz w:val="18"/>
-              </w:rPr>
-              <w:t xml:space="preserve">150</w:t>
-            </w:r>
-          </w:p>
-        </w:tc>
-        <w:tc>
-          <w:tcPr>
-            <w:tcW w:w="1500" w:type="dxa"/>
-          </w:tcPr>
-          <w:p>
-            <w:pPr>
-              <w:spacing w:after="0" w:line="220" w:lineRule="auto"/>
-              <w:jc w:val="center"/>
-            </w:pPr>
-            <w:r>
-              <w:rPr>
-                <w:sz w:val="18"/>
-              </w:rPr>
-              <w:t xml:space="preserve">−61</w:t>
-            </w:r>
-          </w:p>
-        </w:tc>
-        <w:tc>
-          <w:tcPr>
-            <w:tcW w:w="1300" w:type="dxa"/>
-          </w:tcPr>
-          <w:p>
-            <w:pPr>
-              <w:spacing w:after="0" w:line="220" w:lineRule="auto"/>
-              <w:jc w:val="center"/>
-            </w:pPr>
-            <w:r>
-              <w:rPr>
-                <w:sz w:val="18"/>
-              </w:rPr>
-              <w:t xml:space="preserve">131 / 10 / 9</w:t>
-            </w:r>
-          </w:p>
-        </w:tc>
-        <w:tc>
-          <w:tcPr>
-            <w:tcW w:w="900" w:type="dxa"/>
-          </w:tcPr>
-          <w:p>
-            <w:pPr>
-              <w:spacing w:after="0" w:line="220" w:lineRule="auto"/>
-              <w:jc w:val="center"/>
-            </w:pPr>
-            <w:r>
-              <w:rPr>
-                <w:sz w:val="18"/>
-              </w:rPr>
-              <w:t xml:space="preserve">&lt; 0.0001</w:t>
-            </w:r>
-          </w:p>
-        </w:tc>
-        <w:tc>
-          <w:tcPr>
-            <w:tcW w:w="900" w:type="dxa"/>
-          </w:tcPr>
-          <w:p>
-            <w:pPr>
-              <w:spacing w:after="0" w:line="220" w:lineRule="auto"/>
-              <w:jc w:val="center"/>
-            </w:pPr>
-            <w:r>
-              <w:rPr>
-                <w:sz w:val="18"/>
-              </w:rPr>
-              <w:t xml:space="preserve">&lt; 0.0001</w:t>
-            </w:r>
-          </w:p>
-        </w:tc>
-      </w:tr>
-      <w:tr>
-        <w:trPr>
-          <w:cantSplit/>
-        </w:trPr>
-        <w:tc>
-          <w:tcPr>
-            <w:tcW w:w="4060" w:type="dxa"/>
-          </w:tcPr>
-          <w:p>
-            <w:pPr>
-              <w:spacing w:after="0" w:line="220" w:lineRule="auto"/>
-            </w:pPr>
-            <w:r>
-              <w:rPr>
-                <w:sz w:val="18"/>
-              </w:rPr>
-              <w:t xml:space="preserve">GODA repeat</w:t>
-            </w:r>
-          </w:p>
-        </w:tc>
-        <w:tc>
-          <w:tcPr>
-            <w:tcW w:w="700" w:type="dxa"/>
-          </w:tcPr>
-          <w:p>
-            <w:pPr>
-              <w:spacing w:after="0" w:line="220" w:lineRule="auto"/>
-              <w:jc w:val="center"/>
-            </w:pPr>
-            <w:r>
-              <w:rPr>
-                <w:sz w:val="18"/>
-              </w:rPr>
-              <w:t xml:space="preserve">150</w:t>
-            </w:r>
-          </w:p>
-        </w:tc>
-        <w:tc>
-          <w:tcPr>
-            <w:tcW w:w="1500" w:type="dxa"/>
-          </w:tcPr>
-          <w:p>
-            <w:pPr>
-              <w:spacing w:after="0" w:line="220" w:lineRule="auto"/>
-              <w:jc w:val="center"/>
-            </w:pPr>
-            <w:r>
-              <w:rPr>
-                <w:sz w:val="18"/>
-              </w:rPr>
-              <w:t xml:space="preserve">−57</w:t>
-            </w:r>
-          </w:p>
-        </w:tc>
-        <w:tc>
-          <w:tcPr>
-            <w:tcW w:w="1300" w:type="dxa"/>
-          </w:tcPr>
-          <w:p>
-            <w:pPr>
-              <w:spacing w:after="0" w:line="220" w:lineRule="auto"/>
-              <w:jc w:val="center"/>
-            </w:pPr>
-            <w:r>
-              <w:rPr>
-                <w:sz w:val="18"/>
-              </w:rPr>
-              <w:t xml:space="preserve">130 / 9 / 11</w:t>
-            </w:r>
-          </w:p>
-        </w:tc>
-        <w:tc>
-          <w:tcPr>
-            <w:tcW w:w="900" w:type="dxa"/>
-          </w:tcPr>
-          <w:p>
-            <w:pPr>
-              <w:spacing w:after="0" w:line="220" w:lineRule="auto"/>
-              <w:jc w:val="center"/>
-            </w:pPr>
-            <w:r>
-              <w:rPr>
-                <w:sz w:val="18"/>
-              </w:rPr>
-              <w:t xml:space="preserve">&lt; 0.0001</w:t>
-            </w:r>
-          </w:p>
-        </w:tc>
-        <w:tc>
-          <w:tcPr>
-            <w:tcW w:w="900" w:type="dxa"/>
-          </w:tcPr>
-          <w:p>
-            <w:pPr>
-              <w:spacing w:after="0" w:line="220" w:lineRule="auto"/>
-              <w:jc w:val="center"/>
-            </w:pPr>
-            <w:r>
-              <w:rPr>
-                <w:sz w:val="18"/>
-              </w:rPr>
-              <w:t xml:space="preserve">&lt; 0.0001</w:t>
-            </w:r>
-          </w:p>
-        </w:tc>
-      </w:tr>
-      <w:tr>
-        <w:trPr>
-          <w:cantSplit/>
-        </w:trPr>
-        <w:tc>
-          <w:tcPr>
-            <w:tcW w:w="4060" w:type="dxa"/>
-          </w:tcPr>
-          <w:p>
-            <w:pPr>
-              <w:spacing w:after="0" w:line="220" w:lineRule="auto"/>
-            </w:pPr>
-            <w:r>
-              <w:rPr>
-                <w:sz w:val="18"/>
-              </w:rPr>
-              <w:t xml:space="preserve">Independent gates</w:t>
-            </w:r>
-          </w:p>
-        </w:tc>
-        <w:tc>
-          <w:tcPr>
-            <w:tcW w:w="700" w:type="dxa"/>
-          </w:tcPr>
-          <w:p>
-            <w:pPr>
-              <w:spacing w:after="0" w:line="220" w:lineRule="auto"/>
-              <w:jc w:val="center"/>
-            </w:pPr>
-            <w:r>
-              <w:rPr>
-                <w:sz w:val="18"/>
-              </w:rPr>
-              <w:t xml:space="preserve">150</w:t>
-            </w:r>
-          </w:p>
-        </w:tc>
-        <w:tc>
-          <w:tcPr>
-            <w:tcW w:w="1500" w:type="dxa"/>
-          </w:tcPr>
-          <w:p>
-            <w:pPr>
-              <w:spacing w:after="0" w:line="220" w:lineRule="auto"/>
-              <w:jc w:val="center"/>
-            </w:pPr>
-            <w:r>
-              <w:rPr>
-                <w:sz w:val="18"/>
-              </w:rPr>
-              <w:t xml:space="preserve">−54</w:t>
-            </w:r>
-          </w:p>
-        </w:tc>
-        <w:tc>
-          <w:tcPr>
-            <w:tcW w:w="1300" w:type="dxa"/>
-          </w:tcPr>
-          <w:p>
-            <w:pPr>
-              <w:spacing w:after="0" w:line="220" w:lineRule="auto"/>
-              <w:jc w:val="center"/>
-            </w:pPr>
-            <w:r>
-              <w:rPr>
-                <w:sz w:val="18"/>
-              </w:rPr>
-              <w:t xml:space="preserve">127 / 10 / 13</w:t>
-            </w:r>
-          </w:p>
-        </w:tc>
-        <w:tc>
-          <w:tcPr>
-            <w:tcW w:w="900" w:type="dxa"/>
-          </w:tcPr>
-          <w:p>
-            <w:pPr>
-              <w:spacing w:after="0" w:line="220" w:lineRule="auto"/>
-              <w:jc w:val="center"/>
-            </w:pPr>
-            <w:r>
-              <w:rPr>
-                <w:sz w:val="18"/>
-              </w:rPr>
-              <w:t xml:space="preserve">&lt; 0.0001</w:t>
-            </w:r>
-          </w:p>
-        </w:tc>
-        <w:tc>
-          <w:tcPr>
-            <w:tcW w:w="900" w:type="dxa"/>
-          </w:tcPr>
-          <w:p>
-            <w:pPr>
-              <w:spacing w:after="0" w:line="220" w:lineRule="auto"/>
-              <w:jc w:val="center"/>
-            </w:pPr>
-            <w:r>
-              <w:rPr>
-                <w:sz w:val="18"/>
-              </w:rPr>
-              <w:t xml:space="preserve">&lt; 0.0001</w:t>
-            </w:r>
-          </w:p>
-        </w:tc>
-      </w:tr>
-      <w:tr>
-        <w:trPr>
-          <w:cantSplit/>
-        </w:trPr>
-        <w:tc>
-          <w:tcPr>
-            <w:tcW w:w="4060" w:type="dxa"/>
-          </w:tcPr>
-          <w:p>
-            <w:pPr>
-              <w:spacing w:after="0" w:line="220" w:lineRule="auto"/>
-            </w:pPr>
-            <w:r>
-              <w:rPr>
-                <w:sz w:val="18"/>
-              </w:rPr>
-              <w:t xml:space="preserve">Suppression intensity error (replay)</w:t>
-            </w:r>
-          </w:p>
-        </w:tc>
-        <w:tc>
-          <w:tcPr>
-            <w:tcW w:w="700" w:type="dxa"/>
-          </w:tcPr>
-          <w:p>
-            <w:pPr>
-              <w:spacing w:after="0" w:line="220" w:lineRule="auto"/>
-              <w:jc w:val="center"/>
-            </w:pPr>
-            <w:r>
-              <w:rPr>
-                <w:sz w:val="18"/>
-              </w:rPr>
-              <w:t xml:space="preserve">150</w:t>
-            </w:r>
-          </w:p>
-        </w:tc>
-        <w:tc>
-          <w:tcPr>
-            <w:tcW w:w="1500" w:type="dxa"/>
-          </w:tcPr>
-          <w:p>
-            <w:pPr>
-              <w:spacing w:after="0" w:line="220" w:lineRule="auto"/>
-              <w:jc w:val="center"/>
-            </w:pPr>
-            <w:r>
-              <w:rPr>
-                <w:sz w:val="18"/>
-              </w:rPr>
-              <w:t xml:space="preserve">−56</w:t>
-            </w:r>
-          </w:p>
-        </w:tc>
-        <w:tc>
-          <w:tcPr>
-            <w:tcW w:w="1300" w:type="dxa"/>
-          </w:tcPr>
-          <w:p>
-            <w:pPr>
-              <w:spacing w:after="0" w:line="220" w:lineRule="auto"/>
-              <w:jc w:val="center"/>
-            </w:pPr>
-            <w:r>
-              <w:rPr>
-                <w:sz w:val="18"/>
-              </w:rPr>
-              <w:t xml:space="preserve">127 / 15 / 8</w:t>
-            </w:r>
-          </w:p>
-        </w:tc>
-        <w:tc>
-          <w:tcPr>
-            <w:tcW w:w="900" w:type="dxa"/>
-          </w:tcPr>
-          <w:p>
-            <w:pPr>
-              <w:spacing w:after="0" w:line="220" w:lineRule="auto"/>
-              <w:jc w:val="center"/>
-            </w:pPr>
-            <w:r>
-              <w:rPr>
-                <w:sz w:val="18"/>
-              </w:rPr>
-              <w:t xml:space="preserve">&lt; 0.0001</w:t>
-            </w:r>
-          </w:p>
-        </w:tc>
-        <w:tc>
-          <w:tcPr>
-            <w:tcW w:w="900" w:type="dxa"/>
-          </w:tcPr>
-          <w:p>
-            <w:pPr>
-              <w:spacing w:after="0" w:line="220" w:lineRule="auto"/>
-              <w:jc w:val="center"/>
-            </w:pPr>
-            <w:r>
-              <w:rPr>
-                <w:sz w:val="18"/>
-              </w:rPr>
-              <w:t xml:space="preserve">&lt; 0.0001</w:t>
-            </w:r>
-          </w:p>
-        </w:tc>
-      </w:tr>
-      <w:tr>
-        <w:trPr>
-          <w:cantSplit/>
-        </w:trPr>
-        <w:tc>
-          <w:tcPr>
-            <w:tcW w:w="4060" w:type="dxa"/>
-          </w:tcPr>
-          <w:p>
-            <w:pPr>
-              <w:spacing w:after="0" w:line="220" w:lineRule="auto"/>
-            </w:pPr>
-            <w:r>
-              <w:rPr>
-                <w:sz w:val="18"/>
-              </w:rPr>
-              <w:t xml:space="preserve">Travel-effect decay error (replay)</w:t>
-            </w:r>
-          </w:p>
-        </w:tc>
-        <w:tc>
-          <w:tcPr>
-            <w:tcW w:w="700" w:type="dxa"/>
-          </w:tcPr>
-          <w:p>
-            <w:pPr>
-              <w:spacing w:after="0" w:line="220" w:lineRule="auto"/>
-              <w:jc w:val="center"/>
-            </w:pPr>
-            <w:r>
-              <w:rPr>
-                <w:sz w:val="18"/>
-              </w:rPr>
-              <w:t xml:space="preserve">150</w:t>
-            </w:r>
-          </w:p>
-        </w:tc>
-        <w:tc>
-          <w:tcPr>
-            <w:tcW w:w="1500" w:type="dxa"/>
-          </w:tcPr>
-          <w:p>
-            <w:pPr>
-              <w:spacing w:after="0" w:line="220" w:lineRule="auto"/>
-              <w:jc w:val="center"/>
-            </w:pPr>
-            <w:r>
-              <w:rPr>
-                <w:sz w:val="18"/>
-              </w:rPr>
-              <w:t xml:space="preserve">−54</w:t>
-            </w:r>
-          </w:p>
-        </w:tc>
-        <w:tc>
-          <w:tcPr>
-            <w:tcW w:w="1300" w:type="dxa"/>
-          </w:tcPr>
-          <w:p>
-            <w:pPr>
-              <w:spacing w:after="0" w:line="220" w:lineRule="auto"/>
-              <w:jc w:val="center"/>
-            </w:pPr>
-            <w:r>
-              <w:rPr>
-                <w:sz w:val="18"/>
-              </w:rPr>
-              <w:t xml:space="preserve">127 / 15 / 8</w:t>
-            </w:r>
-          </w:p>
-        </w:tc>
-        <w:tc>
-          <w:tcPr>
-            <w:tcW w:w="900" w:type="dxa"/>
-          </w:tcPr>
-          <w:p>
-            <w:pPr>
-              <w:spacing w:after="0" w:line="220" w:lineRule="auto"/>
-              <w:jc w:val="center"/>
-            </w:pPr>
-            <w:r>
-              <w:rPr>
-                <w:sz w:val="18"/>
-              </w:rPr>
-              <w:t xml:space="preserve">&lt; 0.0001</w:t>
-            </w:r>
-          </w:p>
-        </w:tc>
-        <w:tc>
-          <w:tcPr>
-            <w:tcW w:w="900" w:type="dxa"/>
-          </w:tcPr>
-          <w:p>
-            <w:pPr>
-              <w:spacing w:after="0" w:line="220" w:lineRule="auto"/>
-              <w:jc w:val="center"/>
-            </w:pPr>
-            <w:r>
-              <w:rPr>
-                <w:sz w:val="18"/>
-              </w:rPr>
-              <w:t xml:space="preserve">&lt; 0.0001</w:t>
-            </w:r>
-          </w:p>
-        </w:tc>
-      </w:tr>
-      <w:tr>
-        <w:trPr>
-          <w:cantSplit/>
-        </w:trPr>
-        <w:tc>
-          <w:tcPr>
-            <w:tcW w:w="4060" w:type="dxa"/>
-          </w:tcPr>
-          <w:p>
-            <w:pPr>
-              <w:spacing w:after="0" w:line="220" w:lineRule="auto"/>
-            </w:pPr>
-            <w:r>
-              <w:rPr>
-                <w:sz w:val="18"/>
-              </w:rPr>
-              <w:t xml:space="preserve">Knockdown threshold error (replay)</w:t>
-            </w:r>
-          </w:p>
-        </w:tc>
-        <w:tc>
-          <w:tcPr>
-            <w:tcW w:w="700" w:type="dxa"/>
-          </w:tcPr>
-          <w:p>
-            <w:pPr>
-              <w:spacing w:after="0" w:line="220" w:lineRule="auto"/>
-              <w:jc w:val="center"/>
-            </w:pPr>
-            <w:r>
-              <w:rPr>
-                <w:sz w:val="18"/>
-              </w:rPr>
-              <w:t xml:space="preserve">150</w:t>
-            </w:r>
-          </w:p>
-        </w:tc>
-        <w:tc>
-          <w:tcPr>
-            <w:tcW w:w="1500" w:type="dxa"/>
-          </w:tcPr>
-          <w:p>
-            <w:pPr>
-              <w:spacing w:after="0" w:line="220" w:lineRule="auto"/>
-              <w:jc w:val="center"/>
-            </w:pPr>
-            <w:r>
-              <w:rPr>
-                <w:sz w:val="18"/>
-              </w:rPr>
-              <w:t xml:space="preserve">−57</w:t>
-            </w:r>
-          </w:p>
-        </w:tc>
-        <w:tc>
-          <w:tcPr>
-            <w:tcW w:w="1300" w:type="dxa"/>
-          </w:tcPr>
-          <w:p>
-            <w:pPr>
-              <w:spacing w:after="0" w:line="220" w:lineRule="auto"/>
-              <w:jc w:val="center"/>
-            </w:pPr>
-            <w:r>
-              <w:rPr>
-                <w:sz w:val="18"/>
-              </w:rPr>
-              <w:t xml:space="preserve">133 / 13 / 4</w:t>
-            </w:r>
-          </w:p>
-        </w:tc>
-        <w:tc>
-          <w:tcPr>
-            <w:tcW w:w="900" w:type="dxa"/>
-          </w:tcPr>
-          <w:p>
-            <w:pPr>
-              <w:spacing w:after="0" w:line="220" w:lineRule="auto"/>
-              <w:jc w:val="center"/>
-            </w:pPr>
-            <w:r>
-              <w:rPr>
-                <w:sz w:val="18"/>
-              </w:rPr>
-              <w:t xml:space="preserve">&lt; 0.0001</w:t>
-            </w:r>
-          </w:p>
-        </w:tc>
-        <w:tc>
-          <w:tcPr>
-            <w:tcW w:w="900" w:type="dxa"/>
-          </w:tcPr>
-          <w:p>
-            <w:pPr>
-              <w:spacing w:after="0" w:line="220" w:lineRule="auto"/>
-              <w:jc w:val="center"/>
-            </w:pPr>
-            <w:r>
-              <w:rPr>
-                <w:sz w:val="18"/>
-              </w:rPr>
-              <w:t xml:space="preserve">&lt; 0.0001</w:t>
-            </w:r>
-          </w:p>
-        </w:tc>
-      </w:tr>
-      <w:tr>
-        <w:trPr>
-          <w:cantSplit/>
-        </w:trPr>
-        <w:tc>
-          <w:tcPr>
-            <w:tcW w:w="4060" w:type="dxa"/>
-          </w:tcPr>
-          <w:p>
-            <w:pPr>
-              <w:spacing w:after="0" w:line="220" w:lineRule="auto"/>
-            </w:pPr>
-            <w:r>
-              <w:rPr>
-                <w:sz w:val="18"/>
-              </w:rPr>
-              <w:t xml:space="preserve">Weakened coating</w:t>
-            </w:r>
-          </w:p>
-        </w:tc>
-        <w:tc>
-          <w:tcPr>
-            <w:tcW w:w="700" w:type="dxa"/>
-          </w:tcPr>
-          <w:p>
-            <w:pPr>
-              <w:spacing w:after="0" w:line="220" w:lineRule="auto"/>
-              <w:jc w:val="center"/>
-            </w:pPr>
-            <w:r>
-              <w:rPr>
-                <w:sz w:val="18"/>
-              </w:rPr>
-              <w:t xml:space="preserve">150</w:t>
-            </w:r>
-          </w:p>
-        </w:tc>
-        <w:tc>
-          <w:tcPr>
-            <w:tcW w:w="1500" w:type="dxa"/>
-          </w:tcPr>
-          <w:p>
-            <w:pPr>
-              <w:spacing w:after="0" w:line="220" w:lineRule="auto"/>
-              <w:jc w:val="center"/>
-            </w:pPr>
-            <w:r>
-              <w:rPr>
-                <w:sz w:val="18"/>
-              </w:rPr>
-              <w:t xml:space="preserve">−54</w:t>
-            </w:r>
-          </w:p>
-        </w:tc>
-        <w:tc>
-          <w:tcPr>
-            <w:tcW w:w="1300" w:type="dxa"/>
-          </w:tcPr>
-          <w:p>
-            <w:pPr>
-              <w:spacing w:after="0" w:line="220" w:lineRule="auto"/>
-              <w:jc w:val="center"/>
-            </w:pPr>
-            <w:r>
-              <w:rPr>
-                <w:sz w:val="18"/>
-              </w:rPr>
-              <w:t xml:space="preserve">127 / 10 / 13</w:t>
-            </w:r>
-          </w:p>
-        </w:tc>
-        <w:tc>
-          <w:tcPr>
-            <w:tcW w:w="900" w:type="dxa"/>
-          </w:tcPr>
-          <w:p>
-            <w:pPr>
-              <w:spacing w:after="0" w:line="220" w:lineRule="auto"/>
-              <w:jc w:val="center"/>
-            </w:pPr>
-            <w:r>
-              <w:rPr>
-                <w:sz w:val="18"/>
-              </w:rPr>
-              <w:t xml:space="preserve">&lt; 0.0001</w:t>
-            </w:r>
-          </w:p>
-        </w:tc>
-        <w:tc>
-          <w:tcPr>
-            <w:tcW w:w="900" w:type="dxa"/>
-          </w:tcPr>
-          <w:p>
-            <w:pPr>
-              <w:spacing w:after="0" w:line="220" w:lineRule="auto"/>
-              <w:jc w:val="center"/>
-            </w:pPr>
-            <w:r>
-              <w:rPr>
-                <w:sz w:val="18"/>
-              </w:rPr>
-              <w:t xml:space="preserve">&lt; 0.0001</w:t>
-            </w:r>
-          </w:p>
-        </w:tc>
-      </w:tr>
-      <w:tr>
-        <w:trPr>
-          <w:cantSplit/>
-        </w:trPr>
-        <w:tc>
-          <w:tcPr>
-            <w:tcW w:w="4060" w:type="dxa"/>
-          </w:tcPr>
-          <w:p>
-            <w:pPr>
-              <w:spacing w:after="0" w:line="220" w:lineRule="auto"/>
-            </w:pPr>
-            <w:r>
-              <w:rPr>
-                <w:sz w:val="18"/>
-              </w:rPr>
-              <w:t xml:space="preserve">Ineffective coating</w:t>
-            </w:r>
-          </w:p>
-        </w:tc>
-        <w:tc>
-          <w:tcPr>
-            <w:tcW w:w="700" w:type="dxa"/>
-          </w:tcPr>
-          <w:p>
-            <w:pPr>
-              <w:spacing w:after="0" w:line="220" w:lineRule="auto"/>
-              <w:jc w:val="center"/>
-            </w:pPr>
-            <w:r>
-              <w:rPr>
-                <w:sz w:val="18"/>
-              </w:rPr>
-              <w:t xml:space="preserve">150</w:t>
-            </w:r>
-          </w:p>
-        </w:tc>
-        <w:tc>
-          <w:tcPr>
-            <w:tcW w:w="1500" w:type="dxa"/>
-          </w:tcPr>
-          <w:p>
-            <w:pPr>
-              <w:spacing w:after="0" w:line="220" w:lineRule="auto"/>
-              <w:jc w:val="center"/>
-            </w:pPr>
-            <w:r>
-              <w:rPr>
-                <w:sz w:val="18"/>
-              </w:rPr>
-              <w:t xml:space="preserve">−33</w:t>
-            </w:r>
-          </w:p>
-        </w:tc>
-        <w:tc>
-          <w:tcPr>
-            <w:tcW w:w="1300" w:type="dxa"/>
-          </w:tcPr>
-          <w:p>
-            <w:pPr>
-              <w:spacing w:after="0" w:line="220" w:lineRule="auto"/>
-              <w:jc w:val="center"/>
-            </w:pPr>
-            <w:r>
-              <w:rPr>
-                <w:sz w:val="18"/>
-              </w:rPr>
-              <w:t xml:space="preserve">114 / 12 / 24</w:t>
-            </w:r>
-          </w:p>
-        </w:tc>
-        <w:tc>
-          <w:tcPr>
-            <w:tcW w:w="900" w:type="dxa"/>
-          </w:tcPr>
-          <w:p>
-            <w:pPr>
-              <w:spacing w:after="0" w:line="220" w:lineRule="auto"/>
-              <w:jc w:val="center"/>
-            </w:pPr>
-            <w:r>
-              <w:rPr>
-                <w:sz w:val="18"/>
-              </w:rPr>
-              <w:t xml:space="preserve">&lt; 0.0001</w:t>
-            </w:r>
-          </w:p>
-        </w:tc>
-        <w:tc>
-          <w:tcPr>
-            <w:tcW w:w="900" w:type="dxa"/>
-          </w:tcPr>
-          <w:p>
-            <w:pPr>
-              <w:spacing w:after="0" w:line="220" w:lineRule="auto"/>
-              <w:jc w:val="center"/>
-            </w:pPr>
-            <w:r>
-              <w:rPr>
-                <w:sz w:val="18"/>
-              </w:rPr>
-              <w:t xml:space="preserve">&lt; 0.0001</w:t>
-            </w:r>
-          </w:p>
-        </w:tc>
-      </w:tr>
-      <w:tr>
-        <w:trPr>
-          <w:cantSplit/>
-        </w:trPr>
-        <w:tc>
-          <w:tcPr>
-            <w:tcW w:w="4060" w:type="dxa"/>
-          </w:tcPr>
-          <w:p>
-            <w:pPr>
-              <w:spacing w:after="0" w:line="220" w:lineRule="auto"/>
-            </w:pPr>
-            <w:r>
-              <w:rPr>
-                <w:sz w:val="18"/>
-              </w:rPr>
-              <w:t xml:space="preserve">Coating price ×2</w:t>
-            </w:r>
-          </w:p>
-        </w:tc>
-        <w:tc>
-          <w:tcPr>
-            <w:tcW w:w="700" w:type="dxa"/>
-          </w:tcPr>
-          <w:p>
-            <w:pPr>
-              <w:spacing w:after="0" w:line="220" w:lineRule="auto"/>
-              <w:jc w:val="center"/>
-            </w:pPr>
-            <w:r>
-              <w:rPr>
-                <w:sz w:val="18"/>
-              </w:rPr>
-              <w:t xml:space="preserve">150</w:t>
-            </w:r>
-          </w:p>
-        </w:tc>
-        <w:tc>
-          <w:tcPr>
-            <w:tcW w:w="1500" w:type="dxa"/>
-          </w:tcPr>
-          <w:p>
-            <w:pPr>
-              <w:spacing w:after="0" w:line="220" w:lineRule="auto"/>
-              <w:jc w:val="center"/>
-            </w:pPr>
-            <w:r>
-              <w:rPr>
-                <w:sz w:val="18"/>
-              </w:rPr>
-              <w:t xml:space="preserve">−60</w:t>
-            </w:r>
-          </w:p>
-        </w:tc>
-        <w:tc>
-          <w:tcPr>
-            <w:tcW w:w="1300" w:type="dxa"/>
-          </w:tcPr>
-          <w:p>
-            <w:pPr>
-              <w:spacing w:after="0" w:line="220" w:lineRule="auto"/>
-              <w:jc w:val="center"/>
-            </w:pPr>
-            <w:r>
-              <w:rPr>
-                <w:sz w:val="18"/>
-              </w:rPr>
-              <w:t xml:space="preserve">132 / 12 / 6</w:t>
-            </w:r>
-          </w:p>
-        </w:tc>
-        <w:tc>
-          <w:tcPr>
-            <w:tcW w:w="900" w:type="dxa"/>
-          </w:tcPr>
-          <w:p>
-            <w:pPr>
-              <w:spacing w:after="0" w:line="220" w:lineRule="auto"/>
-              <w:jc w:val="center"/>
-            </w:pPr>
-            <w:r>
-              <w:rPr>
-                <w:sz w:val="18"/>
-              </w:rPr>
-              <w:t xml:space="preserve">&lt; 0.0001</w:t>
-            </w:r>
-          </w:p>
-        </w:tc>
-        <w:tc>
-          <w:tcPr>
-            <w:tcW w:w="900" w:type="dxa"/>
-          </w:tcPr>
-          <w:p>
-            <w:pPr>
-              <w:spacing w:after="0" w:line="220" w:lineRule="auto"/>
-              <w:jc w:val="center"/>
-            </w:pPr>
-            <w:r>
-              <w:rPr>
-                <w:sz w:val="18"/>
-              </w:rPr>
-              <w:t xml:space="preserve">&lt; 0.0001</w:t>
-            </w:r>
-          </w:p>
-        </w:tc>
-      </w:tr>
-      <w:tr>
-        <w:trPr>
-          <w:cantSplit/>
-        </w:trPr>
-        <w:tc>
-          <w:tcPr>
-            <w:tcW w:w="4060" w:type="dxa"/>
-          </w:tcPr>
-          <w:p>
-            <w:pPr>
-              <w:spacing w:after="0" w:line="220" w:lineRule="auto"/>
-            </w:pPr>
-            <w:r>
-              <w:rPr>
-                <w:sz w:val="18"/>
-              </w:rPr>
-              <w:t xml:space="preserve">Coating stock 20 ha</w:t>
-            </w:r>
-          </w:p>
-        </w:tc>
-        <w:tc>
-          <w:tcPr>
-            <w:tcW w:w="700" w:type="dxa"/>
-          </w:tcPr>
-          <w:p>
-            <w:pPr>
-              <w:spacing w:after="0" w:line="220" w:lineRule="auto"/>
-              <w:jc w:val="center"/>
-            </w:pPr>
-            <w:r>
-              <w:rPr>
-                <w:sz w:val="18"/>
-              </w:rPr>
-              <w:t xml:space="preserve">150</w:t>
-            </w:r>
-          </w:p>
-        </w:tc>
-        <w:tc>
-          <w:tcPr>
-            <w:tcW w:w="1500" w:type="dxa"/>
-          </w:tcPr>
-          <w:p>
-            <w:pPr>
-              <w:spacing w:after="0" w:line="220" w:lineRule="auto"/>
-              <w:jc w:val="center"/>
-            </w:pPr>
-            <w:r>
-              <w:rPr>
-                <w:sz w:val="18"/>
-              </w:rPr>
-              <w:t xml:space="preserve">−53</w:t>
-            </w:r>
-          </w:p>
-        </w:tc>
-        <w:tc>
-          <w:tcPr>
-            <w:tcW w:w="1300" w:type="dxa"/>
-          </w:tcPr>
-          <w:p>
-            <w:pPr>
-              <w:spacing w:after="0" w:line="220" w:lineRule="auto"/>
-              <w:jc w:val="center"/>
-            </w:pPr>
-            <w:r>
-              <w:rPr>
-                <w:sz w:val="18"/>
-              </w:rPr>
-              <w:t xml:space="preserve">131 / 9 / 10</w:t>
-            </w:r>
-          </w:p>
-        </w:tc>
-        <w:tc>
-          <w:tcPr>
-            <w:tcW w:w="900" w:type="dxa"/>
-          </w:tcPr>
-          <w:p>
-            <w:pPr>
-              <w:spacing w:after="0" w:line="220" w:lineRule="auto"/>
-              <w:jc w:val="center"/>
-            </w:pPr>
-            <w:r>
-              <w:rPr>
-                <w:sz w:val="18"/>
-              </w:rPr>
-              <w:t xml:space="preserve">&lt; 0.0001</w:t>
-            </w:r>
-          </w:p>
-        </w:tc>
-        <w:tc>
-          <w:tcPr>
-            <w:tcW w:w="900" w:type="dxa"/>
-          </w:tcPr>
-          <w:p>
-            <w:pPr>
-              <w:spacing w:after="0" w:line="220" w:lineRule="auto"/>
-              <w:jc w:val="center"/>
-            </w:pPr>
-            <w:r>
-              <w:rPr>
-                <w:sz w:val="18"/>
-              </w:rPr>
-              <w:t xml:space="preserve">&lt; 0.0001</w:t>
-            </w:r>
-          </w:p>
-        </w:tc>
-      </w:tr>
-      <w:tr>
-        <w:trPr>
-          <w:cantSplit/>
-        </w:trPr>
-        <w:tc>
-          <w:tcPr>
-            <w:tcW w:w="4060" w:type="dxa"/>
-          </w:tcPr>
-          <w:p>
-            <w:pPr>
-              <w:spacing w:after="0" w:line="220" w:lineRule="auto"/>
-            </w:pPr>
-            <w:r>
-              <w:rPr>
-                <w:sz w:val="18"/>
-              </w:rPr>
-              <w:t xml:space="preserve">Coating delay 12 min</w:t>
-            </w:r>
-          </w:p>
-        </w:tc>
-        <w:tc>
-          <w:tcPr>
-            <w:tcW w:w="700" w:type="dxa"/>
-          </w:tcPr>
-          <w:p>
-            <w:pPr>
-              <w:spacing w:after="0" w:line="220" w:lineRule="auto"/>
-              <w:jc w:val="center"/>
-            </w:pPr>
-            <w:r>
-              <w:rPr>
-                <w:sz w:val="18"/>
-              </w:rPr>
-              <w:t xml:space="preserve">150</w:t>
-            </w:r>
-          </w:p>
-        </w:tc>
-        <w:tc>
-          <w:tcPr>
-            <w:tcW w:w="1500" w:type="dxa"/>
-          </w:tcPr>
-          <w:p>
-            <w:pPr>
-              <w:spacing w:after="0" w:line="220" w:lineRule="auto"/>
-              <w:jc w:val="center"/>
-            </w:pPr>
-            <w:r>
-              <w:rPr>
-                <w:sz w:val="18"/>
-              </w:rPr>
-              <w:t xml:space="preserve">−50</w:t>
-            </w:r>
-          </w:p>
-        </w:tc>
-        <w:tc>
-          <w:tcPr>
-            <w:tcW w:w="1300" w:type="dxa"/>
-          </w:tcPr>
-          <w:p>
-            <w:pPr>
-              <w:spacing w:after="0" w:line="220" w:lineRule="auto"/>
-              <w:jc w:val="center"/>
-            </w:pPr>
-            <w:r>
-              <w:rPr>
-                <w:sz w:val="18"/>
-              </w:rPr>
-              <w:t xml:space="preserve">130 / 11 / 9</w:t>
-            </w:r>
-          </w:p>
-        </w:tc>
-        <w:tc>
-          <w:tcPr>
-            <w:tcW w:w="900" w:type="dxa"/>
-          </w:tcPr>
-          <w:p>
-            <w:pPr>
-              <w:spacing w:after="0" w:line="220" w:lineRule="auto"/>
-              <w:jc w:val="center"/>
-            </w:pPr>
-            <w:r>
-              <w:rPr>
-                <w:sz w:val="18"/>
-              </w:rPr>
-              <w:t xml:space="preserve">&lt; 0.0001</w:t>
-            </w:r>
-          </w:p>
-        </w:tc>
-        <w:tc>
-          <w:tcPr>
-            <w:tcW w:w="900" w:type="dxa"/>
-          </w:tcPr>
-          <w:p>
-            <w:pPr>
-              <w:spacing w:after="0" w:line="220" w:lineRule="auto"/>
-              <w:jc w:val="center"/>
-            </w:pPr>
-            <w:r>
-              <w:rPr>
-                <w:sz w:val="18"/>
-              </w:rPr>
-              <w:t xml:space="preserve">&lt; 0.0001</w:t>
-            </w:r>
-          </w:p>
-        </w:tc>
-      </w:tr>
-      <w:tr>
-        <w:trPr>
-          <w:cantSplit/>
-        </w:trPr>
-        <w:tc>
-          <w:tcPr>
-            <w:tcW w:w="4060" w:type="dxa"/>
-          </w:tcPr>
-          <w:p>
-            <w:pPr>
-              <w:spacing w:after="0" w:line="220" w:lineRule="auto"/>
-            </w:pPr>
-            <w:r>
-              <w:rPr>
-                <w:sz w:val="18"/>
-              </w:rPr>
-              <w:t xml:space="preserve">Wind speed ×1.5</w:t>
-            </w:r>
-          </w:p>
-        </w:tc>
-        <w:tc>
-          <w:tcPr>
-            <w:tcW w:w="700" w:type="dxa"/>
-          </w:tcPr>
-          <w:p>
-            <w:pPr>
-              <w:spacing w:after="0" w:line="220" w:lineRule="auto"/>
-              <w:jc w:val="center"/>
-            </w:pPr>
-            <w:r>
-              <w:rPr>
-                <w:sz w:val="18"/>
-              </w:rPr>
-              <w:t xml:space="preserve">150</w:t>
-            </w:r>
-          </w:p>
-        </w:tc>
-        <w:tc>
-          <w:tcPr>
-            <w:tcW w:w="1500" w:type="dxa"/>
-          </w:tcPr>
-          <w:p>
-            <w:pPr>
-              <w:spacing w:after="0" w:line="220" w:lineRule="auto"/>
-              <w:jc w:val="center"/>
-            </w:pPr>
-            <w:r>
-              <w:rPr>
-                <w:sz w:val="18"/>
-              </w:rPr>
-              <w:t xml:space="preserve">−44</w:t>
-            </w:r>
-          </w:p>
-        </w:tc>
-        <w:tc>
-          <w:tcPr>
-            <w:tcW w:w="1300" w:type="dxa"/>
-          </w:tcPr>
-          <w:p>
-            <w:pPr>
-              <w:spacing w:after="0" w:line="220" w:lineRule="auto"/>
-              <w:jc w:val="center"/>
-            </w:pPr>
-            <w:r>
-              <w:rPr>
-                <w:sz w:val="18"/>
-              </w:rPr>
-              <w:t xml:space="preserve">120 / 15 / 15</w:t>
-            </w:r>
-          </w:p>
-        </w:tc>
-        <w:tc>
-          <w:tcPr>
-            <w:tcW w:w="900" w:type="dxa"/>
-          </w:tcPr>
-          <w:p>
-            <w:pPr>
-              <w:spacing w:after="0" w:line="220" w:lineRule="auto"/>
-              <w:jc w:val="center"/>
-            </w:pPr>
-            <w:r>
-              <w:rPr>
-                <w:sz w:val="18"/>
-              </w:rPr>
-              <w:t xml:space="preserve">&lt; 0.0001</w:t>
-            </w:r>
-          </w:p>
-        </w:tc>
-        <w:tc>
-          <w:tcPr>
-            <w:tcW w:w="900" w:type="dxa"/>
-          </w:tcPr>
-          <w:p>
-            <w:pPr>
-              <w:spacing w:after="0" w:line="220" w:lineRule="auto"/>
-              <w:jc w:val="center"/>
-            </w:pPr>
-            <w:r>
-              <w:rPr>
-                <w:sz w:val="18"/>
-              </w:rPr>
-              <w:t xml:space="preserve">&lt; 0.0001</w:t>
-            </w:r>
-          </w:p>
-        </w:tc>
-      </w:tr>
-      <w:tr>
-        <w:trPr>
-          <w:cantSplit/>
-        </w:trPr>
-        <w:tc>
-          <w:tcPr>
-            <w:tcW w:w="4060" w:type="dxa"/>
-          </w:tcPr>
-          <w:p>
-            <w:pPr>
-              <w:spacing w:after="0" w:line="220" w:lineRule="auto"/>
-            </w:pPr>
-            <w:r>
-              <w:rPr>
-                <w:sz w:val="18"/>
-              </w:rPr>
-              <w:t xml:space="preserve">Wind direction +30°</w:t>
-            </w:r>
-          </w:p>
-        </w:tc>
-        <w:tc>
-          <w:tcPr>
-            <w:tcW w:w="700" w:type="dxa"/>
-          </w:tcPr>
-          <w:p>
-            <w:pPr>
-              <w:spacing w:after="0" w:line="220" w:lineRule="auto"/>
-              <w:jc w:val="center"/>
-            </w:pPr>
-            <w:r>
-              <w:rPr>
-                <w:sz w:val="18"/>
-              </w:rPr>
-              <w:t xml:space="preserve">150</w:t>
-            </w:r>
-          </w:p>
-        </w:tc>
-        <w:tc>
-          <w:tcPr>
-            <w:tcW w:w="1500" w:type="dxa"/>
-          </w:tcPr>
-          <w:p>
-            <w:pPr>
-              <w:spacing w:after="0" w:line="220" w:lineRule="auto"/>
-              <w:jc w:val="center"/>
-            </w:pPr>
-            <w:r>
-              <w:rPr>
-                <w:sz w:val="18"/>
-              </w:rPr>
-              <w:t xml:space="preserve">−58</w:t>
-            </w:r>
-          </w:p>
-        </w:tc>
-        <w:tc>
-          <w:tcPr>
-            <w:tcW w:w="1300" w:type="dxa"/>
-          </w:tcPr>
-          <w:p>
-            <w:pPr>
-              <w:spacing w:after="0" w:line="220" w:lineRule="auto"/>
-              <w:jc w:val="center"/>
-            </w:pPr>
-            <w:r>
-              <w:rPr>
-                <w:sz w:val="18"/>
-              </w:rPr>
-              <w:t xml:space="preserve">130 / 12 / 8</w:t>
-            </w:r>
-          </w:p>
-        </w:tc>
-        <w:tc>
-          <w:tcPr>
-            <w:tcW w:w="900" w:type="dxa"/>
-          </w:tcPr>
-          <w:p>
-            <w:pPr>
-              <w:spacing w:after="0" w:line="220" w:lineRule="auto"/>
-              <w:jc w:val="center"/>
-            </w:pPr>
-            <w:r>
-              <w:rPr>
-                <w:sz w:val="18"/>
-              </w:rPr>
-              <w:t xml:space="preserve">&lt; 0.0001</w:t>
-            </w:r>
-          </w:p>
-        </w:tc>
-        <w:tc>
-          <w:tcPr>
-            <w:tcW w:w="900" w:type="dxa"/>
-          </w:tcPr>
-          <w:p>
-            <w:pPr>
-              <w:spacing w:after="0" w:line="220" w:lineRule="auto"/>
-              <w:jc w:val="center"/>
-            </w:pPr>
-            <w:r>
-              <w:rPr>
-                <w:sz w:val="18"/>
-              </w:rPr>
-              <w:t xml:space="preserve">&lt; 0.0001</w:t>
-            </w:r>
-          </w:p>
-        </w:tc>
-      </w:tr>
-      <w:tr>
-        <w:trPr>
-          <w:cantSplit/>
-        </w:trPr>
-        <w:tc>
-          <w:tcPr>
-            <w:tcW w:w="4060" w:type="dxa"/>
-          </w:tcPr>
-          <w:p>
-            <w:pPr>
-              <w:spacing w:after="0" w:line="220" w:lineRule="auto"/>
-            </w:pPr>
-            <w:r>
-              <w:rPr>
-                <w:sz w:val="18"/>
-              </w:rPr>
-              <w:t xml:space="preserve">Wind direction −30°</w:t>
-            </w:r>
-          </w:p>
-        </w:tc>
-        <w:tc>
-          <w:tcPr>
-            <w:tcW w:w="700" w:type="dxa"/>
-          </w:tcPr>
-          <w:p>
-            <w:pPr>
-              <w:spacing w:after="0" w:line="220" w:lineRule="auto"/>
-              <w:jc w:val="center"/>
-            </w:pPr>
-            <w:r>
-              <w:rPr>
-                <w:sz w:val="18"/>
-              </w:rPr>
-              <w:t xml:space="preserve">150</w:t>
-            </w:r>
-          </w:p>
-        </w:tc>
-        <w:tc>
-          <w:tcPr>
-            <w:tcW w:w="1500" w:type="dxa"/>
-          </w:tcPr>
-          <w:p>
-            <w:pPr>
-              <w:spacing w:after="0" w:line="220" w:lineRule="auto"/>
-              <w:jc w:val="center"/>
-            </w:pPr>
-            <w:r>
-              <w:rPr>
-                <w:sz w:val="18"/>
-              </w:rPr>
-              <w:t xml:space="preserve">−63</w:t>
-            </w:r>
-          </w:p>
-        </w:tc>
-        <w:tc>
-          <w:tcPr>
-            <w:tcW w:w="1300" w:type="dxa"/>
-          </w:tcPr>
-          <w:p>
-            <w:pPr>
-              <w:spacing w:after="0" w:line="220" w:lineRule="auto"/>
-              <w:jc w:val="center"/>
-            </w:pPr>
-            <w:r>
-              <w:rPr>
-                <w:sz w:val="18"/>
-              </w:rPr>
-              <w:t xml:space="preserve">126 / 11 / 13</w:t>
-            </w:r>
-          </w:p>
-        </w:tc>
-        <w:tc>
-          <w:tcPr>
-            <w:tcW w:w="900" w:type="dxa"/>
-          </w:tcPr>
-          <w:p>
-            <w:pPr>
-              <w:spacing w:after="0" w:line="220" w:lineRule="auto"/>
-              <w:jc w:val="center"/>
-            </w:pPr>
-            <w:r>
-              <w:rPr>
-                <w:sz w:val="18"/>
-              </w:rPr>
-              <w:t xml:space="preserve">&lt; 0.0001</w:t>
-            </w:r>
-          </w:p>
-        </w:tc>
-        <w:tc>
-          <w:tcPr>
-            <w:tcW w:w="900" w:type="dxa"/>
-          </w:tcPr>
-          <w:p>
-            <w:pPr>
-              <w:spacing w:after="0" w:line="220" w:lineRule="auto"/>
-              <w:jc w:val="center"/>
-            </w:pPr>
-            <w:r>
-              <w:rPr>
-                <w:sz w:val="18"/>
-              </w:rPr>
-              <w:t xml:space="preserve">&lt; 0.0001</w:t>
-            </w:r>
-          </w:p>
-        </w:tc>
-      </w:tr>
-      <w:tr>
-        <w:trPr>
-          <w:cantSplit/>
-        </w:trPr>
-        <w:tc>
-          <w:tcPr>
-            <w:tcW w:w="4060" w:type="dxa"/>
-          </w:tcPr>
-          <w:p>
-            <w:pPr>
-              <w:spacing w:after="0" w:line="220" w:lineRule="auto"/>
-            </w:pPr>
-            <w:r>
-              <w:rPr>
-                <w:sz w:val="18"/>
-              </w:rPr>
-              <w:t xml:space="preserve">Spread kernel and ember model</w:t>
-            </w:r>
-          </w:p>
-        </w:tc>
-        <w:tc>
-          <w:tcPr>
-            <w:tcW w:w="700" w:type="dxa"/>
-          </w:tcPr>
-          <w:p>
-            <w:pPr>
-              <w:spacing w:after="0" w:line="220" w:lineRule="auto"/>
-              <w:jc w:val="center"/>
-            </w:pPr>
-            <w:r>
-              <w:rPr>
-                <w:sz w:val="18"/>
-              </w:rPr>
-              <w:t xml:space="preserve">150</w:t>
-            </w:r>
-          </w:p>
-        </w:tc>
-        <w:tc>
-          <w:tcPr>
-            <w:tcW w:w="1500" w:type="dxa"/>
-          </w:tcPr>
-          <w:p>
-            <w:pPr>
-              <w:spacing w:after="0" w:line="220" w:lineRule="auto"/>
-              <w:jc w:val="center"/>
-            </w:pPr>
-            <w:r>
-              <w:rPr>
-                <w:sz w:val="18"/>
-              </w:rPr>
-              <w:t xml:space="preserve">−56</w:t>
-            </w:r>
-          </w:p>
-        </w:tc>
-        <w:tc>
-          <w:tcPr>
-            <w:tcW w:w="1300" w:type="dxa"/>
-          </w:tcPr>
-          <w:p>
-            <w:pPr>
-              <w:spacing w:after="0" w:line="220" w:lineRule="auto"/>
-              <w:jc w:val="center"/>
-            </w:pPr>
-            <w:r>
-              <w:rPr>
-                <w:sz w:val="18"/>
-              </w:rPr>
-              <w:t xml:space="preserve">130 / 13 / 7</w:t>
-            </w:r>
-          </w:p>
-        </w:tc>
-        <w:tc>
-          <w:tcPr>
-            <w:tcW w:w="900" w:type="dxa"/>
-          </w:tcPr>
-          <w:p>
-            <w:pPr>
-              <w:spacing w:after="0" w:line="220" w:lineRule="auto"/>
-              <w:jc w:val="center"/>
-            </w:pPr>
-            <w:r>
-              <w:rPr>
-                <w:sz w:val="18"/>
-              </w:rPr>
-              <w:t xml:space="preserve">&lt; 0.0001</w:t>
-            </w:r>
-          </w:p>
-        </w:tc>
-        <w:tc>
-          <w:tcPr>
-            <w:tcW w:w="900" w:type="dxa"/>
-          </w:tcPr>
-          <w:p>
-            <w:pPr>
-              <w:spacing w:after="0" w:line="220" w:lineRule="auto"/>
-              <w:jc w:val="center"/>
-            </w:pPr>
-            <w:r>
-              <w:rPr>
-                <w:sz w:val="18"/>
-              </w:rPr>
-              <w:t xml:space="preserve">&lt; 0.0001</w:t>
-            </w:r>
-          </w:p>
-        </w:tc>
-      </w:tr>
-      <w:tr>
-        <w:trPr>
-          <w:cantSplit/>
-        </w:trPr>
-        <w:tc>
-          <w:tcPr>
-            <w:tcW w:w="9360" w:type="dxa"/>
-            <w:gridSpan w:val="6"/>
-          </w:tcPr>
-          <w:p>
-            <w:pPr>
-              <w:spacing w:after="0" w:line="220" w:lineRule="auto"/>
-            </w:pPr>
-            <w:r>
-              <w:rPr>
-                <w:b/>
-                <w:sz w:val="18"/>
-              </w:rPr>
-              <w:t xml:space="preserve">Table VIII</w:t>
-            </w:r>
-          </w:p>
-        </w:tc>
-      </w:tr>
-      <w:tr>
-        <w:trPr>
-          <w:cantSplit/>
-        </w:trPr>
-        <w:tc>
-          <w:tcPr>
-            <w:tcW w:w="4060" w:type="dxa"/>
-          </w:tcPr>
-          <w:p>
-            <w:pPr>
-              <w:spacing w:after="0" w:line="220" w:lineRule="auto"/>
-            </w:pPr>
-            <w:r>
-              <w:rPr>
-                <w:sz w:val="18"/>
-              </w:rPr>
-              <w:t xml:space="preserve">40 rules + Closed / Seeds + Closed</w:t>
-            </w:r>
-          </w:p>
-        </w:tc>
-        <w:tc>
-          <w:tcPr>
-            <w:tcW w:w="700" w:type="dxa"/>
-          </w:tcPr>
-          <w:p>
-            <w:pPr>
-              <w:spacing w:after="0" w:line="220" w:lineRule="auto"/>
-              <w:jc w:val="center"/>
-            </w:pPr>
-            <w:r>
-              <w:rPr>
-                <w:sz w:val="18"/>
-              </w:rPr>
-              <w:t xml:space="preserve">150</w:t>
-            </w:r>
-          </w:p>
-        </w:tc>
-        <w:tc>
-          <w:tcPr>
-            <w:tcW w:w="1500" w:type="dxa"/>
-          </w:tcPr>
-          <w:p>
-            <w:pPr>
-              <w:spacing w:after="0" w:line="220" w:lineRule="auto"/>
-              <w:jc w:val="center"/>
-            </w:pPr>
-            <w:r>
-              <w:rPr>
-                <w:sz w:val="18"/>
-              </w:rPr>
-              <w:t xml:space="preserve">−11</w:t>
-            </w:r>
-          </w:p>
-        </w:tc>
-        <w:tc>
-          <w:tcPr>
-            <w:tcW w:w="1300" w:type="dxa"/>
-          </w:tcPr>
-          <w:p>
-            <w:pPr>
-              <w:spacing w:after="0" w:line="220" w:lineRule="auto"/>
-              <w:jc w:val="center"/>
-            </w:pPr>
-            <w:r>
-              <w:rPr>
-                <w:sz w:val="18"/>
-              </w:rPr>
-              <w:t xml:space="preserve">92 / 15 / 43</w:t>
-            </w:r>
-          </w:p>
-        </w:tc>
-        <w:tc>
-          <w:tcPr>
-            <w:tcW w:w="900" w:type="dxa"/>
-          </w:tcPr>
-          <w:p>
-            <w:pPr>
-              <w:spacing w:after="0" w:line="220" w:lineRule="auto"/>
-              <w:jc w:val="center"/>
-            </w:pPr>
-            <w:r>
-              <w:rPr>
-                <w:sz w:val="18"/>
-              </w:rPr>
-              <w:t xml:space="preserve">0.006</w:t>
-            </w:r>
-          </w:p>
-        </w:tc>
-        <w:tc>
-          <w:tcPr>
-            <w:tcW w:w="900" w:type="dxa"/>
-          </w:tcPr>
-          <w:p>
-            <w:pPr>
-              <w:spacing w:after="0" w:line="220" w:lineRule="auto"/>
-              <w:jc w:val="center"/>
-            </w:pPr>
-            <w:r>
-              <w:rPr>
-                <w:sz w:val="18"/>
-              </w:rPr>
-              <w:t xml:space="preserve">0.02</w:t>
-            </w:r>
-          </w:p>
-        </w:tc>
-      </w:tr>
-      <w:tr>
-        <w:trPr>
-          <w:cantSplit/>
-        </w:trPr>
-        <w:tc>
-          <w:tcPr>
-            <w:tcW w:w="4060" w:type="dxa"/>
-          </w:tcPr>
-          <w:p>
-            <w:pPr>
-              <w:spacing w:after="0" w:line="220" w:lineRule="auto"/>
-            </w:pPr>
-            <w:r>
-              <w:rPr>
-                <w:sz w:val="18"/>
-              </w:rPr>
-              <w:t xml:space="preserve">Seeds + six hand-written tactics + Closed / Seeds + Closed</w:t>
-            </w:r>
-          </w:p>
-        </w:tc>
-        <w:tc>
-          <w:tcPr>
-            <w:tcW w:w="700" w:type="dxa"/>
-          </w:tcPr>
-          <w:p>
-            <w:pPr>
-              <w:spacing w:after="0" w:line="220" w:lineRule="auto"/>
-              <w:jc w:val="center"/>
-            </w:pPr>
-            <w:r>
-              <w:rPr>
-                <w:sz w:val="18"/>
-              </w:rPr>
-              <w:t xml:space="preserve">150</w:t>
-            </w:r>
-          </w:p>
-        </w:tc>
-        <w:tc>
-          <w:tcPr>
-            <w:tcW w:w="1500" w:type="dxa"/>
-          </w:tcPr>
-          <w:p>
-            <w:pPr>
-              <w:spacing w:after="0" w:line="220" w:lineRule="auto"/>
-              <w:jc w:val="center"/>
-            </w:pPr>
-            <w:r>
-              <w:rPr>
-                <w:sz w:val="18"/>
-              </w:rPr>
-              <w:t xml:space="preserve">−9</w:t>
-            </w:r>
-          </w:p>
-        </w:tc>
-        <w:tc>
-          <w:tcPr>
-            <w:tcW w:w="1300" w:type="dxa"/>
-          </w:tcPr>
-          <w:p>
-            <w:pPr>
-              <w:spacing w:after="0" w:line="220" w:lineRule="auto"/>
-              <w:jc w:val="center"/>
-            </w:pPr>
-            <w:r>
-              <w:rPr>
-                <w:sz w:val="18"/>
-              </w:rPr>
-              <w:t xml:space="preserve">71 / 40 / 39</w:t>
-            </w:r>
-          </w:p>
-        </w:tc>
-        <w:tc>
-          <w:tcPr>
-            <w:tcW w:w="900" w:type="dxa"/>
-          </w:tcPr>
-          <w:p>
-            <w:pPr>
-              <w:spacing w:after="0" w:line="220" w:lineRule="auto"/>
-              <w:jc w:val="center"/>
-            </w:pPr>
-            <w:r>
-              <w:rPr>
-                <w:sz w:val="18"/>
-              </w:rPr>
-              <w:t xml:space="preserve">0.001</w:t>
-            </w:r>
-          </w:p>
-        </w:tc>
-        <w:tc>
-          <w:tcPr>
-            <w:tcW w:w="900" w:type="dxa"/>
-          </w:tcPr>
-          <w:p>
-            <w:pPr>
-              <w:spacing w:after="0" w:line="220" w:lineRule="auto"/>
-              <w:jc w:val="center"/>
-            </w:pPr>
-            <w:r>
-              <w:rPr>
-                <w:sz w:val="18"/>
-              </w:rPr>
-              <w:t xml:space="preserve">0.005</w:t>
-            </w:r>
-          </w:p>
-        </w:tc>
-      </w:tr>
-      <w:tr>
-        <w:trPr>
-          <w:cantSplit/>
-        </w:trPr>
-        <w:tc>
-          <w:tcPr>
-            <w:tcW w:w="4060" w:type="dxa"/>
-          </w:tcPr>
-          <w:p>
-            <w:pPr>
-              <w:spacing w:after="0" w:line="220" w:lineRule="auto"/>
-            </w:pPr>
-            <w:r>
-              <w:rPr>
-                <w:sz w:val="18"/>
-              </w:rPr>
-              <w:t xml:space="preserve">Recorded + Closed / Seeds + Closed (75)</w:t>
-            </w:r>
-          </w:p>
-        </w:tc>
-        <w:tc>
-          <w:tcPr>
-            <w:tcW w:w="700" w:type="dxa"/>
-          </w:tcPr>
-          <w:p>
-            <w:pPr>
-              <w:spacing w:after="0" w:line="220" w:lineRule="auto"/>
-              <w:jc w:val="center"/>
-            </w:pPr>
-            <w:r>
-              <w:rPr>
-                <w:sz w:val="18"/>
-              </w:rPr>
-              <w:t xml:space="preserve">75</w:t>
-            </w:r>
-          </w:p>
-        </w:tc>
-        <w:tc>
-          <w:tcPr>
-            <w:tcW w:w="1500" w:type="dxa"/>
-          </w:tcPr>
-          <w:p>
-            <w:pPr>
-              <w:spacing w:after="0" w:line="220" w:lineRule="auto"/>
-              <w:jc w:val="center"/>
-            </w:pPr>
-            <w:r>
-              <w:rPr>
-                <w:sz w:val="18"/>
-              </w:rPr>
-              <w:t xml:space="preserve">−50</w:t>
-            </w:r>
-          </w:p>
-        </w:tc>
-        <w:tc>
-          <w:tcPr>
-            <w:tcW w:w="1300" w:type="dxa"/>
-          </w:tcPr>
-          <w:p>
-            <w:pPr>
-              <w:spacing w:after="0" w:line="220" w:lineRule="auto"/>
-              <w:jc w:val="center"/>
-            </w:pPr>
-            <w:r>
-              <w:rPr>
-                <w:sz w:val="18"/>
-              </w:rPr>
-              <w:t xml:space="preserve">68 / 6 / 1</w:t>
-            </w:r>
-          </w:p>
-        </w:tc>
-        <w:tc>
-          <w:tcPr>
-            <w:tcW w:w="900" w:type="dxa"/>
-          </w:tcPr>
-          <w:p>
-            <w:pPr>
-              <w:spacing w:after="0" w:line="220" w:lineRule="auto"/>
-              <w:jc w:val="center"/>
-            </w:pPr>
-            <w:r>
-              <w:rPr>
-                <w:sz w:val="18"/>
-              </w:rPr>
-              <w:t xml:space="preserve">&lt; 0.0001</w:t>
-            </w:r>
-          </w:p>
-        </w:tc>
-        <w:tc>
-          <w:tcPr>
-            <w:tcW w:w="900" w:type="dxa"/>
-          </w:tcPr>
-          <w:p>
-            <w:pPr>
-              <w:spacing w:after="0" w:line="220" w:lineRule="auto"/>
-              <w:jc w:val="center"/>
-            </w:pPr>
-            <w:r>
-              <w:rPr>
-                <w:sz w:val="18"/>
-              </w:rPr>
-              <w:t xml:space="preserve">&lt; 0.0001</w:t>
-            </w:r>
-          </w:p>
-        </w:tc>
-      </w:tr>
-      <w:tr>
-        <w:trPr>
-          <w:cantSplit/>
-        </w:trPr>
-        <w:tc>
-          <w:tcPr>
-            <w:tcW w:w="4060" w:type="dxa"/>
-          </w:tcPr>
-          <w:p>
-            <w:pPr>
-              <w:spacing w:after="0" w:line="220" w:lineRule="auto"/>
-            </w:pPr>
-            <w:r>
-              <w:rPr>
-                <w:sz w:val="18"/>
-              </w:rPr>
-              <w:t xml:space="preserve">Seeds (no deployment) + Closed / Seeds + Closed</w:t>
-            </w:r>
-          </w:p>
-        </w:tc>
-        <w:tc>
-          <w:tcPr>
-            <w:tcW w:w="700" w:type="dxa"/>
-          </w:tcPr>
-          <w:p>
-            <w:pPr>
-              <w:spacing w:after="0" w:line="220" w:lineRule="auto"/>
-              <w:jc w:val="center"/>
-            </w:pPr>
-            <w:r>
-              <w:rPr>
-                <w:sz w:val="18"/>
-              </w:rPr>
-              <w:t xml:space="preserve">150</w:t>
-            </w:r>
-          </w:p>
-        </w:tc>
-        <w:tc>
-          <w:tcPr>
-            <w:tcW w:w="1500" w:type="dxa"/>
-          </w:tcPr>
-          <w:p>
-            <w:pPr>
-              <w:spacing w:after="0" w:line="220" w:lineRule="auto"/>
-              <w:jc w:val="center"/>
-            </w:pPr>
-            <w:r>
-              <w:rPr>
-                <w:sz w:val="18"/>
-              </w:rPr>
-              <w:t xml:space="preserve">+40</w:t>
-            </w:r>
-          </w:p>
-        </w:tc>
-        <w:tc>
-          <w:tcPr>
-            <w:tcW w:w="1300" w:type="dxa"/>
-          </w:tcPr>
-          <w:p>
-            <w:pPr>
-              <w:spacing w:after="0" w:line="220" w:lineRule="auto"/>
-              <w:jc w:val="center"/>
-            </w:pPr>
-            <w:r>
-              <w:rPr>
-                <w:sz w:val="18"/>
-              </w:rPr>
-              <w:t xml:space="preserve">34 / 1 / 115</w:t>
-            </w:r>
-          </w:p>
-        </w:tc>
-        <w:tc>
-          <w:tcPr>
-            <w:tcW w:w="900" w:type="dxa"/>
-          </w:tcPr>
-          <w:p>
-            <w:pPr>
-              <w:spacing w:after="0" w:line="220" w:lineRule="auto"/>
-              <w:jc w:val="center"/>
-            </w:pPr>
-            <w:r>
-              <w:rPr>
-                <w:sz w:val="18"/>
-              </w:rPr>
-              <w:t xml:space="preserve">&lt; 0.0001</w:t>
-            </w:r>
-          </w:p>
-        </w:tc>
-        <w:tc>
-          <w:tcPr>
-            <w:tcW w:w="900" w:type="dxa"/>
-          </w:tcPr>
-          <w:p>
-            <w:pPr>
-              <w:spacing w:after="0" w:line="220" w:lineRule="auto"/>
-              <w:jc w:val="center"/>
-            </w:pPr>
-            <w:r>
-              <w:rPr>
-                <w:sz w:val="18"/>
-              </w:rPr>
-              <w:t xml:space="preserve">&lt; 0.0001</w:t>
-            </w:r>
-          </w:p>
-        </w:tc>
-      </w:tr>
-      <w:tr>
-        <w:trPr>
-          <w:cantSplit/>
-        </w:trPr>
-        <w:tc>
-          <w:tcPr>
-            <w:tcW w:w="4060" w:type="dxa"/>
-          </w:tcPr>
-          <w:p>
-            <w:pPr>
-              <w:spacing w:after="0" w:line="220" w:lineRule="auto"/>
-            </w:pPr>
-            <w:r>
-              <w:rPr>
-                <w:sz w:val="18"/>
-              </w:rPr>
-              <w:t xml:space="preserve">Seeds (no deployment) + Open / Seeds + Closed</w:t>
-            </w:r>
-          </w:p>
-        </w:tc>
-        <w:tc>
-          <w:tcPr>
-            <w:tcW w:w="700" w:type="dxa"/>
-          </w:tcPr>
-          <w:p>
-            <w:pPr>
-              <w:spacing w:after="0" w:line="220" w:lineRule="auto"/>
-              <w:jc w:val="center"/>
-            </w:pPr>
-            <w:r>
-              <w:rPr>
-                <w:sz w:val="18"/>
-              </w:rPr>
-              <w:t xml:space="preserve">150</w:t>
-            </w:r>
-          </w:p>
-        </w:tc>
-        <w:tc>
-          <w:tcPr>
-            <w:tcW w:w="1500" w:type="dxa"/>
-          </w:tcPr>
-          <w:p>
-            <w:pPr>
-              <w:spacing w:after="0" w:line="220" w:lineRule="auto"/>
-              <w:jc w:val="center"/>
-            </w:pPr>
-            <w:r>
-              <w:rPr>
-                <w:sz w:val="18"/>
-              </w:rPr>
-              <w:t xml:space="preserve">−42</w:t>
-            </w:r>
-          </w:p>
-        </w:tc>
-        <w:tc>
-          <w:tcPr>
-            <w:tcW w:w="1300" w:type="dxa"/>
-          </w:tcPr>
-          <w:p>
-            <w:pPr>
-              <w:spacing w:after="0" w:line="220" w:lineRule="auto"/>
-              <w:jc w:val="center"/>
-            </w:pPr>
-            <w:r>
-              <w:rPr>
-                <w:sz w:val="18"/>
-              </w:rPr>
-              <w:t xml:space="preserve">109 / 3 / 38</w:t>
-            </w:r>
-          </w:p>
-        </w:tc>
-        <w:tc>
-          <w:tcPr>
-            <w:tcW w:w="900" w:type="dxa"/>
-          </w:tcPr>
-          <w:p>
-            <w:pPr>
-              <w:spacing w:after="0" w:line="220" w:lineRule="auto"/>
-              <w:jc w:val="center"/>
-            </w:pPr>
-            <w:r>
-              <w:rPr>
-                <w:sz w:val="18"/>
-              </w:rPr>
-              <w:t xml:space="preserve">&lt; 0.0001</w:t>
-            </w:r>
-          </w:p>
-        </w:tc>
-        <w:tc>
-          <w:tcPr>
-            <w:tcW w:w="900" w:type="dxa"/>
-          </w:tcPr>
-          <w:p>
-            <w:pPr>
-              <w:spacing w:after="0" w:line="220" w:lineRule="auto"/>
-              <w:jc w:val="center"/>
-            </w:pPr>
-            <w:r>
-              <w:rPr>
-                <w:sz w:val="18"/>
-              </w:rPr>
-              <w:t xml:space="preserve">&lt; 0.0001</w:t>
-            </w:r>
-          </w:p>
-        </w:tc>
-      </w:tr>
-      <w:tr>
-        <w:trPr>
-          <w:cantSplit/>
-        </w:trPr>
-        <w:tc>
-          <w:tcPr>
-            <w:tcW w:w="4060" w:type="dxa"/>
-          </w:tcPr>
-          <w:p>
-            <w:pPr>
-              <w:spacing w:after="0" w:line="220" w:lineRule="auto"/>
-            </w:pPr>
-            <w:r>
-              <w:rPr>
-                <w:sz w:val="18"/>
-              </w:rPr>
-              <w:t xml:space="preserve">S6–S8 Recorded + Closed / Seeds + Closed</w:t>
-            </w:r>
-          </w:p>
-        </w:tc>
-        <w:tc>
-          <w:tcPr>
-            <w:tcW w:w="700" w:type="dxa"/>
-          </w:tcPr>
-          <w:p>
-            <w:pPr>
-              <w:spacing w:after="0" w:line="220" w:lineRule="auto"/>
-              <w:jc w:val="center"/>
-            </w:pPr>
-            <w:r>
-              <w:rPr>
-                <w:sz w:val="18"/>
-              </w:rPr>
-              <w:t xml:space="preserve">90</w:t>
-            </w:r>
-          </w:p>
-        </w:tc>
-        <w:tc>
-          <w:tcPr>
-            <w:tcW w:w="1500" w:type="dxa"/>
-          </w:tcPr>
-          <w:p>
-            <w:pPr>
-              <w:spacing w:after="0" w:line="220" w:lineRule="auto"/>
-              <w:jc w:val="center"/>
-            </w:pPr>
-            <w:r>
-              <w:rPr>
-                <w:sz w:val="18"/>
-              </w:rPr>
-              <w:t xml:space="preserve">−43</w:t>
-            </w:r>
-          </w:p>
-        </w:tc>
-        <w:tc>
-          <w:tcPr>
-            <w:tcW w:w="1300" w:type="dxa"/>
-          </w:tcPr>
-          <w:p>
-            <w:pPr>
-              <w:spacing w:after="0" w:line="220" w:lineRule="auto"/>
-              <w:jc w:val="center"/>
-            </w:pPr>
-            <w:r>
-              <w:rPr>
-                <w:sz w:val="18"/>
-              </w:rPr>
-              <w:t xml:space="preserve">86 / 2 / 2</w:t>
-            </w:r>
-          </w:p>
-        </w:tc>
-        <w:tc>
-          <w:tcPr>
-            <w:tcW w:w="900" w:type="dxa"/>
-          </w:tcPr>
-          <w:p>
-            <w:pPr>
-              <w:spacing w:after="0" w:line="220" w:lineRule="auto"/>
-              <w:jc w:val="center"/>
-            </w:pPr>
-            <w:r>
-              <w:rPr>
-                <w:sz w:val="18"/>
-              </w:rPr>
-              <w:t xml:space="preserve">&lt; 0.0001</w:t>
-            </w:r>
-          </w:p>
-        </w:tc>
-        <w:tc>
-          <w:tcPr>
-            <w:tcW w:w="900" w:type="dxa"/>
-          </w:tcPr>
-          <w:p>
-            <w:pPr>
-              <w:spacing w:after="0" w:line="220" w:lineRule="auto"/>
-              <w:jc w:val="center"/>
-            </w:pPr>
-            <w:r>
-              <w:rPr>
-                <w:sz w:val="18"/>
-              </w:rPr>
-              <w:t xml:space="preserve">&lt; 0.0001</w:t>
-            </w:r>
-          </w:p>
-        </w:tc>
-      </w:tr>
-      <w:tr>
-        <w:trPr>
-          <w:cantSplit/>
-        </w:trPr>
-        <w:tc>
-          <w:tcPr>
-            <w:tcW w:w="4060" w:type="dxa"/>
-          </w:tcPr>
-          <w:p>
-            <w:pPr>
-              <w:spacing w:after="0" w:line="220" w:lineRule="auto"/>
-            </w:pPr>
-            <w:r>
-              <w:rPr>
-                <w:sz w:val="18"/>
-              </w:rPr>
-              <w:t xml:space="preserve">S6–S8 Seeds + Open / Recorded + Closed</w:t>
-            </w:r>
-          </w:p>
-        </w:tc>
-        <w:tc>
-          <w:tcPr>
-            <w:tcW w:w="700" w:type="dxa"/>
-          </w:tcPr>
-          <w:p>
-            <w:pPr>
-              <w:spacing w:after="0" w:line="220" w:lineRule="auto"/>
-              <w:jc w:val="center"/>
-            </w:pPr>
-            <w:r>
-              <w:rPr>
-                <w:sz w:val="18"/>
-              </w:rPr>
-              <w:t xml:space="preserve">90</w:t>
-            </w:r>
-          </w:p>
-        </w:tc>
-        <w:tc>
-          <w:tcPr>
-            <w:tcW w:w="1500" w:type="dxa"/>
-          </w:tcPr>
-          <w:p>
-            <w:pPr>
-              <w:spacing w:after="0" w:line="220" w:lineRule="auto"/>
-              <w:jc w:val="center"/>
-            </w:pPr>
-            <w:r>
-              <w:rPr>
-                <w:sz w:val="18"/>
-              </w:rPr>
-              <w:t xml:space="preserve">−1</w:t>
-            </w:r>
-          </w:p>
-        </w:tc>
-        <w:tc>
-          <w:tcPr>
-            <w:tcW w:w="1300" w:type="dxa"/>
-          </w:tcPr>
-          <w:p>
-            <w:pPr>
-              <w:spacing w:after="0" w:line="220" w:lineRule="auto"/>
-              <w:jc w:val="center"/>
-            </w:pPr>
-            <w:r>
-              <w:rPr>
-                <w:sz w:val="18"/>
-              </w:rPr>
-              <w:t xml:space="preserve">49 / 1 / 40</w:t>
-            </w:r>
-          </w:p>
-        </w:tc>
-        <w:tc>
-          <w:tcPr>
-            <w:tcW w:w="900" w:type="dxa"/>
-          </w:tcPr>
-          <w:p>
-            <w:pPr>
-              <w:spacing w:after="0" w:line="220" w:lineRule="auto"/>
-              <w:jc w:val="center"/>
-            </w:pPr>
-            <w:r>
-              <w:rPr>
-                <w:sz w:val="18"/>
-              </w:rPr>
-              <w:t xml:space="preserve">0.89</w:t>
-            </w:r>
-          </w:p>
-        </w:tc>
-        <w:tc>
-          <w:tcPr>
-            <w:tcW w:w="900" w:type="dxa"/>
-          </w:tcPr>
-          <w:p>
-            <w:pPr>
-              <w:spacing w:after="0" w:line="220" w:lineRule="auto"/>
-              <w:jc w:val="center"/>
-            </w:pPr>
-            <w:r>
-              <w:rPr>
-                <w:sz w:val="18"/>
-              </w:rPr>
-              <w:t xml:space="preserve">0.89</w:t>
-            </w:r>
-          </w:p>
-        </w:tc>
-      </w:tr>
-      <w:tr>
-        <w:trPr>
-          <w:cantSplit/>
-        </w:trPr>
-        <w:tc>
-          <w:tcPr>
-            <w:tcW w:w="4060" w:type="dxa"/>
-          </w:tcPr>
-          <w:p>
-            <w:pPr>
-              <w:spacing w:after="0" w:line="220" w:lineRule="auto"/>
-            </w:pPr>
-            <w:r>
-              <w:rPr>
-                <w:sz w:val="18"/>
-              </w:rPr>
-              <w:t xml:space="preserve">S6–S8 Recorded + Open / Recorded + Closed</w:t>
-            </w:r>
-          </w:p>
-        </w:tc>
-        <w:tc>
-          <w:tcPr>
-            <w:tcW w:w="700" w:type="dxa"/>
-          </w:tcPr>
-          <w:p>
-            <w:pPr>
-              <w:spacing w:after="0" w:line="220" w:lineRule="auto"/>
-              <w:jc w:val="center"/>
-            </w:pPr>
-            <w:r>
-              <w:rPr>
-                <w:sz w:val="18"/>
-              </w:rPr>
-              <w:t xml:space="preserve">90</w:t>
-            </w:r>
-          </w:p>
-        </w:tc>
-        <w:tc>
-          <w:tcPr>
-            <w:tcW w:w="1500" w:type="dxa"/>
-          </w:tcPr>
-          <w:p>
-            <w:pPr>
-              <w:spacing w:after="0" w:line="220" w:lineRule="auto"/>
-              <w:jc w:val="center"/>
-            </w:pPr>
-            <w:r>
-              <w:rPr>
-                <w:sz w:val="18"/>
-              </w:rPr>
-              <w:t xml:space="preserve">−28</w:t>
-            </w:r>
-          </w:p>
-        </w:tc>
-        <w:tc>
-          <w:tcPr>
-            <w:tcW w:w="1300" w:type="dxa"/>
-          </w:tcPr>
-          <w:p>
-            <w:pPr>
-              <w:spacing w:after="0" w:line="220" w:lineRule="auto"/>
-              <w:jc w:val="center"/>
-            </w:pPr>
-            <w:r>
-              <w:rPr>
-                <w:sz w:val="18"/>
-              </w:rPr>
-              <w:t xml:space="preserve">75 / 2 / 13</w:t>
-            </w:r>
-          </w:p>
-        </w:tc>
-        <w:tc>
-          <w:tcPr>
-            <w:tcW w:w="900" w:type="dxa"/>
-          </w:tcPr>
-          <w:p>
-            <w:pPr>
-              <w:spacing w:after="0" w:line="220" w:lineRule="auto"/>
-              <w:jc w:val="center"/>
-            </w:pPr>
-            <w:r>
-              <w:rPr>
-                <w:sz w:val="18"/>
-              </w:rPr>
-              <w:t xml:space="preserve">&lt; 0.0001</w:t>
-            </w:r>
-          </w:p>
-        </w:tc>
-        <w:tc>
-          <w:tcPr>
-            <w:tcW w:w="900" w:type="dxa"/>
-          </w:tcPr>
-          <w:p>
-            <w:pPr>
-              <w:spacing w:after="0" w:line="220" w:lineRule="auto"/>
-              <w:jc w:val="center"/>
-            </w:pPr>
-            <w:r>
-              <w:rPr>
-                <w:sz w:val="18"/>
-              </w:rPr>
-              <w:t xml:space="preserve">&lt; 0.0001</w:t>
-            </w:r>
-          </w:p>
-        </w:tc>
-      </w:tr>
-      <w:tr>
-        <w:trPr>
-          <w:cantSplit/>
-        </w:trPr>
-        <w:tc>
-          <w:tcPr>
-            <w:tcW w:w="4060" w:type="dxa"/>
-          </w:tcPr>
-          <w:p>
-            <w:pPr>
-              <w:spacing w:after="0" w:line="220" w:lineRule="auto"/>
-            </w:pPr>
-            <w:r>
-              <w:rPr>
-                <w:sz w:val="18"/>
-              </w:rPr>
-              <w:t xml:space="preserve">S1–S5 control Recorded + Open / Recorded + Closed</w:t>
-            </w:r>
-          </w:p>
-        </w:tc>
-        <w:tc>
-          <w:tcPr>
-            <w:tcW w:w="700" w:type="dxa"/>
-          </w:tcPr>
-          <w:p>
-            <w:pPr>
-              <w:spacing w:after="0" w:line="220" w:lineRule="auto"/>
-              <w:jc w:val="center"/>
-            </w:pPr>
-            <w:r>
-              <w:rPr>
-                <w:sz w:val="18"/>
-              </w:rPr>
-              <w:t xml:space="preserve">75</w:t>
-            </w:r>
-          </w:p>
-        </w:tc>
-        <w:tc>
-          <w:tcPr>
-            <w:tcW w:w="1500" w:type="dxa"/>
-          </w:tcPr>
-          <w:p>
-            <w:pPr>
-              <w:spacing w:after="0" w:line="220" w:lineRule="auto"/>
-              <w:jc w:val="center"/>
-            </w:pPr>
-            <w:r>
-              <w:rPr>
-                <w:sz w:val="18"/>
-              </w:rPr>
-              <w:t xml:space="preserve">−35</w:t>
-            </w:r>
-          </w:p>
-        </w:tc>
-        <w:tc>
-          <w:tcPr>
-            <w:tcW w:w="1300" w:type="dxa"/>
-          </w:tcPr>
-          <w:p>
-            <w:pPr>
-              <w:spacing w:after="0" w:line="220" w:lineRule="auto"/>
-              <w:jc w:val="center"/>
-            </w:pPr>
-            <w:r>
-              <w:rPr>
-                <w:sz w:val="18"/>
-              </w:rPr>
-              <w:t xml:space="preserve">62 / 6 / 7</w:t>
-            </w:r>
-          </w:p>
-        </w:tc>
-        <w:tc>
-          <w:tcPr>
-            <w:tcW w:w="900" w:type="dxa"/>
-          </w:tcPr>
-          <w:p>
-            <w:pPr>
-              <w:spacing w:after="0" w:line="220" w:lineRule="auto"/>
-              <w:jc w:val="center"/>
-            </w:pPr>
-            <w:r>
-              <w:rPr>
-                <w:sz w:val="18"/>
-              </w:rPr>
-              <w:t xml:space="preserve">0.0001</w:t>
-            </w:r>
-          </w:p>
-        </w:tc>
-        <w:tc>
-          <w:tcPr>
-            <w:tcW w:w="900" w:type="dxa"/>
-          </w:tcPr>
-          <w:p>
-            <w:pPr>
-              <w:spacing w:after="0" w:line="220" w:lineRule="auto"/>
-              <w:jc w:val="center"/>
-            </w:pPr>
-            <w:r>
-              <w:rPr>
-                <w:sz w:val="18"/>
-              </w:rPr>
-              <w:t xml:space="preserve">0.0007</w:t>
-            </w:r>
-          </w:p>
-        </w:tc>
-      </w:tr>
-      <w:tr>
-        <w:trPr>
-          <w:cantSplit/>
-        </w:trPr>
-        <w:tc>
-          <w:tcPr>
-            <w:tcW w:w="4060" w:type="dxa"/>
-          </w:tcPr>
-          <w:p>
-            <w:pPr>
-              <w:spacing w:after="0" w:line="220" w:lineRule="auto"/>
-            </w:pPr>
-            <w:r>
-              <w:rPr>
-                <w:sz w:val="18"/>
-              </w:rPr>
-              <w:t xml:space="preserve">S6–S8 Recorded + Open / Seeds + Open</w:t>
-            </w:r>
-          </w:p>
-        </w:tc>
-        <w:tc>
-          <w:tcPr>
-            <w:tcW w:w="700" w:type="dxa"/>
-          </w:tcPr>
-          <w:p>
-            <w:pPr>
-              <w:spacing w:after="0" w:line="220" w:lineRule="auto"/>
-              <w:jc w:val="center"/>
-            </w:pPr>
-            <w:r>
-              <w:rPr>
-                <w:sz w:val="18"/>
-              </w:rPr>
-              <w:t xml:space="preserve">90</w:t>
-            </w:r>
-          </w:p>
-        </w:tc>
-        <w:tc>
-          <w:tcPr>
-            <w:tcW w:w="1500" w:type="dxa"/>
-          </w:tcPr>
-          <w:p>
-            <w:pPr>
-              <w:spacing w:after="0" w:line="220" w:lineRule="auto"/>
-              <w:jc w:val="center"/>
-            </w:pPr>
-            <w:r>
-              <w:rPr>
-                <w:sz w:val="18"/>
-              </w:rPr>
-              <w:t xml:space="preserve">−27</w:t>
-            </w:r>
-          </w:p>
-        </w:tc>
-        <w:tc>
-          <w:tcPr>
-            <w:tcW w:w="1300" w:type="dxa"/>
-          </w:tcPr>
-          <w:p>
-            <w:pPr>
-              <w:spacing w:after="0" w:line="220" w:lineRule="auto"/>
-              <w:jc w:val="center"/>
-            </w:pPr>
-            <w:r>
-              <w:rPr>
-                <w:sz w:val="18"/>
-              </w:rPr>
-              <w:t xml:space="preserve">57 / 1 / 32</w:t>
-            </w:r>
-          </w:p>
-        </w:tc>
-        <w:tc>
-          <w:tcPr>
-            <w:tcW w:w="900" w:type="dxa"/>
-          </w:tcPr>
-          <w:p>
-            <w:pPr>
-              <w:spacing w:after="0" w:line="220" w:lineRule="auto"/>
-              <w:jc w:val="center"/>
-            </w:pPr>
-            <w:r>
-              <w:rPr>
-                <w:sz w:val="18"/>
-              </w:rPr>
-              <w:t xml:space="preserve">0.0005</w:t>
-            </w:r>
-          </w:p>
-        </w:tc>
-        <w:tc>
-          <w:tcPr>
-            <w:tcW w:w="900" w:type="dxa"/>
-          </w:tcPr>
-          <w:p>
-            <w:pPr>
-              <w:spacing w:after="0" w:line="220" w:lineRule="auto"/>
-              <w:jc w:val="center"/>
-            </w:pPr>
-            <w:r>
-              <w:rPr>
-                <w:sz w:val="18"/>
-              </w:rPr>
-              <w:t xml:space="preserve">0.003</w:t>
-            </w:r>
-          </w:p>
-        </w:tc>
-      </w:tr>
-    </w:tbl>
-    <w:p>
-      <w:pPr>
-        <w:rPr/>
-      </w:pPr>
-      <w:r>
-        <w:t xml:space="preserve"/>
-      </w:r>
-    </w:p>
-    <w:p>
-      <w:pPr>
-        <w:pStyle w:val="Heading1"/>
-        <w:rPr/>
-      </w:pPr>
-      <w:r>
         <w:t xml:space="preserve">Search budget and timing harness</w:t>
       </w:r>
     </w:p>

</xml_diff>

<commit_message>
Reviewer round: domain dependence stated in the abstract, V-A and VI; nominal shadow-core initialization stated with the omission test; cost-sensitivity paragraph corrected (reference fraction in the physical cost, replay scope); budget paragraph deduplicated; hindcast stop tolerance and F3 arrival note; fuel class wording; S5 noise and (2); LB source; thesis cited as [61]; supplement table numbers as plain text
Co-Authored-By: Claude Fable 5.1 <noreply@anthropic.com>
Claude-Session: https://claude.ai/code/session_01SpJY1eTMuWxnLRbAr2HJ4M
</commit_message>
<xml_diff>
--- a/02_Article/ieee_systems/DisasterAware_Supplementary_Material.docx
+++ b/02_Article/ieee_systems/DisasterAware_Supplementary_Material.docx
@@ -155,11 +155,9 @@
       <w:r>
         <w:t>Table S</w:t>
       </w:r>
-      <w:fldSimple w:instr=" SEQ VODASupTable \r 1 \* ARABIC ">
-        <w:r>
-          <w:t>1</w:t>
-        </w:r>
-      </w:fldSimple>
+      <w:r>
+        <w:t xml:space="preserve">1</w:t>
+      </w:r>
       <w:r>
         <w:t>. The five seed rules.</w:t>
       </w:r>
@@ -669,11 +667,9 @@
       <w:r>
         <w:t>Table S</w:t>
       </w:r>
-      <w:fldSimple w:instr=" SEQ VODASupTable \* ARABIC ">
-        <w:r>
-          <w:t>2</w:t>
-        </w:r>
-      </w:fldSimple>
+      <w:r>
+        <w:t xml:space="preserve">2</w:t>
+      </w:r>
       <w:r>
         <w:t>. The 35 additional rules.</w:t>
       </w:r>
@@ -3464,13 +3460,9 @@
       <w:r>
         <w:t>Table S</w:t>
       </w:r>
-      <w:bookmarkStart w:id="901" w:name="_RefSupTabS3"/>
-      <w:fldSimple w:instr=" SEQ VODASupTable \* ARABIC ">
-        <w:r>
-          <w:t>3</w:t>
-        </w:r>
-      </w:fldSimple>
-      <w:bookmarkEnd w:id="901"/>
+      <w:r>
+        <w:t xml:space="preserve">3</w:t>
+      </w:r>
       <w:r>
         <w:t>. Recorded rules and their intervention definitions</w:t>
       </w:r>
@@ -4546,11 +4538,9 @@
       <w:r>
         <w:t xml:space="preserve">The reply is one minified JSON object with a list of six candidates. Each candidate carries antecedents over the five concepts, consequents over the six families and, for a composed intervention, a new_intervention with up to three clauses, as in the template. The object below is an admitted candidate as recorded in the campaign log. The model named it populated ready belt; Table S</w:t>
       </w:r>
-      <w:fldSimple w:instr=" REF _RefSupTabS3 \h ">
-        <w:r>
-          <w:t>3</w:t>
-        </w:r>
-      </w:fldSimple>
+      <w:r>
+        <w:t xml:space="preserve">3</w:t>
+      </w:r>
       <w:r>
         <w:t xml:space="preserve"> lists the recorded tactic of this archetype under the name asset collar.</w:t>
       </w:r>

</xml_diff>

<commit_message>
Budget paragraph with the development-seed limitation and the non-monotone point; VI budget sentence; abstract 246 words with the large-domain fractions; multi-citations split into [n], [m]; supplement subscripts (applied on the Word-saved version)
Co-Authored-By: Claude Fable 5.1 <noreply@anthropic.com>
Claude-Session: https://claude.ai/code/session_01SpJY1eTMuWxnLRbAr2HJ4M
</commit_message>
<xml_diff>
--- a/02_Article/ieee_systems/DisasterAware_Supplementary_Material.docx
+++ b/02_Article/ieee_systems/DisasterAware_Supplementary_Material.docx
@@ -3975,7 +3975,79 @@
         <w:t xml:space="preserve">k</w:t>
       </w:r>
       <w:r>
-        <w:t xml:space="preserve"> = r_base · g_moist · g_wind · g_slope · g_aspect, with g_moist = clip(1 − F</w:t>
+        <w:t xml:space="preserve"> = </w:t>
+      </w:r>
+      <w:r>
+        <w:t xml:space="preserve">r</w:t>
+      </w:r>
+      <w:r>
+        <w:rPr>
+          <w:vertAlign w:val="subscript"/>
+        </w:rPr>
+        <w:t xml:space="preserve">base</w:t>
+      </w:r>
+      <w:r>
+        <w:t xml:space="preserve"> · </w:t>
+      </w:r>
+      <w:r>
+        <w:t xml:space="preserve">g</w:t>
+      </w:r>
+      <w:r>
+        <w:rPr>
+          <w:vertAlign w:val="subscript"/>
+        </w:rPr>
+        <w:t xml:space="preserve">moist</w:t>
+      </w:r>
+      <w:r>
+        <w:t xml:space="preserve"> · </w:t>
+      </w:r>
+      <w:r>
+        <w:t xml:space="preserve">g</w:t>
+      </w:r>
+      <w:r>
+        <w:rPr>
+          <w:vertAlign w:val="subscript"/>
+        </w:rPr>
+        <w:t xml:space="preserve">wind</w:t>
+      </w:r>
+      <w:r>
+        <w:t xml:space="preserve"> · </w:t>
+      </w:r>
+      <w:r>
+        <w:t xml:space="preserve">g</w:t>
+      </w:r>
+      <w:r>
+        <w:rPr>
+          <w:vertAlign w:val="subscript"/>
+        </w:rPr>
+        <w:t xml:space="preserve">slope</w:t>
+      </w:r>
+      <w:r>
+        <w:t xml:space="preserve"> · </w:t>
+      </w:r>
+      <w:r>
+        <w:t xml:space="preserve">g</w:t>
+      </w:r>
+      <w:r>
+        <w:rPr>
+          <w:vertAlign w:val="subscript"/>
+        </w:rPr>
+        <w:t xml:space="preserve">aspect</w:t>
+      </w:r>
+      <w:r>
+        <w:t xml:space="preserve">, with </w:t>
+      </w:r>
+      <w:r>
+        <w:t xml:space="preserve">g</w:t>
+      </w:r>
+      <w:r>
+        <w:rPr>
+          <w:vertAlign w:val="subscript"/>
+        </w:rPr>
+        <w:t xml:space="preserve">moist</w:t>
+      </w:r>
+      <w:r>
+        <w:t xml:space="preserve"> = clip(1 − F</w:t>
       </w:r>
       <w:r>
         <w:rPr>
@@ -3993,7 +4065,127 @@
         <w:t xml:space="preserve">m</w:t>
       </w:r>
       <w:r>
-        <w:t xml:space="preserve">, 0, 1), g_wind = 1 + a_w tanh(Ws/w0) with w0 = 10 m/s, g_slope = clip(1 + a_s tan(slope), 0, 3) and g_aspect = max(1 + a_asp cos(aspect − Wd), 0). The fuel constants are, for grass, shrub, pine litter and hardwood: r_base 2.00, 0.80, 0.80, 0.30 m/min; ε</w:t>
+        <w:t xml:space="preserve">, 0, 1), </w:t>
+      </w:r>
+      <w:r>
+        <w:t xml:space="preserve">g</w:t>
+      </w:r>
+      <w:r>
+        <w:rPr>
+          <w:vertAlign w:val="subscript"/>
+        </w:rPr>
+        <w:t xml:space="preserve">wind</w:t>
+      </w:r>
+      <w:r>
+        <w:t xml:space="preserve"> = 1 + </w:t>
+      </w:r>
+      <w:r>
+        <w:t xml:space="preserve">a</w:t>
+      </w:r>
+      <w:r>
+        <w:rPr>
+          <w:vertAlign w:val="subscript"/>
+        </w:rPr>
+        <w:t xml:space="preserve">w</w:t>
+      </w:r>
+      <w:r>
+        <w:t xml:space="preserve"> tanh(W</w:t>
+      </w:r>
+      <w:r>
+        <w:rPr>
+          <w:vertAlign w:val="subscript"/>
+        </w:rPr>
+        <w:t xml:space="preserve">s</w:t>
+      </w:r>
+      <w:r>
+        <w:t xml:space="preserve">/w</w:t>
+      </w:r>
+      <w:r>
+        <w:rPr>
+          <w:vertAlign w:val="subscript"/>
+        </w:rPr>
+        <w:t xml:space="preserve">0</w:t>
+      </w:r>
+      <w:r>
+        <w:t xml:space="preserve">) with w</w:t>
+      </w:r>
+      <w:r>
+        <w:rPr>
+          <w:vertAlign w:val="subscript"/>
+        </w:rPr>
+        <w:t xml:space="preserve">0</w:t>
+      </w:r>
+      <w:r>
+        <w:t xml:space="preserve"> = 10 m/s, </w:t>
+      </w:r>
+      <w:r>
+        <w:t xml:space="preserve">g</w:t>
+      </w:r>
+      <w:r>
+        <w:rPr>
+          <w:vertAlign w:val="subscript"/>
+        </w:rPr>
+        <w:t xml:space="preserve">slope</w:t>
+      </w:r>
+      <w:r>
+        <w:t xml:space="preserve"> = clip(1 + </w:t>
+      </w:r>
+      <w:r>
+        <w:t xml:space="preserve">a</w:t>
+      </w:r>
+      <w:r>
+        <w:rPr>
+          <w:vertAlign w:val="subscript"/>
+        </w:rPr>
+        <w:t xml:space="preserve">s</w:t>
+      </w:r>
+      <w:r>
+        <w:t xml:space="preserve"> tan(slope), 0, 3) and </w:t>
+      </w:r>
+      <w:r>
+        <w:t xml:space="preserve">g</w:t>
+      </w:r>
+      <w:r>
+        <w:rPr>
+          <w:vertAlign w:val="subscript"/>
+        </w:rPr>
+        <w:t xml:space="preserve">aspect</w:t>
+      </w:r>
+      <w:r>
+        <w:t xml:space="preserve"> = max(1 + </w:t>
+      </w:r>
+      <w:r>
+        <w:t xml:space="preserve">a</w:t>
+      </w:r>
+      <w:r>
+        <w:rPr>
+          <w:vertAlign w:val="subscript"/>
+        </w:rPr>
+        <w:t xml:space="preserve">asp</w:t>
+      </w:r>
+      <w:r>
+        <w:t xml:space="preserve"> cos(aspect − W</w:t>
+      </w:r>
+      <w:r>
+        <w:rPr>
+          <w:vertAlign w:val="subscript"/>
+        </w:rPr>
+        <w:t xml:space="preserve">d</w:t>
+      </w:r>
+      <w:r>
+        <w:t xml:space="preserve">), 0). The fuel constants are, for grass, shrub, pine litter and hardwood: </w:t>
+      </w:r>
+      <w:r>
+        <w:t xml:space="preserve">r</w:t>
+      </w:r>
+      <w:r>
+        <w:rPr>
+          <w:vertAlign w:val="subscript"/>
+        </w:rPr>
+        <w:t xml:space="preserve">base</w:t>
+      </w:r>
+      <w:r>
+        <w:t xml:space="preserve"> 2.00, 0.80, 0.80, 0.30 m/min; ε</w:t>
       </w:r>
       <w:r>
         <w:rPr>
@@ -4002,7 +4194,55 @@
         <w:t xml:space="preserve">m</w:t>
       </w:r>
       <w:r>
-        <w:t xml:space="preserve"> 0.15, 0.20, 0.25, 0.30; a_w 25, 15, 6, 4; a_s 2.0, 2.0, 2.2, 1.8; a_asp 0.30, 0.25, 0.20, 0.15; b_base 0.85, 0.35, 0.15, 0.08. Non-fuel and water have zero rate. The ignition threshold on the accumulated influence is 0.125, the extinction load 0.03 of the nominal load.</w:t>
+        <w:t xml:space="preserve"> 0.15, 0.20, 0.25, 0.30; </w:t>
+      </w:r>
+      <w:r>
+        <w:t xml:space="preserve">a</w:t>
+      </w:r>
+      <w:r>
+        <w:rPr>
+          <w:vertAlign w:val="subscript"/>
+        </w:rPr>
+        <w:t xml:space="preserve">w</w:t>
+      </w:r>
+      <w:r>
+        <w:t xml:space="preserve"> 25, 15, 6, 4; </w:t>
+      </w:r>
+      <w:r>
+        <w:t xml:space="preserve">a</w:t>
+      </w:r>
+      <w:r>
+        <w:rPr>
+          <w:vertAlign w:val="subscript"/>
+        </w:rPr>
+        <w:t xml:space="preserve">s</w:t>
+      </w:r>
+      <w:r>
+        <w:t xml:space="preserve"> 2.0, 2.0, 2.2, 1.8; </w:t>
+      </w:r>
+      <w:r>
+        <w:t xml:space="preserve">a</w:t>
+      </w:r>
+      <w:r>
+        <w:rPr>
+          <w:vertAlign w:val="subscript"/>
+        </w:rPr>
+        <w:t xml:space="preserve">asp</w:t>
+      </w:r>
+      <w:r>
+        <w:t xml:space="preserve"> 0.30, 0.25, 0.20, 0.15; </w:t>
+      </w:r>
+      <w:r>
+        <w:t xml:space="preserve">b</w:t>
+      </w:r>
+      <w:r>
+        <w:rPr>
+          <w:vertAlign w:val="subscript"/>
+        </w:rPr>
+        <w:t xml:space="preserve">base</w:t>
+      </w:r>
+      <w:r>
+        <w:t xml:space="preserve"> 0.85, 0.35, 0.15, 0.08. Non-fuel and water have zero rate. The ignition threshold on the accumulated influence is 0.125, the extinction load 0.03 of the nominal load.</w:t>
       </w:r>
     </w:p>
     <w:p>
@@ -4010,10 +4250,28 @@
         <w:rPr/>
       </w:pPr>
       <w:r>
-        <w:t xml:space="preserve">Combustion (5). The fraction consumed per reference step is Fb = clip(b_base (1 − </w:t>
-      </w:r>
-      <w:r>
-        <w:t xml:space="preserve">F</w:t>
+        <w:t xml:space="preserve">Combustion (5). The fraction consumed per reference step is F</w:t>
+      </w:r>
+      <w:r>
+        <w:rPr>
+          <w:vertAlign w:val="subscript"/>
+        </w:rPr>
+        <w:t xml:space="preserve">b</w:t>
+      </w:r>
+      <w:r>
+        <w:t xml:space="preserve"> = clip(</w:t>
+      </w:r>
+      <w:r>
+        <w:t xml:space="preserve">b</w:t>
+      </w:r>
+      <w:r>
+        <w:rPr>
+          <w:vertAlign w:val="subscript"/>
+        </w:rPr>
+        <w:t xml:space="preserve">base</w:t>
+      </w:r>
+      <w:r>
+        <w:t xml:space="preserve"> (1 − F</w:t>
       </w:r>
       <w:r>
         <w:rPr>
@@ -4022,7 +4280,34 @@
         <w:t xml:space="preserve">m</w:t>
       </w:r>
       <w:r>
-        <w:t xml:space="preserve">)(1 − 0.8 rret), 0, 1), where rret is the coating field; it is compounded over substeps. Coating also floors the fuel moisture at 0.45 rret and decays by 0.003 per minute.</w:t>
+        <w:t xml:space="preserve">)(1 − 0.8 r</w:t>
+      </w:r>
+      <w:r>
+        <w:rPr>
+          <w:vertAlign w:val="subscript"/>
+        </w:rPr>
+        <w:t xml:space="preserve">ret</w:t>
+      </w:r>
+      <w:r>
+        <w:t xml:space="preserve">), 0, 1), where r</w:t>
+      </w:r>
+      <w:r>
+        <w:rPr>
+          <w:vertAlign w:val="subscript"/>
+        </w:rPr>
+        <w:t xml:space="preserve">ret</w:t>
+      </w:r>
+      <w:r>
+        <w:t xml:space="preserve"> is the coating field; it is compounded over substeps. Coating also floors the fuel moisture at 0.45 r</w:t>
+      </w:r>
+      <w:r>
+        <w:rPr>
+          <w:vertAlign w:val="subscript"/>
+        </w:rPr>
+        <w:t xml:space="preserve">ret</w:t>
+      </w:r>
+      <w:r>
+        <w:t xml:space="preserve"> and decays by 0.003 per minute.</w:t>
       </w:r>
     </w:p>
     <w:p>
@@ -4030,7 +4315,214 @@
         <w:rPr/>
       </w:pPr>
       <w:r>
-        <w:t xml:space="preserve">Suppression removal (5). Fr = αs ηcap ηavail ηreach ηeff with ηcap = Rc/Rc,max, ηavail = Ra, ηreach = exp(−βt Rt) Gc and ηeff = Re/(1 + γI I), where αs = 0.20, βt = 0.03 per minute, γI = 2, Rc,max = 1 and Gc is the road-access factor, replaced by the aerial share where a resource is airborne. A burning cell is quenched when the removal before the gain exceeds 0.15 of its fuel.</w:t>
+        <w:t xml:space="preserve">Suppression removal (5). F</w:t>
+      </w:r>
+      <w:r>
+        <w:rPr>
+          <w:vertAlign w:val="subscript"/>
+        </w:rPr>
+        <w:t xml:space="preserve">r</w:t>
+      </w:r>
+      <w:r>
+        <w:t xml:space="preserve"> = α</w:t>
+      </w:r>
+      <w:r>
+        <w:rPr>
+          <w:vertAlign w:val="subscript"/>
+        </w:rPr>
+        <w:t xml:space="preserve">s</w:t>
+      </w:r>
+      <w:r>
+        <w:t xml:space="preserve"> η</w:t>
+      </w:r>
+      <w:r>
+        <w:rPr>
+          <w:vertAlign w:val="subscript"/>
+        </w:rPr>
+        <w:t xml:space="preserve">cap</w:t>
+      </w:r>
+      <w:r>
+        <w:t xml:space="preserve"> η</w:t>
+      </w:r>
+      <w:r>
+        <w:rPr>
+          <w:vertAlign w:val="subscript"/>
+        </w:rPr>
+        <w:t xml:space="preserve">avail</w:t>
+      </w:r>
+      <w:r>
+        <w:t xml:space="preserve"> η</w:t>
+      </w:r>
+      <w:r>
+        <w:rPr>
+          <w:vertAlign w:val="subscript"/>
+        </w:rPr>
+        <w:t xml:space="preserve">reach</w:t>
+      </w:r>
+      <w:r>
+        <w:t xml:space="preserve"> η</w:t>
+      </w:r>
+      <w:r>
+        <w:rPr>
+          <w:vertAlign w:val="subscript"/>
+        </w:rPr>
+        <w:t xml:space="preserve">eff</w:t>
+      </w:r>
+      <w:r>
+        <w:t xml:space="preserve"> with η</w:t>
+      </w:r>
+      <w:r>
+        <w:rPr>
+          <w:vertAlign w:val="subscript"/>
+        </w:rPr>
+        <w:t xml:space="preserve">cap</w:t>
+      </w:r>
+      <w:r>
+        <w:t xml:space="preserve"> = R</w:t>
+      </w:r>
+      <w:r>
+        <w:rPr>
+          <w:vertAlign w:val="subscript"/>
+        </w:rPr>
+        <w:t xml:space="preserve">c</w:t>
+      </w:r>
+      <w:r>
+        <w:t xml:space="preserve">/R</w:t>
+      </w:r>
+      <w:r>
+        <w:rPr>
+          <w:vertAlign w:val="subscript"/>
+        </w:rPr>
+        <w:t xml:space="preserve">c</w:t>
+      </w:r>
+      <w:r>
+        <w:t xml:space="preserve">,max, η</w:t>
+      </w:r>
+      <w:r>
+        <w:rPr>
+          <w:vertAlign w:val="subscript"/>
+        </w:rPr>
+        <w:t xml:space="preserve">avail</w:t>
+      </w:r>
+      <w:r>
+        <w:t xml:space="preserve"> = R</w:t>
+      </w:r>
+      <w:r>
+        <w:rPr>
+          <w:vertAlign w:val="subscript"/>
+        </w:rPr>
+        <w:t xml:space="preserve">a</w:t>
+      </w:r>
+      <w:r>
+        <w:t xml:space="preserve">, η</w:t>
+      </w:r>
+      <w:r>
+        <w:rPr>
+          <w:vertAlign w:val="subscript"/>
+        </w:rPr>
+        <w:t xml:space="preserve">reach</w:t>
+      </w:r>
+      <w:r>
+        <w:t xml:space="preserve"> = exp(−β</w:t>
+      </w:r>
+      <w:r>
+        <w:rPr>
+          <w:vertAlign w:val="subscript"/>
+        </w:rPr>
+        <w:t xml:space="preserve">t</w:t>
+      </w:r>
+      <w:r>
+        <w:t xml:space="preserve"> R</w:t>
+      </w:r>
+      <w:r>
+        <w:rPr>
+          <w:vertAlign w:val="subscript"/>
+        </w:rPr>
+        <w:t xml:space="preserve">t</w:t>
+      </w:r>
+      <w:r>
+        <w:t xml:space="preserve">) G</w:t>
+      </w:r>
+      <w:r>
+        <w:rPr>
+          <w:vertAlign w:val="subscript"/>
+        </w:rPr>
+        <w:t xml:space="preserve">c</w:t>
+      </w:r>
+      <w:r>
+        <w:t xml:space="preserve"> and η</w:t>
+      </w:r>
+      <w:r>
+        <w:rPr>
+          <w:vertAlign w:val="subscript"/>
+        </w:rPr>
+        <w:t xml:space="preserve">eff</w:t>
+      </w:r>
+      <w:r>
+        <w:t xml:space="preserve"> = R</w:t>
+      </w:r>
+      <w:r>
+        <w:rPr>
+          <w:vertAlign w:val="subscript"/>
+        </w:rPr>
+        <w:t xml:space="preserve">e</w:t>
+      </w:r>
+      <w:r>
+        <w:t xml:space="preserve">/(1 + γ</w:t>
+      </w:r>
+      <w:r>
+        <w:rPr>
+          <w:vertAlign w:val="subscript"/>
+        </w:rPr>
+        <w:t xml:space="preserve">I</w:t>
+      </w:r>
+      <w:r>
+        <w:t xml:space="preserve"> I), where α</w:t>
+      </w:r>
+      <w:r>
+        <w:rPr>
+          <w:vertAlign w:val="subscript"/>
+        </w:rPr>
+        <w:t xml:space="preserve">s</w:t>
+      </w:r>
+      <w:r>
+        <w:t xml:space="preserve"> = 0.20, β</w:t>
+      </w:r>
+      <w:r>
+        <w:rPr>
+          <w:vertAlign w:val="subscript"/>
+        </w:rPr>
+        <w:t xml:space="preserve">t</w:t>
+      </w:r>
+      <w:r>
+        <w:t xml:space="preserve"> = 0.03 per minute, γ</w:t>
+      </w:r>
+      <w:r>
+        <w:rPr>
+          <w:vertAlign w:val="subscript"/>
+        </w:rPr>
+        <w:t xml:space="preserve">I</w:t>
+      </w:r>
+      <w:r>
+        <w:t xml:space="preserve"> = 2, R</w:t>
+      </w:r>
+      <w:r>
+        <w:rPr>
+          <w:vertAlign w:val="subscript"/>
+        </w:rPr>
+        <w:t xml:space="preserve">c</w:t>
+      </w:r>
+      <w:r>
+        <w:t xml:space="preserve">,max = 1 and G</w:t>
+      </w:r>
+      <w:r>
+        <w:rPr>
+          <w:vertAlign w:val="subscript"/>
+        </w:rPr>
+        <w:t xml:space="preserve">c</w:t>
+      </w:r>
+      <w:r>
+        <w:t xml:space="preserve"> is the road-access factor, replaced by the aerial share where a resource is airborne. A burning cell is quenched when the removal before the gain exceeds 0.15 of its fuel.</w:t>
       </w:r>
     </w:p>
     <w:p>
@@ -4038,7 +4530,121 @@
         <w:rPr/>
       </w:pPr>
       <w:r>
-        <w:t xml:space="preserve">Intensity proxy (3). I_{k+1} = B_{k+1} tanh(β (FL/Fmax + γw Ws/Wmax + γs tan(slope)/tan 45°)) with β = 2, γw = 0.5, γs = 0.3, Fmax = 1 and Wmax = 20 m/s; the proxy is zero in non-burning cells.</w:t>
+        <w:t xml:space="preserve">Intensity proxy (3). </w:t>
+      </w:r>
+      <w:r>
+        <w:t xml:space="preserve">I</w:t>
+      </w:r>
+      <w:r>
+        <w:rPr>
+          <w:vertAlign w:val="subscript"/>
+        </w:rPr>
+        <w:t xml:space="preserve">k+1</w:t>
+      </w:r>
+      <w:r>
+        <w:t xml:space="preserve"> = </w:t>
+      </w:r>
+      <w:r>
+        <w:t xml:space="preserve">B</w:t>
+      </w:r>
+      <w:r>
+        <w:rPr>
+          <w:vertAlign w:val="subscript"/>
+        </w:rPr>
+        <w:t xml:space="preserve">k+1</w:t>
+      </w:r>
+      <w:r>
+        <w:t xml:space="preserve"> tanh(β (F</w:t>
+      </w:r>
+      <w:r>
+        <w:rPr>
+          <w:vertAlign w:val="subscript"/>
+        </w:rPr>
+        <w:t xml:space="preserve">L</w:t>
+      </w:r>
+      <w:r>
+        <w:t xml:space="preserve">/F</w:t>
+      </w:r>
+      <w:r>
+        <w:rPr>
+          <w:vertAlign w:val="subscript"/>
+        </w:rPr>
+        <w:t xml:space="preserve">max</w:t>
+      </w:r>
+      <w:r>
+        <w:t xml:space="preserve"> + γ</w:t>
+      </w:r>
+      <w:r>
+        <w:rPr>
+          <w:vertAlign w:val="subscript"/>
+        </w:rPr>
+        <w:t xml:space="preserve">w</w:t>
+      </w:r>
+      <w:r>
+        <w:t xml:space="preserve"> W</w:t>
+      </w:r>
+      <w:r>
+        <w:rPr>
+          <w:vertAlign w:val="subscript"/>
+        </w:rPr>
+        <w:t xml:space="preserve">s</w:t>
+      </w:r>
+      <w:r>
+        <w:t xml:space="preserve">/W</w:t>
+      </w:r>
+      <w:r>
+        <w:rPr>
+          <w:vertAlign w:val="subscript"/>
+        </w:rPr>
+        <w:t xml:space="preserve">max</w:t>
+      </w:r>
+      <w:r>
+        <w:t xml:space="preserve"> + γ</w:t>
+      </w:r>
+      <w:r>
+        <w:rPr>
+          <w:vertAlign w:val="subscript"/>
+        </w:rPr>
+        <w:t xml:space="preserve">s</w:t>
+      </w:r>
+      <w:r>
+        <w:t xml:space="preserve"> tan(slope)/tan 45°)) with β = 2, γ</w:t>
+      </w:r>
+      <w:r>
+        <w:rPr>
+          <w:vertAlign w:val="subscript"/>
+        </w:rPr>
+        <w:t xml:space="preserve">w</w:t>
+      </w:r>
+      <w:r>
+        <w:t xml:space="preserve"> = 0.5, γ</w:t>
+      </w:r>
+      <w:r>
+        <w:rPr>
+          <w:vertAlign w:val="subscript"/>
+        </w:rPr>
+        <w:t xml:space="preserve">s</w:t>
+      </w:r>
+      <w:r>
+        <w:t xml:space="preserve"> = 0.3, F</w:t>
+      </w:r>
+      <w:r>
+        <w:rPr>
+          <w:vertAlign w:val="subscript"/>
+        </w:rPr>
+        <w:t xml:space="preserve">max</w:t>
+      </w:r>
+      <w:r>
+        <w:t xml:space="preserve"> = 1 and W</w:t>
+      </w:r>
+      <w:r>
+        <w:rPr>
+          <w:vertAlign w:val="subscript"/>
+        </w:rPr>
+        <w:t xml:space="preserve">max</w:t>
+      </w:r>
+      <w:r>
+        <w:t xml:space="preserve"> = 20 m/s; the proxy is zero in non-burning cells.</w:t>
       </w:r>
     </w:p>
     <w:p>

</xml_diff>

<commit_message>
Abstract: extinguished fractions; supplement: R_{c,max} subscript
Co-Authored-By: Claude Fable 5.1 <noreply@anthropic.com>
Claude-Session: https://claude.ai/code/session_01SpJY1eTMuWxnLRbAr2HJ4M
</commit_message>
<xml_diff>
--- a/02_Article/ieee_systems/DisasterAware_Supplementary_Material.docx
+++ b/02_Article/ieee_systems/DisasterAware_Supplementary_Material.docx
@@ -4393,10 +4393,10 @@
         <w:rPr>
           <w:vertAlign w:val="subscript"/>
         </w:rPr>
-        <w:t xml:space="preserve">c</w:t>
-      </w:r>
-      <w:r>
-        <w:t xml:space="preserve">,max, η</w:t>
+        <w:t xml:space="preserve">c,max</w:t>
+      </w:r>
+      <w:r>
+        <w:t xml:space="preserve">, η</w:t>
       </w:r>
       <w:r>
         <w:rPr>
@@ -4510,10 +4510,10 @@
         <w:rPr>
           <w:vertAlign w:val="subscript"/>
         </w:rPr>
-        <w:t xml:space="preserve">c</w:t>
-      </w:r>
-      <w:r>
-        <w:t xml:space="preserve">,max = 1 and G</w:t>
+        <w:t xml:space="preserve">c,max</w:t>
+      </w:r>
+      <w:r>
+        <w:t xml:space="preserve"> = 1 and G</w:t>
       </w:r>
       <w:r>
         <w:rPr>

</xml_diff>

<commit_message>
K24 to K27 results: gate ablation, information parity, coating parity in V-A, V-C, VI and Table VII (four rows, Holm family 48); effect-removal replay as Table S6 in the supplement
Co-Authored-By: Claude Fable 5.1 <noreply@anthropic.com>
Claude-Session: https://claude.ai/code/session_01SpJY1eTMuWxnLRbAr2HJ4M
</commit_message>
<xml_diff>
--- a/02_Article/ieee_systems/DisasterAware_Supplementary_Material.docx
+++ b/02_Article/ieee_systems/DisasterAware_Supplementary_Material.docx
@@ -5549,6 +5549,888 @@
                 <w:sz w:val="18"/>
               </w:rPr>
               <w:t xml:space="preserve">Design only; the experiments initialize the copy from the state</w:t>
+            </w:r>
+          </w:p>
+        </w:tc>
+      </w:tr>
+    </w:tbl>
+    <w:p>
+      <w:pPr>
+        <w:rPr/>
+      </w:pPr>
+      <w:r>
+        <w:t xml:space="preserve"/>
+      </w:r>
+    </w:p>
+    <w:p>
+      <w:pPr>
+        <w:pStyle w:val="Heading1"/>
+        <w:rPr/>
+      </w:pPr>
+      <w:r>
+        <w:t xml:space="preserve">Marginal contribution of each effect</w:t>
+      </w:r>
+    </w:p>
+    <w:p>
+      <w:pPr>
+        <w:rPr/>
+      </w:pPr>
+      <w:r>
+        <w:t xml:space="preserve">Table S6 replays the closed layer with the admitted objects of the main campaign installed at their recorded minutes, withholding for each effect every object that uses it together with the later objects that build on a withheld one, on the 150 worlds. The full replay gives 58 ± 13% against the closed layer. The rows are not part of the comparison family of the article; they describe the admitted set rather than test a configuration.</w:t>
+      </w:r>
+    </w:p>
+    <w:p>
+      <w:pPr>
+        <w:pStyle w:val="Caption"/>
+      </w:pPr>
+      <w:r>
+        <w:t xml:space="preserve">Table S6. Replay of the admitted objects with every object using one effect withheld (Closed extinguishes 52%)</w:t>
+      </w:r>
+    </w:p>
+    <w:tbl>
+      <w:tblPr>
+        <w:tblW w:w="9360" w:type="dxa"/>
+        <w:tblBorders>
+          <w:top w:val="single" w:sz="4" w:space="0" w:color="B7B7B7"/>
+          <w:left w:val="single" w:sz="4" w:space="0" w:color="B7B7B7"/>
+          <w:bottom w:val="single" w:sz="4" w:space="0" w:color="B7B7B7"/>
+          <w:right w:val="single" w:sz="4" w:space="0" w:color="B7B7B7"/>
+          <w:insideH w:val="single" w:sz="4" w:space="0" w:color="B7B7B7"/>
+          <w:insideV w:val="single" w:sz="4" w:space="0" w:color="B7B7B7"/>
+        </w:tblBorders>
+        <w:tblLayout w:type="fixed"/>
+        <w:tblCellMar>
+          <w:top w:w="35" w:type="dxa"/>
+          <w:left w:w="30" w:type="dxa"/>
+          <w:bottom w:w="35" w:type="dxa"/>
+          <w:right w:w="30" w:type="dxa"/>
+        </w:tblCellMar>
+        <w:tblLook w:val="04A0" w:firstRow="1" w:lastRow="0" w:firstColumn="1" w:lastColumn="0" w:noHBand="0" w:noVBand="1"/>
+      </w:tblPr>
+      <w:tblGrid>
+        <w:gridCol w:w="1300"/>
+        <w:gridCol w:w="1700"/>
+        <w:gridCol w:w="1700"/>
+        <w:gridCol w:w="1600"/>
+        <w:gridCol w:w="1400"/>
+        <w:gridCol w:w="1660"/>
+      </w:tblGrid>
+      <w:tr>
+        <w:trPr>
+          <w:cantSplit/>
+        </w:trPr>
+        <w:tc>
+          <w:tcPr>
+            <w:tcW w:w="1300" w:type="dxa"/>
+            <w:shd w:val="clear" w:color="auto" w:fill="E7E6E6"/>
+          </w:tcPr>
+          <w:p>
+            <w:pPr>
+              <w:spacing w:after="0" w:line="220" w:lineRule="auto"/>
+            </w:pPr>
+            <w:r>
+              <w:rPr>
+                <w:b/>
+                <w:sz w:val="18"/>
+              </w:rPr>
+              <w:t xml:space="preserve">Effect withheld</w:t>
+            </w:r>
+          </w:p>
+        </w:tc>
+        <w:tc>
+          <w:tcPr>
+            <w:tcW w:w="1700" w:type="dxa"/>
+            <w:shd w:val="clear" w:color="auto" w:fill="E7E6E6"/>
+          </w:tcPr>
+          <w:p>
+            <w:pPr>
+              <w:spacing w:after="0" w:line="220" w:lineRule="auto"/>
+            </w:pPr>
+            <w:r>
+              <w:rPr>
+                <w:b/>
+                <w:sz w:val="18"/>
+              </w:rPr>
+              <w:t xml:space="preserve">Objects kept per world (of 2.39)</w:t>
+            </w:r>
+          </w:p>
+        </w:tc>
+        <w:tc>
+          <w:tcPr>
+            <w:tcW w:w="1700" w:type="dxa"/>
+            <w:shd w:val="clear" w:color="auto" w:fill="E7E6E6"/>
+          </w:tcPr>
+          <w:p>
+            <w:pPr>
+              <w:spacing w:after="0" w:line="220" w:lineRule="auto"/>
+            </w:pPr>
+            <w:r>
+              <w:rPr>
+                <w:b/>
+                <w:sz w:val="18"/>
+              </w:rPr>
+              <w:t xml:space="preserve">Δ burned area vs Closed (%)</w:t>
+            </w:r>
+          </w:p>
+        </w:tc>
+        <w:tc>
+          <w:tcPr>
+            <w:tcW w:w="1600" w:type="dxa"/>
+            <w:shd w:val="clear" w:color="auto" w:fill="E7E6E6"/>
+          </w:tcPr>
+          <w:p>
+            <w:pPr>
+              <w:spacing w:after="0" w:line="220" w:lineRule="auto"/>
+            </w:pPr>
+            <w:r>
+              <w:rPr>
+                <w:b/>
+                <w:sz w:val="18"/>
+              </w:rPr>
+              <w:t xml:space="preserve">better / tie / worse</w:t>
+            </w:r>
+          </w:p>
+        </w:tc>
+        <w:tc>
+          <w:tcPr>
+            <w:tcW w:w="1400" w:type="dxa"/>
+            <w:shd w:val="clear" w:color="auto" w:fill="E7E6E6"/>
+          </w:tcPr>
+          <w:p>
+            <w:pPr>
+              <w:spacing w:after="0" w:line="220" w:lineRule="auto"/>
+            </w:pPr>
+            <w:r>
+              <w:rPr>
+                <w:b/>
+                <w:sz w:val="18"/>
+              </w:rPr>
+              <w:t xml:space="preserve">Extinguished (%)</w:t>
+            </w:r>
+          </w:p>
+        </w:tc>
+        <w:tc>
+          <w:tcPr>
+            <w:tcW w:w="1660" w:type="dxa"/>
+            <w:shd w:val="clear" w:color="auto" w:fill="E7E6E6"/>
+          </w:tcPr>
+          <w:p>
+            <w:pPr>
+              <w:spacing w:after="0" w:line="220" w:lineRule="auto"/>
+            </w:pPr>
+            <w:r>
+              <w:rPr>
+                <w:b/>
+                <w:sz w:val="18"/>
+              </w:rPr>
+              <w:t xml:space="preserve">Δ vs full replay (%)</w:t>
+            </w:r>
+          </w:p>
+        </w:tc>
+      </w:tr>
+      <w:tr>
+        <w:trPr>
+          <w:cantSplit/>
+        </w:trPr>
+        <w:tc>
+          <w:tcPr>
+            <w:tcW w:w="1300" w:type="dxa"/>
+          </w:tcPr>
+          <w:p>
+            <w:pPr>
+              <w:spacing w:after="0" w:line="220" w:lineRule="auto"/>
+            </w:pPr>
+            <w:r>
+              <w:rPr>
+                <w:sz w:val="18"/>
+              </w:rPr>
+              <w:t xml:space="preserve">coat</w:t>
+            </w:r>
+          </w:p>
+        </w:tc>
+        <w:tc>
+          <w:tcPr>
+            <w:tcW w:w="1700" w:type="dxa"/>
+          </w:tcPr>
+          <w:p>
+            <w:pPr>
+              <w:spacing w:after="0" w:line="220" w:lineRule="auto"/>
+            </w:pPr>
+            <w:r>
+              <w:rPr>
+                <w:sz w:val="18"/>
+              </w:rPr>
+              <w:t xml:space="preserve">1.21</w:t>
+            </w:r>
+          </w:p>
+        </w:tc>
+        <w:tc>
+          <w:tcPr>
+            <w:tcW w:w="1700" w:type="dxa"/>
+          </w:tcPr>
+          <w:p>
+            <w:pPr>
+              <w:spacing w:after="0" w:line="220" w:lineRule="auto"/>
+            </w:pPr>
+            <w:r>
+              <w:rPr>
+                <w:sz w:val="18"/>
+              </w:rPr>
+              <w:t xml:space="preserve">−21 ± 8</w:t>
+            </w:r>
+          </w:p>
+        </w:tc>
+        <w:tc>
+          <w:tcPr>
+            <w:tcW w:w="1600" w:type="dxa"/>
+          </w:tcPr>
+          <w:p>
+            <w:pPr>
+              <w:spacing w:after="0" w:line="220" w:lineRule="auto"/>
+            </w:pPr>
+            <w:r>
+              <w:rPr>
+                <w:sz w:val="18"/>
+              </w:rPr>
+              <w:t xml:space="preserve">89 / 50 / 11</w:t>
+            </w:r>
+          </w:p>
+        </w:tc>
+        <w:tc>
+          <w:tcPr>
+            <w:tcW w:w="1400" w:type="dxa"/>
+          </w:tcPr>
+          <w:p>
+            <w:pPr>
+              <w:spacing w:after="0" w:line="220" w:lineRule="auto"/>
+            </w:pPr>
+            <w:r>
+              <w:rPr>
+                <w:sz w:val="18"/>
+              </w:rPr>
+              <w:t xml:space="preserve">69</w:t>
+            </w:r>
+          </w:p>
+        </w:tc>
+        <w:tc>
+          <w:tcPr>
+            <w:tcW w:w="1660" w:type="dxa"/>
+          </w:tcPr>
+          <w:p>
+            <w:pPr>
+              <w:spacing w:after="0" w:line="220" w:lineRule="auto"/>
+            </w:pPr>
+            <w:r>
+              <w:rPr>
+                <w:sz w:val="18"/>
+              </w:rPr>
+              <w:t xml:space="preserve">+88 ± 31</w:t>
+            </w:r>
+          </w:p>
+        </w:tc>
+      </w:tr>
+      <w:tr>
+        <w:trPr>
+          <w:cantSplit/>
+        </w:trPr>
+        <w:tc>
+          <w:tcPr>
+            <w:tcW w:w="1300" w:type="dxa"/>
+          </w:tcPr>
+          <w:p>
+            <w:pPr>
+              <w:spacing w:after="0" w:line="220" w:lineRule="auto"/>
+            </w:pPr>
+            <w:r>
+              <w:rPr>
+                <w:sz w:val="18"/>
+              </w:rPr>
+              <w:t xml:space="preserve">clear</w:t>
+            </w:r>
+          </w:p>
+        </w:tc>
+        <w:tc>
+          <w:tcPr>
+            <w:tcW w:w="1700" w:type="dxa"/>
+          </w:tcPr>
+          <w:p>
+            <w:pPr>
+              <w:spacing w:after="0" w:line="220" w:lineRule="auto"/>
+            </w:pPr>
+            <w:r>
+              <w:rPr>
+                <w:sz w:val="18"/>
+              </w:rPr>
+              <w:t xml:space="preserve">1.79</w:t>
+            </w:r>
+          </w:p>
+        </w:tc>
+        <w:tc>
+          <w:tcPr>
+            <w:tcW w:w="1700" w:type="dxa"/>
+          </w:tcPr>
+          <w:p>
+            <w:pPr>
+              <w:spacing w:after="0" w:line="220" w:lineRule="auto"/>
+            </w:pPr>
+            <w:r>
+              <w:rPr>
+                <w:sz w:val="18"/>
+              </w:rPr>
+              <w:t xml:space="preserve">−46 ± 12</w:t>
+            </w:r>
+          </w:p>
+        </w:tc>
+        <w:tc>
+          <w:tcPr>
+            <w:tcW w:w="1600" w:type="dxa"/>
+          </w:tcPr>
+          <w:p>
+            <w:pPr>
+              <w:spacing w:after="0" w:line="220" w:lineRule="auto"/>
+            </w:pPr>
+            <w:r>
+              <w:rPr>
+                <w:sz w:val="18"/>
+              </w:rPr>
+              <w:t xml:space="preserve">111 / 29 / 10</w:t>
+            </w:r>
+          </w:p>
+        </w:tc>
+        <w:tc>
+          <w:tcPr>
+            <w:tcW w:w="1400" w:type="dxa"/>
+          </w:tcPr>
+          <w:p>
+            <w:pPr>
+              <w:spacing w:after="0" w:line="220" w:lineRule="auto"/>
+            </w:pPr>
+            <w:r>
+              <w:rPr>
+                <w:sz w:val="18"/>
+              </w:rPr>
+              <w:t xml:space="preserve">80</w:t>
+            </w:r>
+          </w:p>
+        </w:tc>
+        <w:tc>
+          <w:tcPr>
+            <w:tcW w:w="1660" w:type="dxa"/>
+          </w:tcPr>
+          <w:p>
+            <w:pPr>
+              <w:spacing w:after="0" w:line="220" w:lineRule="auto"/>
+            </w:pPr>
+            <w:r>
+              <w:rPr>
+                <w:sz w:val="18"/>
+              </w:rPr>
+              <w:t xml:space="preserve">+24 ± 16</w:t>
+            </w:r>
+          </w:p>
+        </w:tc>
+      </w:tr>
+      <w:tr>
+        <w:trPr>
+          <w:cantSplit/>
+        </w:trPr>
+        <w:tc>
+          <w:tcPr>
+            <w:tcW w:w="1300" w:type="dxa"/>
+          </w:tcPr>
+          <w:p>
+            <w:pPr>
+              <w:spacing w:after="0" w:line="220" w:lineRule="auto"/>
+            </w:pPr>
+            <w:r>
+              <w:rPr>
+                <w:sz w:val="18"/>
+              </w:rPr>
+              <w:t xml:space="preserve">draft</w:t>
+            </w:r>
+          </w:p>
+        </w:tc>
+        <w:tc>
+          <w:tcPr>
+            <w:tcW w:w="1700" w:type="dxa"/>
+          </w:tcPr>
+          <w:p>
+            <w:pPr>
+              <w:spacing w:after="0" w:line="220" w:lineRule="auto"/>
+            </w:pPr>
+            <w:r>
+              <w:rPr>
+                <w:sz w:val="18"/>
+              </w:rPr>
+              <w:t xml:space="preserve">2.01</w:t>
+            </w:r>
+          </w:p>
+        </w:tc>
+        <w:tc>
+          <w:tcPr>
+            <w:tcW w:w="1700" w:type="dxa"/>
+          </w:tcPr>
+          <w:p>
+            <w:pPr>
+              <w:spacing w:after="0" w:line="220" w:lineRule="auto"/>
+            </w:pPr>
+            <w:r>
+              <w:rPr>
+                <w:sz w:val="18"/>
+              </w:rPr>
+              <w:t xml:space="preserve">−45 ± 12</w:t>
+            </w:r>
+          </w:p>
+        </w:tc>
+        <w:tc>
+          <w:tcPr>
+            <w:tcW w:w="1600" w:type="dxa"/>
+          </w:tcPr>
+          <w:p>
+            <w:pPr>
+              <w:spacing w:after="0" w:line="220" w:lineRule="auto"/>
+            </w:pPr>
+            <w:r>
+              <w:rPr>
+                <w:sz w:val="18"/>
+              </w:rPr>
+              <w:t xml:space="preserve">121 / 20 / 9</w:t>
+            </w:r>
+          </w:p>
+        </w:tc>
+        <w:tc>
+          <w:tcPr>
+            <w:tcW w:w="1400" w:type="dxa"/>
+          </w:tcPr>
+          <w:p>
+            <w:pPr>
+              <w:spacing w:after="0" w:line="220" w:lineRule="auto"/>
+            </w:pPr>
+            <w:r>
+              <w:rPr>
+                <w:sz w:val="18"/>
+              </w:rPr>
+              <w:t xml:space="preserve">82</w:t>
+            </w:r>
+          </w:p>
+        </w:tc>
+        <w:tc>
+          <w:tcPr>
+            <w:tcW w:w="1660" w:type="dxa"/>
+          </w:tcPr>
+          <w:p>
+            <w:pPr>
+              <w:spacing w:after="0" w:line="220" w:lineRule="auto"/>
+            </w:pPr>
+            <w:r>
+              <w:rPr>
+                <w:sz w:val="18"/>
+              </w:rPr>
+              <w:t xml:space="preserve">+25 ± 16</w:t>
+            </w:r>
+          </w:p>
+        </w:tc>
+      </w:tr>
+      <w:tr>
+        <w:trPr>
+          <w:cantSplit/>
+        </w:trPr>
+        <w:tc>
+          <w:tcPr>
+            <w:tcW w:w="1300" w:type="dxa"/>
+          </w:tcPr>
+          <w:p>
+            <w:pPr>
+              <w:spacing w:after="0" w:line="220" w:lineRule="auto"/>
+            </w:pPr>
+            <w:r>
+              <w:rPr>
+                <w:sz w:val="18"/>
+              </w:rPr>
+              <w:t xml:space="preserve">wet</w:t>
+            </w:r>
+          </w:p>
+        </w:tc>
+        <w:tc>
+          <w:tcPr>
+            <w:tcW w:w="1700" w:type="dxa"/>
+          </w:tcPr>
+          <w:p>
+            <w:pPr>
+              <w:spacing w:after="0" w:line="220" w:lineRule="auto"/>
+            </w:pPr>
+            <w:r>
+              <w:rPr>
+                <w:sz w:val="18"/>
+              </w:rPr>
+              <w:t xml:space="preserve">2.00</w:t>
+            </w:r>
+          </w:p>
+        </w:tc>
+        <w:tc>
+          <w:tcPr>
+            <w:tcW w:w="1700" w:type="dxa"/>
+          </w:tcPr>
+          <w:p>
+            <w:pPr>
+              <w:spacing w:after="0" w:line="220" w:lineRule="auto"/>
+            </w:pPr>
+            <w:r>
+              <w:rPr>
+                <w:sz w:val="18"/>
+              </w:rPr>
+              <w:t xml:space="preserve">−54 ± 14</w:t>
+            </w:r>
+          </w:p>
+        </w:tc>
+        <w:tc>
+          <w:tcPr>
+            <w:tcW w:w="1600" w:type="dxa"/>
+          </w:tcPr>
+          <w:p>
+            <w:pPr>
+              <w:spacing w:after="0" w:line="220" w:lineRule="auto"/>
+            </w:pPr>
+            <w:r>
+              <w:rPr>
+                <w:sz w:val="18"/>
+              </w:rPr>
+              <w:t xml:space="preserve">124 / 18 / 8</w:t>
+            </w:r>
+          </w:p>
+        </w:tc>
+        <w:tc>
+          <w:tcPr>
+            <w:tcW w:w="1400" w:type="dxa"/>
+          </w:tcPr>
+          <w:p>
+            <w:pPr>
+              <w:spacing w:after="0" w:line="220" w:lineRule="auto"/>
+            </w:pPr>
+            <w:r>
+              <w:rPr>
+                <w:sz w:val="18"/>
+              </w:rPr>
+              <w:t xml:space="preserve">84</w:t>
+            </w:r>
+          </w:p>
+        </w:tc>
+        <w:tc>
+          <w:tcPr>
+            <w:tcW w:w="1660" w:type="dxa"/>
+          </w:tcPr>
+          <w:p>
+            <w:pPr>
+              <w:spacing w:after="0" w:line="220" w:lineRule="auto"/>
+            </w:pPr>
+            <w:r>
+              <w:rPr>
+                <w:sz w:val="18"/>
+              </w:rPr>
+              <w:t xml:space="preserve">+4 ± 2</w:t>
+            </w:r>
+          </w:p>
+        </w:tc>
+      </w:tr>
+      <w:tr>
+        <w:trPr>
+          <w:cantSplit/>
+        </w:trPr>
+        <w:tc>
+          <w:tcPr>
+            <w:tcW w:w="1300" w:type="dxa"/>
+          </w:tcPr>
+          <w:p>
+            <w:pPr>
+              <w:spacing w:after="0" w:line="220" w:lineRule="auto"/>
+            </w:pPr>
+            <w:r>
+              <w:rPr>
+                <w:sz w:val="18"/>
+              </w:rPr>
+              <w:t xml:space="preserve">prime</w:t>
+            </w:r>
+          </w:p>
+        </w:tc>
+        <w:tc>
+          <w:tcPr>
+            <w:tcW w:w="1700" w:type="dxa"/>
+          </w:tcPr>
+          <w:p>
+            <w:pPr>
+              <w:spacing w:after="0" w:line="220" w:lineRule="auto"/>
+            </w:pPr>
+            <w:r>
+              <w:rPr>
+                <w:sz w:val="18"/>
+              </w:rPr>
+              <w:t xml:space="preserve">2.15</w:t>
+            </w:r>
+          </w:p>
+        </w:tc>
+        <w:tc>
+          <w:tcPr>
+            <w:tcW w:w="1700" w:type="dxa"/>
+          </w:tcPr>
+          <w:p>
+            <w:pPr>
+              <w:spacing w:after="0" w:line="220" w:lineRule="auto"/>
+            </w:pPr>
+            <w:r>
+              <w:rPr>
+                <w:sz w:val="18"/>
+              </w:rPr>
+              <w:t xml:space="preserve">−55 ± 13</w:t>
+            </w:r>
+          </w:p>
+        </w:tc>
+        <w:tc>
+          <w:tcPr>
+            <w:tcW w:w="1600" w:type="dxa"/>
+          </w:tcPr>
+          <w:p>
+            <w:pPr>
+              <w:spacing w:after="0" w:line="220" w:lineRule="auto"/>
+            </w:pPr>
+            <w:r>
+              <w:rPr>
+                <w:sz w:val="18"/>
+              </w:rPr>
+              <w:t xml:space="preserve">126 / 18 / 6</w:t>
+            </w:r>
+          </w:p>
+        </w:tc>
+        <w:tc>
+          <w:tcPr>
+            <w:tcW w:w="1400" w:type="dxa"/>
+          </w:tcPr>
+          <w:p>
+            <w:pPr>
+              <w:spacing w:after="0" w:line="220" w:lineRule="auto"/>
+            </w:pPr>
+            <w:r>
+              <w:rPr>
+                <w:sz w:val="18"/>
+              </w:rPr>
+              <w:t xml:space="preserve">87</w:t>
+            </w:r>
+          </w:p>
+        </w:tc>
+        <w:tc>
+          <w:tcPr>
+            <w:tcW w:w="1660" w:type="dxa"/>
+          </w:tcPr>
+          <w:p>
+            <w:pPr>
+              <w:spacing w:after="0" w:line="220" w:lineRule="auto"/>
+            </w:pPr>
+            <w:r>
+              <w:rPr>
+                <w:sz w:val="18"/>
+              </w:rPr>
+              <w:t xml:space="preserve">+1 ± 5</w:t>
+            </w:r>
+          </w:p>
+        </w:tc>
+      </w:tr>
+      <w:tr>
+        <w:trPr>
+          <w:cantSplit/>
+        </w:trPr>
+        <w:tc>
+          <w:tcPr>
+            <w:tcW w:w="1300" w:type="dxa"/>
+          </w:tcPr>
+          <w:p>
+            <w:pPr>
+              <w:spacing w:after="0" w:line="220" w:lineRule="auto"/>
+            </w:pPr>
+            <w:r>
+              <w:rPr>
+                <w:sz w:val="18"/>
+              </w:rPr>
+              <w:t xml:space="preserve">ignite</w:t>
+            </w:r>
+          </w:p>
+        </w:tc>
+        <w:tc>
+          <w:tcPr>
+            <w:tcW w:w="1700" w:type="dxa"/>
+          </w:tcPr>
+          <w:p>
+            <w:pPr>
+              <w:spacing w:after="0" w:line="220" w:lineRule="auto"/>
+            </w:pPr>
+            <w:r>
+              <w:rPr>
+                <w:sz w:val="18"/>
+              </w:rPr>
+              <w:t xml:space="preserve">2.26</w:t>
+            </w:r>
+          </w:p>
+        </w:tc>
+        <w:tc>
+          <w:tcPr>
+            <w:tcW w:w="1700" w:type="dxa"/>
+          </w:tcPr>
+          <w:p>
+            <w:pPr>
+              <w:spacing w:after="0" w:line="220" w:lineRule="auto"/>
+            </w:pPr>
+            <w:r>
+              <w:rPr>
+                <w:sz w:val="18"/>
+              </w:rPr>
+              <w:t xml:space="preserve">−54 ± 13</w:t>
+            </w:r>
+          </w:p>
+        </w:tc>
+        <w:tc>
+          <w:tcPr>
+            <w:tcW w:w="1600" w:type="dxa"/>
+          </w:tcPr>
+          <w:p>
+            <w:pPr>
+              <w:spacing w:after="0" w:line="220" w:lineRule="auto"/>
+            </w:pPr>
+            <w:r>
+              <w:rPr>
+                <w:sz w:val="18"/>
+              </w:rPr>
+              <w:t xml:space="preserve">125 / 17 / 8</w:t>
+            </w:r>
+          </w:p>
+        </w:tc>
+        <w:tc>
+          <w:tcPr>
+            <w:tcW w:w="1400" w:type="dxa"/>
+          </w:tcPr>
+          <w:p>
+            <w:pPr>
+              <w:spacing w:after="0" w:line="220" w:lineRule="auto"/>
+            </w:pPr>
+            <w:r>
+              <w:rPr>
+                <w:sz w:val="18"/>
+              </w:rPr>
+              <w:t xml:space="preserve">85</w:t>
+            </w:r>
+          </w:p>
+        </w:tc>
+        <w:tc>
+          <w:tcPr>
+            <w:tcW w:w="1660" w:type="dxa"/>
+          </w:tcPr>
+          <w:p>
+            <w:pPr>
+              <w:spacing w:after="0" w:line="220" w:lineRule="auto"/>
+            </w:pPr>
+            <w:r>
+              <w:rPr>
+                <w:sz w:val="18"/>
+              </w:rPr>
+              <w:t xml:space="preserve">+2 ± 3</w:t>
+            </w:r>
+          </w:p>
+        </w:tc>
+      </w:tr>
+      <w:tr>
+        <w:trPr>
+          <w:cantSplit/>
+        </w:trPr>
+        <w:tc>
+          <w:tcPr>
+            <w:tcW w:w="1300" w:type="dxa"/>
+          </w:tcPr>
+          <w:p>
+            <w:pPr>
+              <w:spacing w:after="0" w:line="220" w:lineRule="auto"/>
+            </w:pPr>
+            <w:r>
+              <w:rPr>
+                <w:sz w:val="18"/>
+              </w:rPr>
+              <w:t xml:space="preserve">evacuate</w:t>
+            </w:r>
+          </w:p>
+        </w:tc>
+        <w:tc>
+          <w:tcPr>
+            <w:tcW w:w="1700" w:type="dxa"/>
+          </w:tcPr>
+          <w:p>
+            <w:pPr>
+              <w:spacing w:after="0" w:line="220" w:lineRule="auto"/>
+            </w:pPr>
+            <w:r>
+              <w:rPr>
+                <w:sz w:val="18"/>
+              </w:rPr>
+              <w:t xml:space="preserve">2.33</w:t>
+            </w:r>
+          </w:p>
+        </w:tc>
+        <w:tc>
+          <w:tcPr>
+            <w:tcW w:w="1700" w:type="dxa"/>
+          </w:tcPr>
+          <w:p>
+            <w:pPr>
+              <w:spacing w:after="0" w:line="220" w:lineRule="auto"/>
+            </w:pPr>
+            <w:r>
+              <w:rPr>
+                <w:sz w:val="18"/>
+              </w:rPr>
+              <w:t xml:space="preserve">−55 ± 14</w:t>
+            </w:r>
+          </w:p>
+        </w:tc>
+        <w:tc>
+          <w:tcPr>
+            <w:tcW w:w="1600" w:type="dxa"/>
+          </w:tcPr>
+          <w:p>
+            <w:pPr>
+              <w:spacing w:after="0" w:line="220" w:lineRule="auto"/>
+            </w:pPr>
+            <w:r>
+              <w:rPr>
+                <w:sz w:val="18"/>
+              </w:rPr>
+              <w:t xml:space="preserve">124 / 16 / 10</w:t>
+            </w:r>
+          </w:p>
+        </w:tc>
+        <w:tc>
+          <w:tcPr>
+            <w:tcW w:w="1400" w:type="dxa"/>
+          </w:tcPr>
+          <w:p>
+            <w:pPr>
+              <w:spacing w:after="0" w:line="220" w:lineRule="auto"/>
+            </w:pPr>
+            <w:r>
+              <w:rPr>
+                <w:sz w:val="18"/>
+              </w:rPr>
+              <w:t xml:space="preserve">87</w:t>
+            </w:r>
+          </w:p>
+        </w:tc>
+        <w:tc>
+          <w:tcPr>
+            <w:tcW w:w="1660" w:type="dxa"/>
+          </w:tcPr>
+          <w:p>
+            <w:pPr>
+              <w:spacing w:after="0" w:line="220" w:lineRule="auto"/>
+            </w:pPr>
+            <w:r>
+              <w:rPr>
+                <w:sz w:val="18"/>
+              </w:rPr>
+              <w:t xml:space="preserve">+1 ± 1</w:t>
             </w:r>
           </w:p>
         </w:tc>

</xml_diff>

<commit_message>
K28 in supplement Table S5 and cover letter
Co-Authored-By: Claude Fable 5.1 <noreply@anthropic.com>
Claude-Session: https://claude.ai/code/session_01SpJY1eTMuWxnLRbAr2HJ4M
</commit_message>
<xml_diff>
--- a/02_Article/ieee_systems/DisasterAware_Supplementary_Material.docx
+++ b/02_Article/ieee_systems/DisasterAware_Supplementary_Material.docx
@@ -5384,7 +5384,7 @@
               <w:rPr>
                 <w:sz w:val="18"/>
               </w:rPr>
-              <w:t xml:space="preserve">Doctrine record and transfer</w:t>
+              <w:t xml:space="preserve">Doctrine record within the incident and transfer</w:t>
             </w:r>
           </w:p>
         </w:tc>
@@ -5400,7 +5400,7 @@
               <w:rPr>
                 <w:sz w:val="18"/>
               </w:rPr>
-              <w:t xml:space="preserve">Evaluated on held-out seeds and on three new scenario families</w:t>
+              <w:t xml:space="preserve">Evaluated by a persistence ablation on 150 worlds, on held-out seeds and on three new scenario families</w:t>
             </w:r>
           </w:p>
         </w:tc>

</xml_diff>

<commit_message>
Round 4 text: Holm-only family, mixed-effects and medians, two-future variance, combined error beside main result, ignite constraint, call logs, abstract reframed (250 words), Table III controls, notation (chi, zeta, ell, q, script F and C)
Co-Authored-By: Claude Fable 5.1 <noreply@anthropic.com>
Claude-Session: https://claude.ai/code/session_01SpJY1eTMuWxnLRbAr2HJ4M
</commit_message>
<xml_diff>
--- a/02_Article/ieee_systems/DisasterAware_Supplementary_Material.docx
+++ b/02_Article/ieee_systems/DisasterAware_Supplementary_Material.docx
@@ -4072,7 +4072,7 @@
         <w:t xml:space="preserve">m</w:t>
       </w:r>
       <w:r>
-        <w:t xml:space="preserve">/ε</w:t>
+        <w:t xml:space="preserve">/χ</w:t>
       </w:r>
       <w:r>
         <w:rPr>
@@ -4201,7 +4201,7 @@
         <w:t xml:space="preserve">base</w:t>
       </w:r>
       <w:r>
-        <w:t xml:space="preserve"> 2.00, 0.80, 0.80, 0.30 m/min; ε</w:t>
+        <w:t xml:space="preserve"> 2.00, 0.80, 0.80, 0.30 m/min; χ</w:t>
       </w:r>
       <w:r>
         <w:rPr>

</xml_diff>

<commit_message>
Table III (controls) moved to supplement as Table S8, tables renumbered; abstract to three figures; A clashes resolved (term t, object E, merge operator Gamma); equations 13, 15, 16, 19, 21 split into lettered lines
Co-Authored-By: Claude Fable 5.1 <noreply@anthropic.com>
Claude-Session: https://claude.ai/code/session_01SpJY1eTMuWxnLRbAr2HJ4M
</commit_message>
<xml_diff>
--- a/02_Article/ieee_systems/DisasterAware_Supplementary_Material.docx
+++ b/02_Article/ieee_systems/DisasterAware_Supplementary_Material.docx
@@ -8238,6 +8238,1371 @@
                 <w:sz w:val="18"/>
               </w:rPr>
               <w:t xml:space="preserve">&lt; 0.0001</w:t>
+            </w:r>
+          </w:p>
+        </w:tc>
+      </w:tr>
+    </w:tbl>
+    <w:p>
+      <w:pPr>
+        <w:pStyle w:val="Heading1"/>
+      </w:pPr>
+      <w:r>
+        <w:t xml:space="preserve">Controls and tests</w:t>
+      </w:r>
+    </w:p>
+    <w:p>
+      <w:r>
+        <w:t xml:space="preserve">Table S8 lists every control and test of Section V of the article. Each keeps the 150 worlds of the main campaign and, unless stated, the gates G1 to G8 of GODA, and changes one thing: the candidate source, the search budget, the variations, the futures the gates read, the persistence of what is admitted, the live world, or the doctrine.</w:t>
+      </w:r>
+    </w:p>
+    <w:p>
+      <w:pPr>
+        <w:pStyle w:val="Caption"/>
+      </w:pPr>
+      <w:r>
+        <w:t xml:space="preserve">Table S8. Controls and tests (each keeps the worlds of GODA and, unless stated, gates G1–G8)</w:t>
+      </w:r>
+    </w:p>
+    <w:tbl>
+      <w:tblPr>
+        <w:tblStyle w:val="TableGrid"/>
+        <w:tblW w:w="8900" w:type="dxa"/>
+        <w:tblInd w:w="50" w:type="dxa"/>
+        <w:tblLayout w:type="fixed"/>
+        <w:tblCellMar>
+          <w:left w:w="50" w:type="dxa"/>
+          <w:right w:w="50" w:type="dxa"/>
+        </w:tblCellMar>
+        <w:tblLook w:val="04A0" w:firstRow="1" w:lastRow="0" w:firstColumn="1" w:lastColumn="0" w:noHBand="0" w:noVBand="1"/>
+      </w:tblPr>
+      <w:tblGrid>
+        <w:gridCol w:w="3200"/>
+        <w:gridCol w:w="4200"/>
+        <w:gridCol w:w="1500"/>
+      </w:tblGrid>
+      <w:tr>
+        <w:tc>
+          <w:tcPr>
+            <w:tcW w:w="3200" w:type="dxa"/>
+            <w:shd w:val="clear" w:color="auto" w:fill="D9D9D9" w:themeFill="background1" w:themeFillShade="D9"/>
+          </w:tcPr>
+          <w:p>
+            <w:pPr>
+              <w:keepNext/>
+              <w:spacing w:line="220" w:lineRule="auto"/>
+            </w:pPr>
+            <w:r>
+              <w:rPr>
+                <w:b/>
+                <w:sz w:val="18"/>
+              </w:rPr>
+              <w:t xml:space="preserve">Setting</w:t>
+            </w:r>
+          </w:p>
+        </w:tc>
+        <w:tc>
+          <w:tcPr>
+            <w:tcW w:w="4200" w:type="dxa"/>
+            <w:shd w:val="clear" w:color="auto" w:fill="D9D9D9" w:themeFill="background1" w:themeFillShade="D9"/>
+          </w:tcPr>
+          <w:p>
+            <w:pPr>
+              <w:keepNext/>
+              <w:spacing w:line="220" w:lineRule="auto"/>
+              <w:jc w:val="center"/>
+            </w:pPr>
+            <w:r>
+              <w:rPr>
+                <w:b/>
+                <w:sz w:val="18"/>
+              </w:rPr>
+              <w:t xml:space="preserve">Differs from GODA in</w:t>
+            </w:r>
+          </w:p>
+        </w:tc>
+        <w:tc>
+          <w:tcPr>
+            <w:tcW w:w="1500" w:type="dxa"/>
+            <w:shd w:val="clear" w:color="auto" w:fill="D9D9D9" w:themeFill="background1" w:themeFillShade="D9"/>
+          </w:tcPr>
+          <w:p>
+            <w:pPr>
+              <w:keepNext/>
+              <w:spacing w:line="220" w:lineRule="auto"/>
+              <w:jc w:val="center"/>
+            </w:pPr>
+            <w:r>
+              <w:rPr>
+                <w:b/>
+                <w:sz w:val="18"/>
+              </w:rPr>
+              <w:t xml:space="preserve">Forecasts; gates</w:t>
+            </w:r>
+          </w:p>
+        </w:tc>
+      </w:tr>
+      <w:tr>
+        <w:tc>
+          <w:tcPr>
+            <w:tcW w:w="3200" w:type="dxa"/>
+          </w:tcPr>
+          <w:p>
+            <w:pPr>
+              <w:keepNext/>
+              <w:spacing w:line="220" w:lineRule="auto"/>
+            </w:pPr>
+            <w:r>
+              <w:rPr>
+                <w:sz w:val="18"/>
+              </w:rPr>
+              <w:t xml:space="preserve">Candidate source, search and gates</w:t>
+            </w:r>
+          </w:p>
+        </w:tc>
+        <w:tc>
+          <w:tcPr>
+            <w:tcW w:w="4200" w:type="dxa"/>
+          </w:tcPr>
+          <w:p>
+            <w:pPr>
+              <w:keepNext/>
+              <w:spacing w:line="220" w:lineRule="auto"/>
+              <w:jc w:val="center"/>
+            </w:pPr>
+            <w:r>
+              <w:rPr>
+                <w:sz w:val="18"/>
+              </w:rPr>
+              <w:t xml:space="preserve"/>
+            </w:r>
+          </w:p>
+        </w:tc>
+        <w:tc>
+          <w:tcPr>
+            <w:tcW w:w="1500" w:type="dxa"/>
+          </w:tcPr>
+          <w:p>
+            <w:pPr>
+              <w:keepNext/>
+              <w:spacing w:line="220" w:lineRule="auto"/>
+              <w:jc w:val="center"/>
+            </w:pPr>
+            <w:r>
+              <w:rPr>
+                <w:sz w:val="18"/>
+              </w:rPr>
+              <w:t xml:space="preserve"/>
+            </w:r>
+          </w:p>
+        </w:tc>
+      </w:tr>
+      <w:tr>
+        <w:tc>
+          <w:tcPr>
+            <w:tcW w:w="3200" w:type="dxa"/>
+          </w:tcPr>
+          <w:p>
+            <w:pPr>
+              <w:keepNext/>
+              <w:spacing w:line="220" w:lineRule="auto"/>
+            </w:pPr>
+            <w:r>
+              <w:rPr>
+                <w:sz w:val="18"/>
+              </w:rPr>
+              <w:t xml:space="preserve">Closed (reference)</w:t>
+            </w:r>
+          </w:p>
+        </w:tc>
+        <w:tc>
+          <w:tcPr>
+            <w:tcW w:w="4200" w:type="dxa"/>
+          </w:tcPr>
+          <w:p>
+            <w:pPr>
+              <w:keepNext/>
+              <w:spacing w:line="220" w:lineRule="auto"/>
+              <w:jc w:val="center"/>
+            </w:pPr>
+            <w:r>
+              <w:rPr>
+                <w:sz w:val="18"/>
+              </w:rPr>
+              <w:t xml:space="preserve">no open layer</w:t>
+            </w:r>
+          </w:p>
+        </w:tc>
+        <w:tc>
+          <w:tcPr>
+            <w:tcW w:w="1500" w:type="dxa"/>
+          </w:tcPr>
+          <w:p>
+            <w:pPr>
+              <w:keepNext/>
+              <w:spacing w:line="220" w:lineRule="auto"/>
+              <w:jc w:val="center"/>
+            </w:pPr>
+            <w:r>
+              <w:rPr>
+                <w:sz w:val="18"/>
+              </w:rPr>
+              <w:t xml:space="preserve">0; fail-safe, no-harm</w:t>
+            </w:r>
+          </w:p>
+        </w:tc>
+      </w:tr>
+      <w:tr>
+        <w:tc>
+          <w:tcPr>
+            <w:tcW w:w="3200" w:type="dxa"/>
+          </w:tcPr>
+          <w:p>
+            <w:pPr>
+              <w:keepNext/>
+              <w:spacing w:line="220" w:lineRule="auto"/>
+            </w:pPr>
+            <w:r>
+              <w:rPr>
+                <w:sz w:val="18"/>
+              </w:rPr>
+              <w:t xml:space="preserve">Random or LLM, one</w:t>
+            </w:r>
+          </w:p>
+        </w:tc>
+        <w:tc>
+          <w:tcPr>
+            <w:tcW w:w="4200" w:type="dxa"/>
+          </w:tcPr>
+          <w:p>
+            <w:pPr>
+              <w:keepNext/>
+              <w:spacing w:line="220" w:lineRule="auto"/>
+              <w:jc w:val="center"/>
+            </w:pPr>
+            <w:r>
+              <w:rPr>
+                <w:sz w:val="18"/>
+              </w:rPr>
+              <w:t xml:space="preserve">one unpriced candidate; ungated variant without G5–G8</w:t>
+            </w:r>
+          </w:p>
+        </w:tc>
+        <w:tc>
+          <w:tcPr>
+            <w:tcW w:w="1500" w:type="dxa"/>
+          </w:tcPr>
+          <w:p>
+            <w:pPr>
+              <w:keepNext/>
+              <w:spacing w:line="220" w:lineRule="auto"/>
+              <w:jc w:val="center"/>
+            </w:pPr>
+            <w:r>
+              <w:rPr>
+                <w:sz w:val="18"/>
+              </w:rPr>
+              <w:t xml:space="preserve">0; G1–G8 or G1–G4</w:t>
+            </w:r>
+          </w:p>
+        </w:tc>
+      </w:tr>
+      <w:tr>
+        <w:tc>
+          <w:tcPr>
+            <w:tcW w:w="3200" w:type="dxa"/>
+          </w:tcPr>
+          <w:p>
+            <w:pPr>
+              <w:keepNext/>
+              <w:spacing w:line="220" w:lineRule="auto"/>
+            </w:pPr>
+            <w:r>
+              <w:rPr>
+                <w:sz w:val="18"/>
+              </w:rPr>
+              <w:t xml:space="preserve">Random, small; LLM, candidates only</w:t>
+            </w:r>
+          </w:p>
+        </w:tc>
+        <w:tc>
+          <w:tcPr>
+            <w:tcW w:w="4200" w:type="dxa"/>
+          </w:tcPr>
+          <w:p>
+            <w:pPr>
+              <w:keepNext/>
+              <w:spacing w:line="220" w:lineRule="auto"/>
+              <w:jc w:val="center"/>
+            </w:pPr>
+            <w:r>
+              <w:rPr>
+                <w:sz w:val="18"/>
+              </w:rPr>
+              <w:t xml:space="preserve">six samples or six model candidates, no variations</w:t>
+            </w:r>
+          </w:p>
+        </w:tc>
+        <w:tc>
+          <w:tcPr>
+            <w:tcW w:w="1500" w:type="dxa"/>
+          </w:tcPr>
+          <w:p>
+            <w:pPr>
+              <w:keepNext/>
+              <w:spacing w:line="220" w:lineRule="auto"/>
+              <w:jc w:val="center"/>
+            </w:pPr>
+            <w:r>
+              <w:rPr>
+                <w:sz w:val="18"/>
+              </w:rPr>
+              <w:t xml:space="preserve">6</w:t>
+            </w:r>
+          </w:p>
+        </w:tc>
+      </w:tr>
+      <w:tr>
+        <w:tc>
+          <w:tcPr>
+            <w:tcW w:w="3200" w:type="dxa"/>
+          </w:tcPr>
+          <w:p>
+            <w:pPr>
+              <w:keepNext/>
+              <w:spacing w:line="220" w:lineRule="auto"/>
+            </w:pPr>
+            <w:r>
+              <w:rPr>
+                <w:sz w:val="18"/>
+              </w:rPr>
+              <w:t xml:space="preserve">Random, full; families only; with variations</w:t>
+            </w:r>
+          </w:p>
+        </w:tc>
+        <w:tc>
+          <w:tcPr>
+            <w:tcW w:w="4200" w:type="dxa"/>
+          </w:tcPr>
+          <w:p>
+            <w:pPr>
+              <w:keepNext/>
+              <w:spacing w:line="220" w:lineRule="auto"/>
+              <w:jc w:val="center"/>
+            </w:pPr>
+            <w:r>
+              <w:rPr>
+                <w:sz w:val="18"/>
+              </w:rPr>
+              <w:t xml:space="preserve">uniform candidates; rules and macros only; six uniform seeds then variations</w:t>
+            </w:r>
+          </w:p>
+        </w:tc>
+        <w:tc>
+          <w:tcPr>
+            <w:tcW w:w="1500" w:type="dxa"/>
+          </w:tcPr>
+          <w:p>
+            <w:pPr>
+              <w:keepNext/>
+              <w:spacing w:line="220" w:lineRule="auto"/>
+              <w:jc w:val="center"/>
+            </w:pPr>
+            <w:r>
+              <w:rPr>
+                <w:sz w:val="18"/>
+              </w:rPr>
+              <w:t xml:space="preserve">36</w:t>
+            </w:r>
+          </w:p>
+        </w:tc>
+      </w:tr>
+      <w:tr>
+        <w:tc>
+          <w:tcPr>
+            <w:tcW w:w="3200" w:type="dxa"/>
+          </w:tcPr>
+          <w:p>
+            <w:pPr>
+              <w:keepNext/>
+              <w:spacing w:line="220" w:lineRule="auto"/>
+            </w:pPr>
+            <w:r>
+              <w:rPr>
+                <w:sz w:val="18"/>
+              </w:rPr>
+              <w:t xml:space="preserve">Hand-written seeds, with variations</w:t>
+            </w:r>
+          </w:p>
+        </w:tc>
+        <w:tc>
+          <w:tcPr>
+            <w:tcW w:w="4200" w:type="dxa"/>
+          </w:tcPr>
+          <w:p>
+            <w:pPr>
+              <w:keepNext/>
+              <w:spacing w:line="220" w:lineRule="auto"/>
+              <w:jc w:val="center"/>
+            </w:pPr>
+            <w:r>
+              <w:rPr>
+                <w:sz w:val="18"/>
+              </w:rPr>
+              <w:t xml:space="preserve">Table IV tactics as seeds</w:t>
+            </w:r>
+          </w:p>
+        </w:tc>
+        <w:tc>
+          <w:tcPr>
+            <w:tcW w:w="1500" w:type="dxa"/>
+          </w:tcPr>
+          <w:p>
+            <w:pPr>
+              <w:keepNext/>
+              <w:spacing w:line="220" w:lineRule="auto"/>
+              <w:jc w:val="center"/>
+            </w:pPr>
+            <w:r>
+              <w:rPr>
+                <w:sz w:val="18"/>
+              </w:rPr>
+              <w:t xml:space="preserve">36</w:t>
+            </w:r>
+          </w:p>
+        </w:tc>
+      </w:tr>
+      <w:tr>
+        <w:tc>
+          <w:tcPr>
+            <w:tcW w:w="3200" w:type="dxa"/>
+          </w:tcPr>
+          <w:p>
+            <w:pPr>
+              <w:keepNext/>
+              <w:spacing w:line="220" w:lineRule="auto"/>
+            </w:pPr>
+            <w:r>
+              <w:rPr>
+                <w:sz w:val="18"/>
+              </w:rPr>
+              <w:t xml:space="preserve">Evolutionary search</w:t>
+            </w:r>
+          </w:p>
+        </w:tc>
+        <w:tc>
+          <w:tcPr>
+            <w:tcW w:w="4200" w:type="dxa"/>
+          </w:tcPr>
+          <w:p>
+            <w:pPr>
+              <w:keepNext/>
+              <w:spacing w:line="220" w:lineRule="auto"/>
+              <w:jc w:val="center"/>
+            </w:pPr>
+            <w:r>
+              <w:rPr>
+                <w:sz w:val="18"/>
+              </w:rPr>
+              <w:t xml:space="preserve">population 12 × 3; also 6 × 5 and 18 × 1</w:t>
+            </w:r>
+          </w:p>
+        </w:tc>
+        <w:tc>
+          <w:tcPr>
+            <w:tcW w:w="1500" w:type="dxa"/>
+          </w:tcPr>
+          <w:p>
+            <w:pPr>
+              <w:keepNext/>
+              <w:spacing w:line="220" w:lineRule="auto"/>
+              <w:jc w:val="center"/>
+            </w:pPr>
+            <w:r>
+              <w:rPr>
+                <w:sz w:val="18"/>
+              </w:rPr>
+              <w:t xml:space="preserve">36</w:t>
+            </w:r>
+          </w:p>
+        </w:tc>
+      </w:tr>
+      <w:tr>
+        <w:tc>
+          <w:tcPr>
+            <w:tcW w:w="3200" w:type="dxa"/>
+          </w:tcPr>
+          <w:p>
+            <w:pPr>
+              <w:keepNext/>
+              <w:spacing w:line="220" w:lineRule="auto"/>
+            </w:pPr>
+            <w:r>
+              <w:rPr>
+                <w:sz w:val="18"/>
+              </w:rPr>
+              <w:t xml:space="preserve">Random and GODA at 12 and 24</w:t>
+            </w:r>
+          </w:p>
+        </w:tc>
+        <w:tc>
+          <w:tcPr>
+            <w:tcW w:w="4200" w:type="dxa"/>
+          </w:tcPr>
+          <w:p>
+            <w:pPr>
+              <w:keepNext/>
+              <w:spacing w:line="220" w:lineRule="auto"/>
+              <w:jc w:val="center"/>
+            </w:pPr>
+            <w:r>
+              <w:rPr>
+                <w:sz w:val="18"/>
+              </w:rPr>
+              <w:t xml:space="preserve">search budget</w:t>
+            </w:r>
+          </w:p>
+        </w:tc>
+        <w:tc>
+          <w:tcPr>
+            <w:tcW w:w="1500" w:type="dxa"/>
+          </w:tcPr>
+          <w:p>
+            <w:pPr>
+              <w:keepNext/>
+              <w:spacing w:line="220" w:lineRule="auto"/>
+              <w:jc w:val="center"/>
+            </w:pPr>
+            <w:r>
+              <w:rPr>
+                <w:sz w:val="18"/>
+              </w:rPr>
+              <w:t xml:space="preserve">12, 24</w:t>
+            </w:r>
+          </w:p>
+        </w:tc>
+      </w:tr>
+      <w:tr>
+        <w:tc>
+          <w:tcPr>
+            <w:tcW w:w="3200" w:type="dxa"/>
+          </w:tcPr>
+          <w:p>
+            <w:pPr>
+              <w:keepNext/>
+              <w:spacing w:line="220" w:lineRule="auto"/>
+            </w:pPr>
+            <w:r>
+              <w:rPr>
+                <w:sz w:val="18"/>
+              </w:rPr>
+              <w:t xml:space="preserve">GODA repeat; independent gates</w:t>
+            </w:r>
+          </w:p>
+        </w:tc>
+        <w:tc>
+          <w:tcPr>
+            <w:tcW w:w="4200" w:type="dxa"/>
+          </w:tcPr>
+          <w:p>
+            <w:pPr>
+              <w:keepNext/>
+              <w:spacing w:line="220" w:lineRule="auto"/>
+              <w:jc w:val="center"/>
+            </w:pPr>
+            <w:r>
+              <w:rPr>
+                <w:sz w:val="18"/>
+              </w:rPr>
+              <w:t xml:space="preserve">new model calls; G5–G8 on two further streams</w:t>
+            </w:r>
+          </w:p>
+        </w:tc>
+        <w:tc>
+          <w:tcPr>
+            <w:tcW w:w="1500" w:type="dxa"/>
+          </w:tcPr>
+          <w:p>
+            <w:pPr>
+              <w:keepNext/>
+              <w:spacing w:line="220" w:lineRule="auto"/>
+              <w:jc w:val="center"/>
+            </w:pPr>
+            <w:r>
+              <w:rPr>
+                <w:sz w:val="18"/>
+              </w:rPr>
+              <w:t xml:space="preserve">36; 36 + 4</w:t>
+            </w:r>
+          </w:p>
+        </w:tc>
+      </w:tr>
+      <w:tr>
+        <w:tc>
+          <w:tcPr>
+            <w:tcW w:w="3200" w:type="dxa"/>
+          </w:tcPr>
+          <w:p>
+            <w:pPr>
+              <w:keepNext/>
+              <w:spacing w:line="220" w:lineRule="auto"/>
+            </w:pPr>
+            <w:r>
+              <w:rPr>
+                <w:sz w:val="18"/>
+              </w:rPr>
+              <w:t xml:space="preserve">Gates on one future, G5 only</w:t>
+            </w:r>
+          </w:p>
+        </w:tc>
+        <w:tc>
+          <w:tcPr>
+            <w:tcW w:w="4200" w:type="dxa"/>
+          </w:tcPr>
+          <w:p>
+            <w:pPr>
+              <w:keepNext/>
+              <w:spacing w:line="220" w:lineRule="auto"/>
+              <w:jc w:val="center"/>
+            </w:pPr>
+            <w:r>
+              <w:rPr>
+                <w:sz w:val="18"/>
+              </w:rPr>
+              <w:t xml:space="preserve">one future; G6–G8 off</w:t>
+            </w:r>
+          </w:p>
+        </w:tc>
+        <w:tc>
+          <w:tcPr>
+            <w:tcW w:w="1500" w:type="dxa"/>
+          </w:tcPr>
+          <w:p>
+            <w:pPr>
+              <w:keepNext/>
+              <w:spacing w:line="220" w:lineRule="auto"/>
+              <w:jc w:val="center"/>
+            </w:pPr>
+            <w:r>
+              <w:rPr>
+                <w:sz w:val="18"/>
+              </w:rPr>
+              <w:t xml:space="preserve">36; G1–G5</w:t>
+            </w:r>
+          </w:p>
+        </w:tc>
+      </w:tr>
+      <w:tr>
+        <w:tc>
+          <w:tcPr>
+            <w:tcW w:w="3200" w:type="dxa"/>
+          </w:tcPr>
+          <w:p>
+            <w:pPr>
+              <w:keepNext/>
+              <w:spacing w:line="220" w:lineRule="auto"/>
+            </w:pPr>
+            <w:r>
+              <w:rPr>
+                <w:sz w:val="18"/>
+              </w:rPr>
+              <w:t xml:space="preserve">Admitted objects withdrawn</w:t>
+            </w:r>
+          </w:p>
+        </w:tc>
+        <w:tc>
+          <w:tcPr>
+            <w:tcW w:w="4200" w:type="dxa"/>
+          </w:tcPr>
+          <w:p>
+            <w:pPr>
+              <w:keepNext/>
+              <w:spacing w:line="220" w:lineRule="auto"/>
+              <w:jc w:val="center"/>
+            </w:pPr>
+            <w:r>
+              <w:rPr>
+                <w:sz w:val="18"/>
+              </w:rPr>
+              <w:t xml:space="preserve">no doctrine within the incident</w:t>
+            </w:r>
+          </w:p>
+        </w:tc>
+        <w:tc>
+          <w:tcPr>
+            <w:tcW w:w="1500" w:type="dxa"/>
+          </w:tcPr>
+          <w:p>
+            <w:pPr>
+              <w:keepNext/>
+              <w:spacing w:line="220" w:lineRule="auto"/>
+              <w:jc w:val="center"/>
+            </w:pPr>
+            <w:r>
+              <w:rPr>
+                <w:sz w:val="18"/>
+              </w:rPr>
+              <w:t xml:space="preserve">36</w:t>
+            </w:r>
+          </w:p>
+        </w:tc>
+      </w:tr>
+      <w:tr>
+        <w:tc>
+          <w:tcPr>
+            <w:tcW w:w="3200" w:type="dxa"/>
+          </w:tcPr>
+          <w:p>
+            <w:pPr>
+              <w:keepNext/>
+              <w:spacing w:line="220" w:lineRule="auto"/>
+            </w:pPr>
+            <w:r>
+              <w:rPr>
+                <w:sz w:val="18"/>
+              </w:rPr>
+              <w:t xml:space="preserve">Brief parity; coating parity</w:t>
+            </w:r>
+          </w:p>
+        </w:tc>
+        <w:tc>
+          <w:tcPr>
+            <w:tcW w:w="4200" w:type="dxa"/>
+          </w:tcPr>
+          <w:p>
+            <w:pPr>
+              <w:keepNext/>
+              <w:spacing w:line="220" w:lineRule="auto"/>
+              <w:jc w:val="center"/>
+            </w:pPr>
+            <w:r>
+              <w:rPr>
+                <w:sz w:val="18"/>
+              </w:rPr>
+              <w:t xml:space="preserve">brief from the perturbed copy; coat reach-limited and charged</w:t>
+            </w:r>
+          </w:p>
+        </w:tc>
+        <w:tc>
+          <w:tcPr>
+            <w:tcW w:w="1500" w:type="dxa"/>
+          </w:tcPr>
+          <w:p>
+            <w:pPr>
+              <w:keepNext/>
+              <w:spacing w:line="220" w:lineRule="auto"/>
+              <w:jc w:val="center"/>
+            </w:pPr>
+            <w:r>
+              <w:rPr>
+                <w:sz w:val="18"/>
+              </w:rPr>
+              <w:t xml:space="preserve">36</w:t>
+            </w:r>
+          </w:p>
+        </w:tc>
+      </w:tr>
+      <w:tr>
+        <w:tc>
+          <w:tcPr>
+            <w:tcW w:w="3200" w:type="dxa"/>
+          </w:tcPr>
+          <w:p>
+            <w:pPr>
+              <w:keepNext/>
+              <w:spacing w:line="220" w:lineRule="auto"/>
+            </w:pPr>
+            <w:r>
+              <w:rPr>
+                <w:sz w:val="18"/>
+              </w:rPr>
+              <w:t xml:space="preserve">Model errors and limits (live world changed; planner nominal unless stated)</w:t>
+            </w:r>
+          </w:p>
+        </w:tc>
+        <w:tc>
+          <w:tcPr>
+            <w:tcW w:w="4200" w:type="dxa"/>
+          </w:tcPr>
+          <w:p>
+            <w:pPr>
+              <w:keepNext/>
+              <w:spacing w:line="220" w:lineRule="auto"/>
+              <w:jc w:val="center"/>
+            </w:pPr>
+            <w:r>
+              <w:rPr>
+                <w:sz w:val="18"/>
+              </w:rPr>
+              <w:t xml:space="preserve"/>
+            </w:r>
+          </w:p>
+        </w:tc>
+        <w:tc>
+          <w:tcPr>
+            <w:tcW w:w="1500" w:type="dxa"/>
+          </w:tcPr>
+          <w:p>
+            <w:pPr>
+              <w:keepNext/>
+              <w:spacing w:line="220" w:lineRule="auto"/>
+              <w:jc w:val="center"/>
+            </w:pPr>
+            <w:r>
+              <w:rPr>
+                <w:sz w:val="18"/>
+              </w:rPr>
+              <w:t xml:space="preserve"/>
+            </w:r>
+          </w:p>
+        </w:tc>
+      </w:tr>
+      <w:tr>
+        <w:tc>
+          <w:tcPr>
+            <w:tcW w:w="3200" w:type="dxa"/>
+          </w:tcPr>
+          <w:p>
+            <w:pPr>
+              <w:keepNext/>
+              <w:spacing w:line="220" w:lineRule="auto"/>
+            </w:pPr>
+            <w:r>
+              <w:rPr>
+                <w:sz w:val="18"/>
+              </w:rPr>
+              <w:t xml:space="preserve">Suppression errors (3)</w:t>
+            </w:r>
+          </w:p>
+        </w:tc>
+        <w:tc>
+          <w:tcPr>
+            <w:tcW w:w="4200" w:type="dxa"/>
+          </w:tcPr>
+          <w:p>
+            <w:pPr>
+              <w:keepNext/>
+              <w:spacing w:line="220" w:lineRule="auto"/>
+              <w:jc w:val="center"/>
+            </w:pPr>
+            <w:r>
+              <w:rPr>
+                <w:sz w:val="18"/>
+              </w:rPr>
+              <w:t xml:space="preserve">intensity, travel decay, knockdown ×1.5</w:t>
+            </w:r>
+          </w:p>
+        </w:tc>
+        <w:tc>
+          <w:tcPr>
+            <w:tcW w:w="1500" w:type="dxa"/>
+          </w:tcPr>
+          <w:p>
+            <w:pPr>
+              <w:keepNext/>
+              <w:spacing w:line="220" w:lineRule="auto"/>
+              <w:jc w:val="center"/>
+            </w:pPr>
+            <w:r>
+              <w:rPr>
+                <w:sz w:val="18"/>
+              </w:rPr>
+              <w:t xml:space="preserve">replay</w:t>
+            </w:r>
+          </w:p>
+        </w:tc>
+      </w:tr>
+      <w:tr>
+        <w:tc>
+          <w:tcPr>
+            <w:tcW w:w="3200" w:type="dxa"/>
+          </w:tcPr>
+          <w:p>
+            <w:pPr>
+              <w:keepNext/>
+              <w:spacing w:line="220" w:lineRule="auto"/>
+            </w:pPr>
+            <w:r>
+              <w:rPr>
+                <w:sz w:val="18"/>
+              </w:rPr>
+              <w:t xml:space="preserve">Coating weakened, ineffective; effectiveness sweep; wind ×1.5, ±30°</w:t>
+            </w:r>
+          </w:p>
+        </w:tc>
+        <w:tc>
+          <w:tcPr>
+            <w:tcW w:w="4200" w:type="dxa"/>
+          </w:tcPr>
+          <w:p>
+            <w:pPr>
+              <w:keepNext/>
+              <w:spacing w:line="220" w:lineRule="auto"/>
+              <w:jc w:val="center"/>
+            </w:pPr>
+            <w:r>
+              <w:rPr>
+                <w:sz w:val="18"/>
+              </w:rPr>
+              <w:t xml:space="preserve">coat effect halved or zero; 0.75 to 0 in four steps, replay; spread rate, direction</w:t>
+            </w:r>
+          </w:p>
+        </w:tc>
+        <w:tc>
+          <w:tcPr>
+            <w:tcW w:w="1500" w:type="dxa"/>
+          </w:tcPr>
+          <w:p>
+            <w:pPr>
+              <w:keepNext/>
+              <w:spacing w:line="220" w:lineRule="auto"/>
+              <w:jc w:val="center"/>
+            </w:pPr>
+            <w:r>
+              <w:rPr>
+                <w:sz w:val="18"/>
+              </w:rPr>
+              <w:t xml:space="preserve">36; replay; 36</w:t>
+            </w:r>
+          </w:p>
+        </w:tc>
+      </w:tr>
+      <w:tr>
+        <w:tc>
+          <w:tcPr>
+            <w:tcW w:w="3200" w:type="dxa"/>
+          </w:tcPr>
+          <w:p>
+            <w:pPr>
+              <w:keepNext/>
+              <w:spacing w:line="220" w:lineRule="auto"/>
+            </w:pPr>
+            <w:r>
+              <w:rPr>
+                <w:sz w:val="18"/>
+              </w:rPr>
+              <w:t xml:space="preserve">Spread kernel and embers; combined error</w:t>
+            </w:r>
+          </w:p>
+        </w:tc>
+        <w:tc>
+          <w:tcPr>
+            <w:tcW w:w="4200" w:type="dxa"/>
+          </w:tcPr>
+          <w:p>
+            <w:pPr>
+              <w:keepNext/>
+              <w:spacing w:line="220" w:lineRule="auto"/>
+              <w:jc w:val="center"/>
+            </w:pPr>
+            <w:r>
+              <w:rPr>
+                <w:sz w:val="18"/>
+              </w:rPr>
+              <w:t xml:space="preserve">cosine kernel, short embers; with wind ×1.5 and weak coating</w:t>
+            </w:r>
+          </w:p>
+        </w:tc>
+        <w:tc>
+          <w:tcPr>
+            <w:tcW w:w="1500" w:type="dxa"/>
+          </w:tcPr>
+          <w:p>
+            <w:pPr>
+              <w:keepNext/>
+              <w:spacing w:line="220" w:lineRule="auto"/>
+              <w:jc w:val="center"/>
+            </w:pPr>
+            <w:r>
+              <w:rPr>
+                <w:sz w:val="18"/>
+              </w:rPr>
+              <w:t xml:space="preserve">36</w:t>
+            </w:r>
+          </w:p>
+        </w:tc>
+      </w:tr>
+      <w:tr>
+        <w:tc>
+          <w:tcPr>
+            <w:tcW w:w="3200" w:type="dxa"/>
+          </w:tcPr>
+          <w:p>
+            <w:pPr>
+              <w:keepNext/>
+              <w:spacing w:line="220" w:lineRule="auto"/>
+            </w:pPr>
+            <w:r>
+              <w:rPr>
+                <w:sz w:val="18"/>
+              </w:rPr>
+              <w:t xml:space="preserve">Price, stock, delay limits</w:t>
+            </w:r>
+          </w:p>
+        </w:tc>
+        <w:tc>
+          <w:tcPr>
+            <w:tcW w:w="4200" w:type="dxa"/>
+          </w:tcPr>
+          <w:p>
+            <w:pPr>
+              <w:keepNext/>
+              <w:spacing w:line="220" w:lineRule="auto"/>
+              <w:jc w:val="center"/>
+            </w:pPr>
+            <w:r>
+              <w:rPr>
+                <w:sz w:val="18"/>
+              </w:rPr>
+              <w:t xml:space="preserve">planner and world alike</w:t>
+            </w:r>
+          </w:p>
+        </w:tc>
+        <w:tc>
+          <w:tcPr>
+            <w:tcW w:w="1500" w:type="dxa"/>
+          </w:tcPr>
+          <w:p>
+            <w:pPr>
+              <w:keepNext/>
+              <w:spacing w:line="220" w:lineRule="auto"/>
+              <w:jc w:val="center"/>
+            </w:pPr>
+            <w:r>
+              <w:rPr>
+                <w:sz w:val="18"/>
+              </w:rPr>
+              <w:t xml:space="preserve">36</w:t>
+            </w:r>
+          </w:p>
+        </w:tc>
+      </w:tr>
+      <w:tr>
+        <w:tc>
+          <w:tcPr>
+            <w:tcW w:w="3200" w:type="dxa"/>
+          </w:tcPr>
+          <w:p>
+            <w:pPr>
+              <w:keepNext/>
+              <w:spacing w:line="220" w:lineRule="auto"/>
+            </w:pPr>
+            <w:r>
+              <w:rPr>
+                <w:sz w:val="18"/>
+              </w:rPr>
+              <w:t xml:space="preserve">Perturbed state</w:t>
+            </w:r>
+          </w:p>
+        </w:tc>
+        <w:tc>
+          <w:tcPr>
+            <w:tcW w:w="4200" w:type="dxa"/>
+          </w:tcPr>
+          <w:p>
+            <w:pPr>
+              <w:keepNext/>
+              <w:spacing w:line="220" w:lineRule="auto"/>
+              <w:jc w:val="center"/>
+            </w:pPr>
+            <w:r>
+              <w:rPr>
+                <w:sz w:val="18"/>
+              </w:rPr>
+              <w:t xml:space="preserve">25% of burning cells unseen by forecasts</w:t>
+            </w:r>
+          </w:p>
+        </w:tc>
+        <w:tc>
+          <w:tcPr>
+            <w:tcW w:w="1500" w:type="dxa"/>
+          </w:tcPr>
+          <w:p>
+            <w:pPr>
+              <w:keepNext/>
+              <w:spacing w:line="220" w:lineRule="auto"/>
+              <w:jc w:val="center"/>
+            </w:pPr>
+            <w:r>
+              <w:rPr>
+                <w:sz w:val="18"/>
+              </w:rPr>
+              <w:t xml:space="preserve">36</w:t>
+            </w:r>
+          </w:p>
+        </w:tc>
+      </w:tr>
+      <w:tr>
+        <w:tc>
+          <w:tcPr>
+            <w:tcW w:w="3200" w:type="dxa"/>
+          </w:tcPr>
+          <w:p>
+            <w:pPr>
+              <w:keepNext/>
+              <w:spacing w:line="220" w:lineRule="auto"/>
+            </w:pPr>
+            <w:r>
+              <w:rPr>
+                <w:sz w:val="18"/>
+              </w:rPr>
+              <w:t xml:space="preserve">Cost functions; larger domain</w:t>
+            </w:r>
+          </w:p>
+        </w:tc>
+        <w:tc>
+          <w:tcPr>
+            <w:tcW w:w="4200" w:type="dxa"/>
+          </w:tcPr>
+          <w:p>
+            <w:pPr>
+              <w:keepNext/>
+              <w:spacing w:line="220" w:lineRule="auto"/>
+              <w:jc w:val="center"/>
+            </w:pPr>
+            <w:r>
+              <w:rPr>
+                <w:sz w:val="18"/>
+              </w:rPr>
+              <w:t xml:space="preserve">four replays, one live rerun; 120 × 90 grid, 30 worlds</w:t>
+            </w:r>
+          </w:p>
+        </w:tc>
+        <w:tc>
+          <w:tcPr>
+            <w:tcW w:w="1500" w:type="dxa"/>
+          </w:tcPr>
+          <w:p>
+            <w:pPr>
+              <w:keepNext/>
+              <w:spacing w:line="220" w:lineRule="auto"/>
+              <w:jc w:val="center"/>
+            </w:pPr>
+            <w:r>
+              <w:rPr>
+                <w:sz w:val="18"/>
+              </w:rPr>
+              <w:t xml:space="preserve">replay, 36</w:t>
+            </w:r>
+          </w:p>
+        </w:tc>
+      </w:tr>
+      <w:tr>
+        <w:tc>
+          <w:tcPr>
+            <w:tcW w:w="3200" w:type="dxa"/>
+          </w:tcPr>
+          <w:p>
+            <w:pPr>
+              <w:keepNext/>
+              <w:spacing w:line="220" w:lineRule="auto"/>
+            </w:pPr>
+            <w:r>
+              <w:rPr>
+                <w:sz w:val="18"/>
+              </w:rPr>
+              <w:t xml:space="preserve">Doctrine and transfer</w:t>
+            </w:r>
+          </w:p>
+        </w:tc>
+        <w:tc>
+          <w:tcPr>
+            <w:tcW w:w="4200" w:type="dxa"/>
+          </w:tcPr>
+          <w:p>
+            <w:pPr>
+              <w:keepNext/>
+              <w:spacing w:line="220" w:lineRule="auto"/>
+              <w:jc w:val="center"/>
+            </w:pPr>
+            <w:r>
+              <w:rPr>
+                <w:sz w:val="18"/>
+              </w:rPr>
+              <w:t xml:space="preserve"/>
+            </w:r>
+          </w:p>
+        </w:tc>
+        <w:tc>
+          <w:tcPr>
+            <w:tcW w:w="1500" w:type="dxa"/>
+          </w:tcPr>
+          <w:p>
+            <w:pPr>
+              <w:keepNext/>
+              <w:spacing w:line="220" w:lineRule="auto"/>
+              <w:jc w:val="center"/>
+            </w:pPr>
+            <w:r>
+              <w:rPr>
+                <w:sz w:val="18"/>
+              </w:rPr>
+              <w:t xml:space="preserve"/>
+            </w:r>
+          </w:p>
+        </w:tc>
+      </w:tr>
+      <w:tr>
+        <w:tc>
+          <w:tcPr>
+            <w:tcW w:w="3200" w:type="dxa"/>
+          </w:tcPr>
+          <w:p>
+            <w:pPr>
+              <w:keepNext/>
+              <w:spacing w:line="220" w:lineRule="auto"/>
+            </w:pPr>
+            <w:r>
+              <w:rPr>
+                <w:sz w:val="18"/>
+              </w:rPr>
+              <w:t xml:space="preserve">40 rules; six hand-written tactics, as written or forecast-tuned</w:t>
+            </w:r>
+          </w:p>
+        </w:tc>
+        <w:tc>
+          <w:tcPr>
+            <w:tcW w:w="4200" w:type="dxa"/>
+          </w:tcPr>
+          <w:p>
+            <w:pPr>
+              <w:keepNext/>
+              <w:spacing w:line="220" w:lineRule="auto"/>
+              <w:jc w:val="center"/>
+            </w:pPr>
+            <w:r>
+              <w:rPr>
+                <w:sz w:val="18"/>
+              </w:rPr>
+              <w:t xml:space="preserve">full written doctrine; fixed library over the seven effects, band and amount tuned by six forecasts per tactic</w:t>
+            </w:r>
+          </w:p>
+        </w:tc>
+        <w:tc>
+          <w:tcPr>
+            <w:tcW w:w="1500" w:type="dxa"/>
+          </w:tcPr>
+          <w:p>
+            <w:pPr>
+              <w:keepNext/>
+              <w:spacing w:line="220" w:lineRule="auto"/>
+              <w:jc w:val="center"/>
+            </w:pPr>
+            <w:r>
+              <w:rPr>
+                <w:sz w:val="18"/>
+              </w:rPr>
+              <w:t xml:space="preserve">0; fail-safe, no-harm</w:t>
+            </w:r>
+          </w:p>
+        </w:tc>
+      </w:tr>
+      <w:tr>
+        <w:tc>
+          <w:tcPr>
+            <w:tcW w:w="3200" w:type="dxa"/>
+          </w:tcPr>
+          <w:p>
+            <w:pPr>
+              <w:keepNext/>
+              <w:spacing w:line="220" w:lineRule="auto"/>
+            </w:pPr>
+            <w:r>
+              <w:rPr>
+                <w:sz w:val="18"/>
+              </w:rPr>
+              <w:t xml:space="preserve">Recorded tactics; family withholding; S6–S8</w:t>
+            </w:r>
+          </w:p>
+        </w:tc>
+        <w:tc>
+          <w:tcPr>
+            <w:tcW w:w="4200" w:type="dxa"/>
+          </w:tcPr>
+          <w:p>
+            <w:pPr>
+              <w:keepNext/>
+              <w:spacing w:line="220" w:lineRule="auto"/>
+              <w:jc w:val="center"/>
+            </w:pPr>
+            <w:r>
+              <w:rPr>
+                <w:sz w:val="18"/>
+              </w:rPr>
+              <w:t xml:space="preserve">four transferred packages; a family removed; three new families</w:t>
+            </w:r>
+          </w:p>
+        </w:tc>
+        <w:tc>
+          <w:tcPr>
+            <w:tcW w:w="1500" w:type="dxa"/>
+          </w:tcPr>
+          <w:p>
+            <w:pPr>
+              <w:keepNext/>
+              <w:spacing w:line="220" w:lineRule="auto"/>
+              <w:jc w:val="center"/>
+            </w:pPr>
+            <w:r>
+              <w:rPr>
+                <w:sz w:val="18"/>
+              </w:rPr>
+              <w:t xml:space="preserve">0 or 36</w:t>
+            </w:r>
+          </w:p>
+        </w:tc>
+      </w:tr>
+      <w:tr>
+        <w:tc>
+          <w:tcPr>
+            <w:tcW w:w="3200" w:type="dxa"/>
+          </w:tcPr>
+          <w:p>
+            <w:pPr>
+              <w:keepNext/>
+              <w:spacing w:line="220" w:lineRule="auto"/>
+            </w:pPr>
+            <w:r>
+              <w:rPr>
+                <w:sz w:val="18"/>
+              </w:rPr>
+              <w:t xml:space="preserve">Object and effect removal</w:t>
+            </w:r>
+          </w:p>
+        </w:tc>
+        <w:tc>
+          <w:tcPr>
+            <w:tcW w:w="4200" w:type="dxa"/>
+          </w:tcPr>
+          <w:p>
+            <w:pPr>
+              <w:keepNext/>
+              <w:spacing w:line="220" w:lineRule="auto"/>
+              <w:jc w:val="center"/>
+            </w:pPr>
+            <w:r>
+              <w:rPr>
+                <w:sz w:val="18"/>
+              </w:rPr>
+              <w:t xml:space="preserve">replay without one object or one effect</w:t>
+            </w:r>
+          </w:p>
+        </w:tc>
+        <w:tc>
+          <w:tcPr>
+            <w:tcW w:w="1500" w:type="dxa"/>
+          </w:tcPr>
+          <w:p>
+            <w:pPr>
+              <w:keepNext/>
+              <w:spacing w:line="220" w:lineRule="auto"/>
+              <w:jc w:val="center"/>
+            </w:pPr>
+            <w:r>
+              <w:rPr>
+                <w:sz w:val="18"/>
+              </w:rPr>
+              <w:t xml:space="preserve">replay</w:t>
             </w:r>
           </w:p>
         </w:tc>

</xml_diff>

<commit_message>
K33 evolutionary search over the six families and K30b (tie keeps the written tactic) in the article; Holm family 57
Co-Authored-By: Claude Fable 5.1 <noreply@anthropic.com>
Claude-Session: https://claude.ai/code/session_01SpJY1eTMuWxnLRbAr2HJ4M
</commit_message>
<xml_diff>
--- a/02_Article/ieee_systems/DisasterAware_Supplementary_Material.docx
+++ b/02_Article/ieee_systems/DisasterAware_Supplementary_Material.docx
@@ -6467,7 +6467,7 @@
     </w:p>
     <w:p>
       <w:r>
-        <w:t xml:space="preserve">Table S7 lists the model-error and operating-limit comparisons of Section V-C of the article; every row pairs the configuration with its own Closed reference on the same worlds, and the p values are Holm-adjusted over the family of 56 defined in Section V-A.</w:t>
+        <w:t xml:space="preserve">Table S7 lists the model-error and operating-limit comparisons of Section V-C of the article; every row pairs the configuration with its own Closed reference on the same worlds, and the p values are Holm-adjusted over the family of 57 defined in Section V-A.</w:t>
       </w:r>
     </w:p>
     <w:p>
@@ -6475,7 +6475,7 @@
         <w:pStyle w:val="Caption"/>
       </w:pPr>
       <w:r>
-        <w:t xml:space="preserve">Table S7. Model-error and operating-limit comparisons (unadjusted 95% half-widths; p Holm-adjusted over the family of 56)</w:t>
+        <w:t xml:space="preserve">Table S7. Model-error and operating-limit comparisons (unadjusted 95% half-widths; p Holm-adjusted over the family of 57)</w:t>
       </w:r>
     </w:p>
     <w:tbl>
@@ -8705,6 +8705,61 @@
                 <w:sz w:val="18"/>
               </w:rPr>
               <w:t xml:space="preserve">population 12 × 3; also 6 × 5 and 18 × 1</w:t>
+            </w:r>
+          </w:p>
+        </w:tc>
+        <w:tc>
+          <w:tcPr>
+            <w:tcW w:w="1500" w:type="dxa"/>
+          </w:tcPr>
+          <w:p>
+            <w:pPr>
+              <w:keepNext/>
+              <w:spacing w:line="220" w:lineRule="auto"/>
+              <w:jc w:val="center"/>
+            </w:pPr>
+            <w:r>
+              <w:rPr>
+                <w:sz w:val="18"/>
+              </w:rPr>
+              <w:t xml:space="preserve">36</w:t>
+            </w:r>
+          </w:p>
+        </w:tc>
+      </w:tr>
+      <w:tr>
+        <w:tc>
+          <w:tcPr>
+            <w:tcW w:w="3200" w:type="dxa"/>
+          </w:tcPr>
+          <w:p>
+            <w:pPr>
+              <w:keepNext/>
+              <w:spacing w:line="220" w:lineRule="auto"/>
+            </w:pPr>
+            <w:r>
+              <w:rPr>
+                <w:sz w:val="18"/>
+              </w:rPr>
+              <w:t xml:space="preserve">Evolutionary search, families only</w:t>
+            </w:r>
+          </w:p>
+        </w:tc>
+        <w:tc>
+          <w:tcPr>
+            <w:tcW w:w="4200" w:type="dxa"/>
+          </w:tcPr>
+          <w:p>
+            <w:pPr>
+              <w:keepNext/>
+              <w:spacing w:line="220" w:lineRule="auto"/>
+              <w:jc w:val="center"/>
+            </w:pPr>
+            <w:r>
+              <w:rPr>
+                <w:sz w:val="18"/>
+              </w:rPr>
+              <w:t xml:space="preserve">rules and macros over the six families, same search</w:t>
             </w:r>
           </w:p>
         </w:tc>

</xml_diff>